<commit_message>
Rapikan tata letak himpunan konsep surat cessie
Hapus label konsep, nomor butir berlanjut setelah kutipan pasal, penutup
tidak terpisah dari tanda tangan, tanpa halaman kosong, Hal rata kiri,
serta sertakan versi PDF.

Co-Authored-By: Claude Opus 5.5 <noreply@anthropic.com>
Claude-Session: https://claude.ai/code/session_01AFC3nUeexLNNCgqYQcbfK5
</commit_message>
<xml_diff>
--- a/telaah-pt-rata-makmur/Himpunan_Konsep_Surat_Cessie_PT_Rata_Makmur.docx
+++ b/telaah-pt-rata-makmur/Himpunan_Konsep_Surat_Cessie_PT_Rata_Makmur.docx
@@ -211,6 +211,8 @@
     </w:p>
     <w:p>
       <w:pPr>
+        <w:keepNext w:val="false"/>
+        <w:keepLines/>
         <w:spacing w:after="120" w:line="276"/>
         <w:ind w:firstLine="709"/>
         <w:jc w:val="both"/>
@@ -242,9 +244,9 @@
         </w:tblBorders>
       </w:tblPr>
       <w:tblGrid>
-        <w:gridCol w:w="700"/>
-        <w:gridCol w:w="2700"/>
-        <w:gridCol w:w="4581"/>
+        <w:gridCol w:w="850"/>
+        <w:gridCol w:w="2650"/>
+        <w:gridCol w:w="4481"/>
         <w:gridCol w:w="1100"/>
       </w:tblGrid>
       <w:tr>
@@ -253,7 +255,7 @@
         </w:trPr>
         <w:tc>
           <w:tcPr>
-            <w:tcW w:type="dxa" w:w="700"/>
+            <w:tcW w:type="dxa" w:w="850"/>
             <w:tcBorders>
               <w:top w:val="single" w:color="000000" w:sz="4"/>
               <w:left w:val="single" w:color="000000" w:sz="4"/>
@@ -286,7 +288,7 @@
         </w:tc>
         <w:tc>
           <w:tcPr>
-            <w:tcW w:type="dxa" w:w="2700"/>
+            <w:tcW w:type="dxa" w:w="2650"/>
             <w:tcBorders>
               <w:top w:val="single" w:color="000000" w:sz="4"/>
               <w:left w:val="single" w:color="000000" w:sz="4"/>
@@ -319,7 +321,7 @@
         </w:tc>
         <w:tc>
           <w:tcPr>
-            <w:tcW w:type="dxa" w:w="4581"/>
+            <w:tcW w:type="dxa" w:w="4481"/>
             <w:tcBorders>
               <w:top w:val="single" w:color="000000" w:sz="4"/>
               <w:left w:val="single" w:color="000000" w:sz="4"/>
@@ -390,7 +392,7 @@
         </w:trPr>
         <w:tc>
           <w:tcPr>
-            <w:tcW w:type="dxa" w:w="700"/>
+            <w:tcW w:type="dxa" w:w="850"/>
             <w:tcBorders>
               <w:top w:val="single" w:color="000000" w:sz="4"/>
               <w:left w:val="single" w:color="000000" w:sz="4"/>
@@ -422,7 +424,7 @@
         </w:tc>
         <w:tc>
           <w:tcPr>
-            <w:tcW w:type="dxa" w:w="2700"/>
+            <w:tcW w:type="dxa" w:w="2650"/>
             <w:tcBorders>
               <w:top w:val="single" w:color="000000" w:sz="4"/>
               <w:left w:val="single" w:color="000000" w:sz="4"/>
@@ -454,7 +456,7 @@
         </w:tc>
         <w:tc>
           <w:tcPr>
-            <w:tcW w:type="dxa" w:w="4581"/>
+            <w:tcW w:type="dxa" w:w="4481"/>
             <w:tcBorders>
               <w:top w:val="single" w:color="000000" w:sz="4"/>
               <w:left w:val="single" w:color="000000" w:sz="4"/>
@@ -523,7 +525,7 @@
         </w:trPr>
         <w:tc>
           <w:tcPr>
-            <w:tcW w:type="dxa" w:w="700"/>
+            <w:tcW w:type="dxa" w:w="850"/>
             <w:tcBorders>
               <w:top w:val="single" w:color="000000" w:sz="4"/>
               <w:left w:val="single" w:color="000000" w:sz="4"/>
@@ -555,7 +557,7 @@
         </w:tc>
         <w:tc>
           <w:tcPr>
-            <w:tcW w:type="dxa" w:w="2700"/>
+            <w:tcW w:type="dxa" w:w="2650"/>
             <w:tcBorders>
               <w:top w:val="single" w:color="000000" w:sz="4"/>
               <w:left w:val="single" w:color="000000" w:sz="4"/>
@@ -587,7 +589,7 @@
         </w:tc>
         <w:tc>
           <w:tcPr>
-            <w:tcW w:type="dxa" w:w="4581"/>
+            <w:tcW w:type="dxa" w:w="4481"/>
             <w:tcBorders>
               <w:top w:val="single" w:color="000000" w:sz="4"/>
               <w:left w:val="single" w:color="000000" w:sz="4"/>
@@ -656,7 +658,7 @@
         </w:trPr>
         <w:tc>
           <w:tcPr>
-            <w:tcW w:type="dxa" w:w="700"/>
+            <w:tcW w:type="dxa" w:w="850"/>
             <w:tcBorders>
               <w:top w:val="single" w:color="000000" w:sz="4"/>
               <w:left w:val="single" w:color="000000" w:sz="4"/>
@@ -688,7 +690,7 @@
         </w:tc>
         <w:tc>
           <w:tcPr>
-            <w:tcW w:type="dxa" w:w="2700"/>
+            <w:tcW w:type="dxa" w:w="2650"/>
             <w:tcBorders>
               <w:top w:val="single" w:color="000000" w:sz="4"/>
               <w:left w:val="single" w:color="000000" w:sz="4"/>
@@ -720,7 +722,7 @@
         </w:tc>
         <w:tc>
           <w:tcPr>
-            <w:tcW w:type="dxa" w:w="4581"/>
+            <w:tcW w:type="dxa" w:w="4481"/>
             <w:tcBorders>
               <w:top w:val="single" w:color="000000" w:sz="4"/>
               <w:left w:val="single" w:color="000000" w:sz="4"/>
@@ -789,7 +791,7 @@
         </w:trPr>
         <w:tc>
           <w:tcPr>
-            <w:tcW w:type="dxa" w:w="700"/>
+            <w:tcW w:type="dxa" w:w="850"/>
             <w:tcBorders>
               <w:top w:val="single" w:color="000000" w:sz="4"/>
               <w:left w:val="single" w:color="000000" w:sz="4"/>
@@ -821,7 +823,7 @@
         </w:tc>
         <w:tc>
           <w:tcPr>
-            <w:tcW w:type="dxa" w:w="2700"/>
+            <w:tcW w:type="dxa" w:w="2650"/>
             <w:tcBorders>
               <w:top w:val="single" w:color="000000" w:sz="4"/>
               <w:left w:val="single" w:color="000000" w:sz="4"/>
@@ -853,7 +855,7 @@
         </w:tc>
         <w:tc>
           <w:tcPr>
-            <w:tcW w:type="dxa" w:w="4581"/>
+            <w:tcW w:type="dxa" w:w="4481"/>
             <w:tcBorders>
               <w:top w:val="single" w:color="000000" w:sz="4"/>
               <w:left w:val="single" w:color="000000" w:sz="4"/>
@@ -922,7 +924,7 @@
         </w:trPr>
         <w:tc>
           <w:tcPr>
-            <w:tcW w:type="dxa" w:w="700"/>
+            <w:tcW w:type="dxa" w:w="850"/>
             <w:tcBorders>
               <w:top w:val="single" w:color="000000" w:sz="4"/>
               <w:left w:val="single" w:color="000000" w:sz="4"/>
@@ -954,7 +956,7 @@
         </w:tc>
         <w:tc>
           <w:tcPr>
-            <w:tcW w:type="dxa" w:w="2700"/>
+            <w:tcW w:type="dxa" w:w="2650"/>
             <w:tcBorders>
               <w:top w:val="single" w:color="000000" w:sz="4"/>
               <w:left w:val="single" w:color="000000" w:sz="4"/>
@@ -986,7 +988,7 @@
         </w:tc>
         <w:tc>
           <w:tcPr>
-            <w:tcW w:type="dxa" w:w="4581"/>
+            <w:tcW w:type="dxa" w:w="4481"/>
             <w:tcBorders>
               <w:top w:val="single" w:color="000000" w:sz="4"/>
               <w:left w:val="single" w:color="000000" w:sz="4"/>
@@ -1055,7 +1057,7 @@
         </w:trPr>
         <w:tc>
           <w:tcPr>
-            <w:tcW w:type="dxa" w:w="700"/>
+            <w:tcW w:type="dxa" w:w="850"/>
             <w:tcBorders>
               <w:top w:val="single" w:color="000000" w:sz="4"/>
               <w:left w:val="single" w:color="000000" w:sz="4"/>
@@ -1087,7 +1089,7 @@
         </w:tc>
         <w:tc>
           <w:tcPr>
-            <w:tcW w:type="dxa" w:w="2700"/>
+            <w:tcW w:type="dxa" w:w="2650"/>
             <w:tcBorders>
               <w:top w:val="single" w:color="000000" w:sz="4"/>
               <w:left w:val="single" w:color="000000" w:sz="4"/>
@@ -1119,7 +1121,7 @@
         </w:tc>
         <w:tc>
           <w:tcPr>
-            <w:tcW w:type="dxa" w:w="4581"/>
+            <w:tcW w:type="dxa" w:w="4481"/>
             <w:tcBorders>
               <w:top w:val="single" w:color="000000" w:sz="4"/>
               <w:left w:val="single" w:color="000000" w:sz="4"/>
@@ -1188,7 +1190,7 @@
         </w:trPr>
         <w:tc>
           <w:tcPr>
-            <w:tcW w:type="dxa" w:w="700"/>
+            <w:tcW w:type="dxa" w:w="850"/>
             <w:tcBorders>
               <w:top w:val="single" w:color="000000" w:sz="4"/>
               <w:left w:val="single" w:color="000000" w:sz="4"/>
@@ -1220,7 +1222,7 @@
         </w:tc>
         <w:tc>
           <w:tcPr>
-            <w:tcW w:type="dxa" w:w="2700"/>
+            <w:tcW w:type="dxa" w:w="2650"/>
             <w:tcBorders>
               <w:top w:val="single" w:color="000000" w:sz="4"/>
               <w:left w:val="single" w:color="000000" w:sz="4"/>
@@ -1252,7 +1254,7 @@
         </w:tc>
         <w:tc>
           <w:tcPr>
-            <w:tcW w:type="dxa" w:w="4581"/>
+            <w:tcW w:type="dxa" w:w="4481"/>
             <w:tcBorders>
               <w:top w:val="single" w:color="000000" w:sz="4"/>
               <w:left w:val="single" w:color="000000" w:sz="4"/>
@@ -1321,7 +1323,7 @@
         </w:trPr>
         <w:tc>
           <w:tcPr>
-            <w:tcW w:type="dxa" w:w="700"/>
+            <w:tcW w:type="dxa" w:w="850"/>
             <w:tcBorders>
               <w:top w:val="single" w:color="000000" w:sz="4"/>
               <w:left w:val="single" w:color="000000" w:sz="4"/>
@@ -1353,7 +1355,7 @@
         </w:tc>
         <w:tc>
           <w:tcPr>
-            <w:tcW w:type="dxa" w:w="2700"/>
+            <w:tcW w:type="dxa" w:w="2650"/>
             <w:tcBorders>
               <w:top w:val="single" w:color="000000" w:sz="4"/>
               <w:left w:val="single" w:color="000000" w:sz="4"/>
@@ -1385,7 +1387,7 @@
         </w:tc>
         <w:tc>
           <w:tcPr>
-            <w:tcW w:type="dxa" w:w="4581"/>
+            <w:tcW w:type="dxa" w:w="4481"/>
             <w:tcBorders>
               <w:top w:val="single" w:color="000000" w:sz="4"/>
               <w:left w:val="single" w:color="000000" w:sz="4"/>
@@ -1454,7 +1456,7 @@
         </w:trPr>
         <w:tc>
           <w:tcPr>
-            <w:tcW w:type="dxa" w:w="700"/>
+            <w:tcW w:type="dxa" w:w="850"/>
             <w:tcBorders>
               <w:top w:val="single" w:color="000000" w:sz="4"/>
               <w:left w:val="single" w:color="000000" w:sz="4"/>
@@ -1486,7 +1488,7 @@
         </w:tc>
         <w:tc>
           <w:tcPr>
-            <w:tcW w:type="dxa" w:w="2700"/>
+            <w:tcW w:type="dxa" w:w="2650"/>
             <w:tcBorders>
               <w:top w:val="single" w:color="000000" w:sz="4"/>
               <w:left w:val="single" w:color="000000" w:sz="4"/>
@@ -1518,7 +1520,7 @@
         </w:tc>
         <w:tc>
           <w:tcPr>
-            <w:tcW w:type="dxa" w:w="4581"/>
+            <w:tcW w:type="dxa" w:w="4481"/>
             <w:tcBorders>
               <w:top w:val="single" w:color="000000" w:sz="4"/>
               <w:left w:val="single" w:color="000000" w:sz="4"/>
@@ -1587,7 +1589,7 @@
         </w:trPr>
         <w:tc>
           <w:tcPr>
-            <w:tcW w:type="dxa" w:w="700"/>
+            <w:tcW w:type="dxa" w:w="850"/>
             <w:tcBorders>
               <w:top w:val="single" w:color="000000" w:sz="4"/>
               <w:left w:val="single" w:color="000000" w:sz="4"/>
@@ -1619,7 +1621,7 @@
         </w:tc>
         <w:tc>
           <w:tcPr>
-            <w:tcW w:type="dxa" w:w="2700"/>
+            <w:tcW w:type="dxa" w:w="2650"/>
             <w:tcBorders>
               <w:top w:val="single" w:color="000000" w:sz="4"/>
               <w:left w:val="single" w:color="000000" w:sz="4"/>
@@ -1651,7 +1653,7 @@
         </w:tc>
         <w:tc>
           <w:tcPr>
-            <w:tcW w:type="dxa" w:w="4581"/>
+            <w:tcW w:type="dxa" w:w="4481"/>
             <w:tcBorders>
               <w:top w:val="single" w:color="000000" w:sz="4"/>
               <w:left w:val="single" w:color="000000" w:sz="4"/>
@@ -1720,7 +1722,7 @@
         </w:trPr>
         <w:tc>
           <w:tcPr>
-            <w:tcW w:type="dxa" w:w="700"/>
+            <w:tcW w:type="dxa" w:w="850"/>
             <w:tcBorders>
               <w:top w:val="single" w:color="000000" w:sz="4"/>
               <w:left w:val="single" w:color="000000" w:sz="4"/>
@@ -1752,7 +1754,7 @@
         </w:tc>
         <w:tc>
           <w:tcPr>
-            <w:tcW w:type="dxa" w:w="2700"/>
+            <w:tcW w:type="dxa" w:w="2650"/>
             <w:tcBorders>
               <w:top w:val="single" w:color="000000" w:sz="4"/>
               <w:left w:val="single" w:color="000000" w:sz="4"/>
@@ -1784,7 +1786,7 @@
         </w:tc>
         <w:tc>
           <w:tcPr>
-            <w:tcW w:type="dxa" w:w="4581"/>
+            <w:tcW w:type="dxa" w:w="4481"/>
             <w:tcBorders>
               <w:top w:val="single" w:color="000000" w:sz="4"/>
               <w:left w:val="single" w:color="000000" w:sz="4"/>
@@ -1853,7 +1855,7 @@
         </w:trPr>
         <w:tc>
           <w:tcPr>
-            <w:tcW w:type="dxa" w:w="700"/>
+            <w:tcW w:type="dxa" w:w="850"/>
             <w:tcBorders>
               <w:top w:val="single" w:color="000000" w:sz="4"/>
               <w:left w:val="single" w:color="000000" w:sz="4"/>
@@ -1885,7 +1887,7 @@
         </w:tc>
         <w:tc>
           <w:tcPr>
-            <w:tcW w:type="dxa" w:w="2700"/>
+            <w:tcW w:type="dxa" w:w="2650"/>
             <w:tcBorders>
               <w:top w:val="single" w:color="000000" w:sz="4"/>
               <w:left w:val="single" w:color="000000" w:sz="4"/>
@@ -1917,7 +1919,7 @@
         </w:tc>
         <w:tc>
           <w:tcPr>
-            <w:tcW w:type="dxa" w:w="4581"/>
+            <w:tcW w:type="dxa" w:w="4481"/>
             <w:tcBorders>
               <w:top w:val="single" w:color="000000" w:sz="4"/>
               <w:left w:val="single" w:color="000000" w:sz="4"/>
@@ -1986,7 +1988,7 @@
         </w:trPr>
         <w:tc>
           <w:tcPr>
-            <w:tcW w:type="dxa" w:w="700"/>
+            <w:tcW w:type="dxa" w:w="850"/>
             <w:tcBorders>
               <w:top w:val="single" w:color="000000" w:sz="4"/>
               <w:left w:val="single" w:color="000000" w:sz="4"/>
@@ -2018,7 +2020,7 @@
         </w:tc>
         <w:tc>
           <w:tcPr>
-            <w:tcW w:type="dxa" w:w="2700"/>
+            <w:tcW w:type="dxa" w:w="2650"/>
             <w:tcBorders>
               <w:top w:val="single" w:color="000000" w:sz="4"/>
               <w:left w:val="single" w:color="000000" w:sz="4"/>
@@ -2050,7 +2052,7 @@
         </w:tc>
         <w:tc>
           <w:tcPr>
-            <w:tcW w:type="dxa" w:w="4581"/>
+            <w:tcW w:type="dxa" w:w="4481"/>
             <w:tcBorders>
               <w:top w:val="single" w:color="000000" w:sz="4"/>
               <w:left w:val="single" w:color="000000" w:sz="4"/>
@@ -2119,7 +2121,7 @@
         </w:trPr>
         <w:tc>
           <w:tcPr>
-            <w:tcW w:type="dxa" w:w="700"/>
+            <w:tcW w:type="dxa" w:w="850"/>
             <w:tcBorders>
               <w:top w:val="single" w:color="000000" w:sz="4"/>
               <w:left w:val="single" w:color="000000" w:sz="4"/>
@@ -2151,7 +2153,7 @@
         </w:tc>
         <w:tc>
           <w:tcPr>
-            <w:tcW w:type="dxa" w:w="2700"/>
+            <w:tcW w:type="dxa" w:w="2650"/>
             <w:tcBorders>
               <w:top w:val="single" w:color="000000" w:sz="4"/>
               <w:left w:val="single" w:color="000000" w:sz="4"/>
@@ -2183,7 +2185,7 @@
         </w:tc>
         <w:tc>
           <w:tcPr>
-            <w:tcW w:type="dxa" w:w="4581"/>
+            <w:tcW w:type="dxa" w:w="4481"/>
             <w:tcBorders>
               <w:top w:val="single" w:color="000000" w:sz="4"/>
               <w:left w:val="single" w:color="000000" w:sz="4"/>
@@ -2248,27 +2250,8 @@
       </w:tr>
     </w:tbl>
     <w:p>
-      <w:r>
-        <w:br w:type="page"/>
-      </w:r>
-    </w:p>
-    <w:p>
-      <w:pPr>
-        <w:spacing w:after="60"/>
-        <w:jc w:val="right"/>
-      </w:pPr>
-      <w:r>
-        <w:rPr>
-          <w:rFonts w:ascii="Arial" w:cs="Arial" w:eastAsia="Arial" w:hAnsi="Arial"/>
-          <w:color w:val="808080"/>
-          <w:sz w:val="16"/>
-          <w:szCs w:val="16"/>
-        </w:rPr>
-        <w:t xml:space="preserve">Konsep Surat 1</w:t>
-      </w:r>
-    </w:p>
-    <w:p>
-      <w:pPr>
+      <w:pPr>
+        <w:pageBreakBefore/>
         <w:ind w:left="1418"/>
         <w:jc w:val="center"/>
       </w:pPr>
@@ -2437,7 +2420,7 @@
           <w:p>
             <w:pPr>
               <w:spacing w:after="40"/>
-              <w:jc w:val="both"/>
+              <w:jc w:val="left"/>
             </w:pPr>
             <w:r>
               <w:rPr>
@@ -2462,7 +2445,7 @@
           <w:p>
             <w:pPr>
               <w:spacing w:after="40"/>
-              <w:jc w:val="both"/>
+              <w:jc w:val="left"/>
             </w:pPr>
             <w:r>
               <w:rPr>
@@ -2487,7 +2470,7 @@
           <w:p>
             <w:pPr>
               <w:spacing w:after="40"/>
-              <w:jc w:val="both"/>
+              <w:jc w:val="left"/>
             </w:pPr>
             <w:r>
               <w:rPr>
@@ -2539,7 +2522,7 @@
           <w:p>
             <w:pPr>
               <w:spacing w:after="40"/>
-              <w:jc w:val="both"/>
+              <w:jc w:val="left"/>
             </w:pPr>
             <w:r>
               <w:rPr>
@@ -2564,7 +2547,7 @@
           <w:p>
             <w:pPr>
               <w:spacing w:after="40"/>
-              <w:jc w:val="both"/>
+              <w:jc w:val="left"/>
             </w:pPr>
             <w:r>
               <w:rPr>
@@ -2589,7 +2572,7 @@
           <w:p>
             <w:pPr>
               <w:spacing w:after="40"/>
-              <w:jc w:val="both"/>
+              <w:jc w:val="left"/>
             </w:pPr>
             <w:r>
               <w:rPr>
@@ -2633,7 +2616,7 @@
           <w:p>
             <w:pPr>
               <w:spacing w:after="40"/>
-              <w:jc w:val="both"/>
+              <w:jc w:val="left"/>
             </w:pPr>
             <w:r>
               <w:rPr>
@@ -2658,7 +2641,7 @@
           <w:p>
             <w:pPr>
               <w:spacing w:after="40"/>
-              <w:jc w:val="both"/>
+              <w:jc w:val="left"/>
             </w:pPr>
             <w:r>
               <w:rPr>
@@ -2683,7 +2666,7 @@
           <w:p>
             <w:pPr>
               <w:spacing w:after="40"/>
-              <w:jc w:val="both"/>
+              <w:jc w:val="left"/>
             </w:pPr>
             <w:r>
               <w:rPr>
@@ -2727,7 +2710,7 @@
           <w:p>
             <w:pPr>
               <w:spacing w:after="40"/>
-              <w:jc w:val="both"/>
+              <w:jc w:val="left"/>
             </w:pPr>
             <w:r>
               <w:rPr>
@@ -2752,7 +2735,7 @@
           <w:p>
             <w:pPr>
               <w:spacing w:after="40"/>
-              <w:jc w:val="both"/>
+              <w:jc w:val="left"/>
             </w:pPr>
             <w:r>
               <w:rPr>
@@ -2777,7 +2760,7 @@
           <w:p>
             <w:pPr>
               <w:spacing w:after="40"/>
-              <w:jc w:val="both"/>
+              <w:jc w:val="left"/>
             </w:pPr>
             <w:r>
               <w:rPr>
@@ -2876,6 +2859,8 @@
     </w:p>
     <w:p>
       <w:pPr>
+        <w:keepNext w:val="false"/>
+        <w:keepLines/>
         <w:spacing w:after="120" w:line="276"/>
         <w:ind w:firstLine="709"/>
         <w:jc w:val="both"/>
@@ -2892,6 +2877,8 @@
     <w:p>
       <w:pPr>
         <w:pStyle w:val="ListParagraph"/>
+        <w:keepNext w:val="false"/>
+        <w:keepLines/>
         <w:numPr>
           <w:ilvl w:val="0"/>
           <w:numId w:val="2"/>
@@ -2911,6 +2898,8 @@
     <w:p>
       <w:pPr>
         <w:pStyle w:val="ListParagraph"/>
+        <w:keepNext w:val="false"/>
+        <w:keepLines/>
         <w:numPr>
           <w:ilvl w:val="0"/>
           <w:numId w:val="2"/>
@@ -2930,6 +2919,8 @@
     <w:p>
       <w:pPr>
         <w:pStyle w:val="ListParagraph"/>
+        <w:keepNext w:val="false"/>
+        <w:keepLines/>
         <w:numPr>
           <w:ilvl w:val="0"/>
           <w:numId w:val="2"/>
@@ -2949,6 +2940,8 @@
     <w:p>
       <w:pPr>
         <w:pStyle w:val="ListParagraph"/>
+        <w:keepNext w:val="false"/>
+        <w:keepLines/>
         <w:numPr>
           <w:ilvl w:val="0"/>
           <w:numId w:val="2"/>
@@ -2968,6 +2961,8 @@
     <w:p>
       <w:pPr>
         <w:pStyle w:val="ListParagraph"/>
+        <w:keepNext w:val="false"/>
+        <w:keepLines/>
         <w:numPr>
           <w:ilvl w:val="0"/>
           <w:numId w:val="2"/>
@@ -2987,6 +2982,8 @@
     <w:p>
       <w:pPr>
         <w:pStyle w:val="ListParagraph"/>
+        <w:keepNext w:val="false"/>
+        <w:keepLines/>
         <w:numPr>
           <w:ilvl w:val="0"/>
           <w:numId w:val="2"/>
@@ -3006,6 +3003,8 @@
     <w:p>
       <w:pPr>
         <w:pStyle w:val="ListParagraph"/>
+        <w:keepNext w:val="false"/>
+        <w:keepLines/>
         <w:numPr>
           <w:ilvl w:val="0"/>
           <w:numId w:val="2"/>
@@ -3024,8 +3023,11 @@
     </w:p>
     <w:p>
       <w:pPr>
-        <w:spacing w:after="120" w:before="0" w:line="276"/>
-        <w:jc w:val="left"/>
+        <w:keepNext w:val="false"/>
+        <w:keepLines/>
+        <w:spacing w:after="120" w:line="276"/>
+        <w:ind w:firstLine="709"/>
+        <w:jc w:val="both"/>
       </w:pPr>
       <w:r>
         <w:rPr>
@@ -3039,6 +3041,8 @@
     <w:p>
       <w:pPr>
         <w:pStyle w:val="ListParagraph"/>
+        <w:keepNext w:val="false"/>
+        <w:keepLines/>
         <w:numPr>
           <w:ilvl w:val="0"/>
           <w:numId w:val="3"/>
@@ -3058,6 +3062,8 @@
     <w:p>
       <w:pPr>
         <w:pStyle w:val="ListParagraph"/>
+        <w:keepNext w:val="false"/>
+        <w:keepLines/>
         <w:numPr>
           <w:ilvl w:val="0"/>
           <w:numId w:val="3"/>
@@ -3077,6 +3083,8 @@
     <w:p>
       <w:pPr>
         <w:pStyle w:val="ListParagraph"/>
+        <w:keepNext w:val="false"/>
+        <w:keepLines/>
         <w:numPr>
           <w:ilvl w:val="0"/>
           <w:numId w:val="3"/>
@@ -3095,6 +3103,8 @@
     </w:p>
     <w:p>
       <w:pPr>
+        <w:keepNext/>
+        <w:keepLines/>
         <w:spacing w:after="200" w:line="276"/>
         <w:ind w:firstLine="709"/>
         <w:jc w:val="both"/>
@@ -3125,6 +3135,9 @@
         <w:gridCol w:w="3061"/>
       </w:tblGrid>
       <w:tr>
+        <w:trPr>
+          <w:cantSplit/>
+        </w:trPr>
         <w:tc>
           <w:tcPr>
             <w:tcW w:type="dxa" w:w="5896"/>
@@ -3273,27 +3286,8 @@
       </w:r>
     </w:p>
     <w:p>
-      <w:r>
-        <w:br w:type="page"/>
-      </w:r>
-    </w:p>
-    <w:p>
-      <w:pPr>
-        <w:spacing w:after="60"/>
-        <w:jc w:val="right"/>
-      </w:pPr>
-      <w:r>
-        <w:rPr>
-          <w:rFonts w:ascii="Arial" w:cs="Arial" w:eastAsia="Arial" w:hAnsi="Arial"/>
-          <w:color w:val="808080"/>
-          <w:sz w:val="16"/>
-          <w:szCs w:val="16"/>
-        </w:rPr>
-        <w:t xml:space="preserve">Konsep Surat 2</w:t>
-      </w:r>
-    </w:p>
-    <w:p>
-      <w:pPr>
+      <w:pPr>
+        <w:pageBreakBefore/>
         <w:ind w:left="1418"/>
         <w:jc w:val="center"/>
       </w:pPr>
@@ -3462,7 +3456,7 @@
           <w:p>
             <w:pPr>
               <w:spacing w:after="40"/>
-              <w:jc w:val="both"/>
+              <w:jc w:val="left"/>
             </w:pPr>
             <w:r>
               <w:rPr>
@@ -3487,7 +3481,7 @@
           <w:p>
             <w:pPr>
               <w:spacing w:after="40"/>
-              <w:jc w:val="both"/>
+              <w:jc w:val="left"/>
             </w:pPr>
             <w:r>
               <w:rPr>
@@ -3512,7 +3506,7 @@
           <w:p>
             <w:pPr>
               <w:spacing w:after="40"/>
-              <w:jc w:val="both"/>
+              <w:jc w:val="left"/>
             </w:pPr>
             <w:r>
               <w:rPr>
@@ -3564,7 +3558,7 @@
           <w:p>
             <w:pPr>
               <w:spacing w:after="40"/>
-              <w:jc w:val="both"/>
+              <w:jc w:val="left"/>
             </w:pPr>
             <w:r>
               <w:rPr>
@@ -3589,7 +3583,7 @@
           <w:p>
             <w:pPr>
               <w:spacing w:after="40"/>
-              <w:jc w:val="both"/>
+              <w:jc w:val="left"/>
             </w:pPr>
             <w:r>
               <w:rPr>
@@ -3614,7 +3608,7 @@
           <w:p>
             <w:pPr>
               <w:spacing w:after="40"/>
-              <w:jc w:val="both"/>
+              <w:jc w:val="left"/>
             </w:pPr>
             <w:r>
               <w:rPr>
@@ -3658,7 +3652,7 @@
           <w:p>
             <w:pPr>
               <w:spacing w:after="40"/>
-              <w:jc w:val="both"/>
+              <w:jc w:val="left"/>
             </w:pPr>
             <w:r>
               <w:rPr>
@@ -3683,7 +3677,7 @@
           <w:p>
             <w:pPr>
               <w:spacing w:after="40"/>
-              <w:jc w:val="both"/>
+              <w:jc w:val="left"/>
             </w:pPr>
             <w:r>
               <w:rPr>
@@ -3708,7 +3702,7 @@
           <w:p>
             <w:pPr>
               <w:spacing w:after="40"/>
-              <w:jc w:val="both"/>
+              <w:jc w:val="left"/>
             </w:pPr>
             <w:r>
               <w:rPr>
@@ -3752,7 +3746,7 @@
           <w:p>
             <w:pPr>
               <w:spacing w:after="40"/>
-              <w:jc w:val="both"/>
+              <w:jc w:val="left"/>
             </w:pPr>
             <w:r>
               <w:rPr>
@@ -3777,7 +3771,7 @@
           <w:p>
             <w:pPr>
               <w:spacing w:after="40"/>
-              <w:jc w:val="both"/>
+              <w:jc w:val="left"/>
             </w:pPr>
             <w:r>
               <w:rPr>
@@ -3802,7 +3796,7 @@
           <w:p>
             <w:pPr>
               <w:spacing w:after="40"/>
-              <w:jc w:val="both"/>
+              <w:jc w:val="left"/>
             </w:pPr>
             <w:r>
               <w:rPr>
@@ -3901,6 +3895,8 @@
     </w:p>
     <w:p>
       <w:pPr>
+        <w:keepNext w:val="false"/>
+        <w:keepLines/>
         <w:spacing w:after="120" w:line="276"/>
         <w:ind w:firstLine="709"/>
         <w:jc w:val="both"/>
@@ -3917,6 +3913,8 @@
     <w:p>
       <w:pPr>
         <w:pStyle w:val="ListParagraph"/>
+        <w:keepNext w:val="false"/>
+        <w:keepLines/>
         <w:numPr>
           <w:ilvl w:val="0"/>
           <w:numId w:val="5"/>
@@ -3936,6 +3934,8 @@
     <w:p>
       <w:pPr>
         <w:pStyle w:val="ListParagraph"/>
+        <w:keepNext w:val="false"/>
+        <w:keepLines/>
         <w:numPr>
           <w:ilvl w:val="0"/>
           <w:numId w:val="5"/>
@@ -3972,6 +3972,88 @@
     <w:p>
       <w:pPr>
         <w:pStyle w:val="ListParagraph"/>
+        <w:keepNext w:val="false"/>
+        <w:keepLines/>
+        <w:numPr>
+          <w:ilvl w:val="0"/>
+          <w:numId w:val="5"/>
+        </w:numPr>
+        <w:spacing w:after="120" w:line="276"/>
+        <w:jc w:val="both"/>
+      </w:pPr>
+      <w:r>
+        <w:rPr>
+          <w:rFonts w:ascii="Arial" w:cs="Arial" w:eastAsia="Arial" w:hAnsi="Arial"/>
+          <w:sz w:val="22"/>
+          <w:szCs w:val="22"/>
+        </w:rPr>
+        <w:t xml:space="preserve">Bahwa sesuai Pasal 99 ayat (2) undang-undang dimaksud, penyegelan dilakukan oleh juru sita di tempat harta tersebut berada dengan dihadiri 2 (dua) orang saksi, salah satu di antaranya adalah wakil pemerintah daerah setempat. Kurator telah berkoordinasi dengan Camat Selesai dan Kepolisian Resor Langkat untuk kehadiran saksi dan pengamanan kegiatan;</w:t>
+      </w:r>
+    </w:p>
+    <w:p>
+      <w:pPr>
+        <w:pStyle w:val="ListParagraph"/>
+        <w:keepNext w:val="false"/>
+        <w:keepLines/>
+        <w:numPr>
+          <w:ilvl w:val="0"/>
+          <w:numId w:val="5"/>
+        </w:numPr>
+        <w:spacing w:after="120" w:line="276"/>
+        <w:jc w:val="both"/>
+      </w:pPr>
+      <w:r>
+        <w:rPr>
+          <w:rFonts w:ascii="Arial" w:cs="Arial" w:eastAsia="Arial" w:hAnsi="Arial"/>
+          <w:sz w:val="22"/>
+          <w:szCs w:val="22"/>
+        </w:rPr>
+        <w:t xml:space="preserve">Bahwa guna menentukan nilai wajar atas bangunan, benda, hak ganti rugi atas tanaman, dan hak menagih hasil kebun sebagai dasar pemberesan, diperlukan penilaian oleh Kantor Jasa Penilai Publik. Kurator telah meminta penawaran kepada paling sedikit 3 (tiga) KJPP dan memilih KJPP …………………… sebagai penilai;</w:t>
+      </w:r>
+    </w:p>
+    <w:p>
+      <w:pPr>
+        <w:pStyle w:val="ListParagraph"/>
+        <w:keepNext w:val="false"/>
+        <w:keepLines/>
+        <w:numPr>
+          <w:ilvl w:val="0"/>
+          <w:numId w:val="5"/>
+        </w:numPr>
+        <w:spacing w:after="120" w:line="276"/>
+        <w:jc w:val="both"/>
+      </w:pPr>
+      <w:r>
+        <w:rPr>
+          <w:rFonts w:ascii="Arial" w:cs="Arial" w:eastAsia="Arial" w:hAnsi="Arial"/>
+          <w:sz w:val="22"/>
+          <w:szCs w:val="22"/>
+        </w:rPr>
+        <w:t xml:space="preserve">Bahwa untuk efisiensi dan keamanan, Kurator merencanakan penyegelan, inventarisasi, pengukuran oleh Kantor Pertanahan Kabupaten Langkat, dan peninjauan oleh penilai dilaksanakan bersamaan pada hari …………, tanggal …………… 2026.</w:t>
+      </w:r>
+    </w:p>
+    <w:p>
+      <w:pPr>
+        <w:keepNext w:val="false"/>
+        <w:keepLines/>
+        <w:spacing w:after="120" w:line="276"/>
+        <w:ind w:firstLine="709"/>
+        <w:jc w:val="both"/>
+      </w:pPr>
+      <w:r>
+        <w:rPr>
+          <w:rFonts w:ascii="Arial" w:cs="Arial" w:eastAsia="Arial" w:hAnsi="Arial"/>
+          <w:sz w:val="22"/>
+          <w:szCs w:val="22"/>
+        </w:rPr>
+        <w:t xml:space="preserve">Berdasarkan uraian tersebut, dengan hormat kami mohon Hakim Pengawas berkenan:</w:t>
+      </w:r>
+    </w:p>
+    <w:p>
+      <w:pPr>
+        <w:pStyle w:val="ListParagraph"/>
+        <w:keepNext w:val="false"/>
+        <w:keepLines/>
         <w:numPr>
           <w:ilvl w:val="0"/>
           <w:numId w:val="6"/>
@@ -3985,12 +4067,14 @@
           <w:sz w:val="22"/>
           <w:szCs w:val="22"/>
         </w:rPr>
-        <w:t xml:space="preserve">Bahwa sesuai Pasal 99 ayat (2) undang-undang dimaksud, penyegelan dilakukan oleh juru sita di tempat harta tersebut berada dengan dihadiri 2 (dua) orang saksi, salah satu di antaranya adalah wakil pemerintah daerah setempat. Kurator telah berkoordinasi dengan Camat Selesai dan Kepolisian Resor Langkat untuk kehadiran saksi dan pengamanan kegiatan;</w:t>
+        <w:t xml:space="preserve">meneruskan permintaan penyegelan atas bangunan dan benda milik PT Rata Makmur (Dalam Pailit) di lokasi eks HGU Nomor 2/Sei Tampa kepada Pengadilan, untuk dilaksanakan oleh juru sita pada tanggal tersebut; dan</w:t>
       </w:r>
     </w:p>
     <w:p>
       <w:pPr>
         <w:pStyle w:val="ListParagraph"/>
+        <w:keepNext/>
+        <w:keepLines/>
         <w:numPr>
           <w:ilvl w:val="0"/>
           <w:numId w:val="6"/>
@@ -4004,82 +4088,13 @@
           <w:sz w:val="22"/>
           <w:szCs w:val="22"/>
         </w:rPr>
-        <w:t xml:space="preserve">Bahwa guna menentukan nilai wajar atas bangunan, benda, hak ganti rugi atas tanaman, dan hak menagih hasil kebun sebagai dasar pemberesan, diperlukan penilaian oleh Kantor Jasa Penilai Publik. Kurator telah meminta penawaran kepada paling sedikit 3 (tiga) KJPP dan memilih KJPP …………………… sebagai penilai;</w:t>
-      </w:r>
-    </w:p>
-    <w:p>
-      <w:pPr>
-        <w:pStyle w:val="ListParagraph"/>
-        <w:numPr>
-          <w:ilvl w:val="0"/>
-          <w:numId w:val="6"/>
-        </w:numPr>
-        <w:spacing w:after="120" w:line="276"/>
-        <w:jc w:val="both"/>
-      </w:pPr>
-      <w:r>
-        <w:rPr>
-          <w:rFonts w:ascii="Arial" w:cs="Arial" w:eastAsia="Arial" w:hAnsi="Arial"/>
-          <w:sz w:val="22"/>
-          <w:szCs w:val="22"/>
-        </w:rPr>
-        <w:t xml:space="preserve">Bahwa untuk efisiensi dan keamanan, Kurator merencanakan penyegelan, inventarisasi, pengukuran oleh Kantor Pertanahan Kabupaten Langkat, dan peninjauan oleh penilai dilaksanakan bersamaan pada hari …………, tanggal …………… 2026.</w:t>
-      </w:r>
-    </w:p>
-    <w:p>
-      <w:pPr>
-        <w:spacing w:after="120" w:before="0" w:line="276"/>
-        <w:jc w:val="left"/>
-      </w:pPr>
-      <w:r>
-        <w:rPr>
-          <w:rFonts w:ascii="Arial" w:cs="Arial" w:eastAsia="Arial" w:hAnsi="Arial"/>
-          <w:sz w:val="22"/>
-          <w:szCs w:val="22"/>
-        </w:rPr>
-        <w:t xml:space="preserve">Berdasarkan uraian tersebut, dengan hormat kami mohon Hakim Pengawas berkenan:</w:t>
-      </w:r>
-    </w:p>
-    <w:p>
-      <w:pPr>
-        <w:pStyle w:val="ListParagraph"/>
-        <w:numPr>
-          <w:ilvl w:val="0"/>
-          <w:numId w:val="7"/>
-        </w:numPr>
-        <w:spacing w:after="120" w:line="276"/>
-        <w:jc w:val="both"/>
-      </w:pPr>
-      <w:r>
-        <w:rPr>
-          <w:rFonts w:ascii="Arial" w:cs="Arial" w:eastAsia="Arial" w:hAnsi="Arial"/>
-          <w:sz w:val="22"/>
-          <w:szCs w:val="22"/>
-        </w:rPr>
-        <w:t xml:space="preserve">meneruskan permintaan penyegelan atas bangunan dan benda milik PT Rata Makmur (Dalam Pailit) di lokasi eks HGU Nomor 2/Sei Tampa kepada Pengadilan, untuk dilaksanakan oleh juru sita pada tanggal tersebut; dan</w:t>
-      </w:r>
-    </w:p>
-    <w:p>
-      <w:pPr>
-        <w:pStyle w:val="ListParagraph"/>
-        <w:numPr>
-          <w:ilvl w:val="0"/>
-          <w:numId w:val="7"/>
-        </w:numPr>
-        <w:spacing w:after="120" w:line="276"/>
-        <w:jc w:val="both"/>
-      </w:pPr>
-      <w:r>
-        <w:rPr>
-          <w:rFonts w:ascii="Arial" w:cs="Arial" w:eastAsia="Arial" w:hAnsi="Arial"/>
-          <w:sz w:val="22"/>
-          <w:szCs w:val="22"/>
-        </w:rPr>
         <w:t xml:space="preserve">menerbitkan penetapan pengangkatan KJPP …………………… sebagai penilai harta pailit PT Rata Makmur (Dalam Pailit).</w:t>
       </w:r>
     </w:p>
     <w:p>
       <w:pPr>
+        <w:keepNext/>
+        <w:keepLines/>
         <w:spacing w:after="200" w:line="276"/>
         <w:ind w:firstLine="709"/>
         <w:jc w:val="both"/>
@@ -4110,6 +4125,9 @@
         <w:gridCol w:w="3061"/>
       </w:tblGrid>
       <w:tr>
+        <w:trPr>
+          <w:cantSplit/>
+        </w:trPr>
         <w:tc>
           <w:tcPr>
             <w:tcW w:type="dxa" w:w="5896"/>
@@ -4205,7 +4223,7 @@
         <w:pStyle w:val="ListParagraph"/>
         <w:numPr>
           <w:ilvl w:val="0"/>
-          <w:numId w:val="8"/>
+          <w:numId w:val="7"/>
         </w:numPr>
         <w:spacing w:line="276"/>
         <w:jc w:val="both"/>
@@ -4224,7 +4242,7 @@
         <w:pStyle w:val="ListParagraph"/>
         <w:numPr>
           <w:ilvl w:val="0"/>
-          <w:numId w:val="8"/>
+          <w:numId w:val="7"/>
         </w:numPr>
         <w:spacing w:line="276"/>
         <w:jc w:val="both"/>
@@ -4239,27 +4257,8 @@
       </w:r>
     </w:p>
     <w:p>
-      <w:r>
-        <w:br w:type="page"/>
-      </w:r>
-    </w:p>
-    <w:p>
-      <w:pPr>
-        <w:spacing w:after="60"/>
-        <w:jc w:val="right"/>
-      </w:pPr>
-      <w:r>
-        <w:rPr>
-          <w:rFonts w:ascii="Arial" w:cs="Arial" w:eastAsia="Arial" w:hAnsi="Arial"/>
-          <w:color w:val="808080"/>
-          <w:sz w:val="16"/>
-          <w:szCs w:val="16"/>
-        </w:rPr>
-        <w:t xml:space="preserve">Konsep Surat 3</w:t>
-      </w:r>
-    </w:p>
-    <w:p>
-      <w:pPr>
+      <w:pPr>
+        <w:pageBreakBefore/>
         <w:ind w:left="1418"/>
         <w:jc w:val="center"/>
       </w:pPr>
@@ -4428,7 +4427,7 @@
           <w:p>
             <w:pPr>
               <w:spacing w:after="40"/>
-              <w:jc w:val="both"/>
+              <w:jc w:val="left"/>
             </w:pPr>
             <w:r>
               <w:rPr>
@@ -4453,7 +4452,7 @@
           <w:p>
             <w:pPr>
               <w:spacing w:after="40"/>
-              <w:jc w:val="both"/>
+              <w:jc w:val="left"/>
             </w:pPr>
             <w:r>
               <w:rPr>
@@ -4478,7 +4477,7 @@
           <w:p>
             <w:pPr>
               <w:spacing w:after="40"/>
-              <w:jc w:val="both"/>
+              <w:jc w:val="left"/>
             </w:pPr>
             <w:r>
               <w:rPr>
@@ -4530,7 +4529,7 @@
           <w:p>
             <w:pPr>
               <w:spacing w:after="40"/>
-              <w:jc w:val="both"/>
+              <w:jc w:val="left"/>
             </w:pPr>
             <w:r>
               <w:rPr>
@@ -4555,7 +4554,7 @@
           <w:p>
             <w:pPr>
               <w:spacing w:after="40"/>
-              <w:jc w:val="both"/>
+              <w:jc w:val="left"/>
             </w:pPr>
             <w:r>
               <w:rPr>
@@ -4580,7 +4579,7 @@
           <w:p>
             <w:pPr>
               <w:spacing w:after="40"/>
-              <w:jc w:val="both"/>
+              <w:jc w:val="left"/>
             </w:pPr>
             <w:r>
               <w:rPr>
@@ -4624,7 +4623,7 @@
           <w:p>
             <w:pPr>
               <w:spacing w:after="40"/>
-              <w:jc w:val="both"/>
+              <w:jc w:val="left"/>
             </w:pPr>
             <w:r>
               <w:rPr>
@@ -4649,7 +4648,7 @@
           <w:p>
             <w:pPr>
               <w:spacing w:after="40"/>
-              <w:jc w:val="both"/>
+              <w:jc w:val="left"/>
             </w:pPr>
             <w:r>
               <w:rPr>
@@ -4674,7 +4673,7 @@
           <w:p>
             <w:pPr>
               <w:spacing w:after="40"/>
-              <w:jc w:val="both"/>
+              <w:jc w:val="left"/>
             </w:pPr>
             <w:r>
               <w:rPr>
@@ -4718,7 +4717,7 @@
           <w:p>
             <w:pPr>
               <w:spacing w:after="40"/>
-              <w:jc w:val="both"/>
+              <w:jc w:val="left"/>
             </w:pPr>
             <w:r>
               <w:rPr>
@@ -4743,7 +4742,7 @@
           <w:p>
             <w:pPr>
               <w:spacing w:after="40"/>
-              <w:jc w:val="both"/>
+              <w:jc w:val="left"/>
             </w:pPr>
             <w:r>
               <w:rPr>
@@ -4768,7 +4767,7 @@
           <w:p>
             <w:pPr>
               <w:spacing w:after="40"/>
-              <w:jc w:val="both"/>
+              <w:jc w:val="left"/>
             </w:pPr>
             <w:r>
               <w:rPr>
@@ -4867,6 +4866,8 @@
     </w:p>
     <w:p>
       <w:pPr>
+        <w:keepNext w:val="false"/>
+        <w:keepLines/>
         <w:spacing w:after="120" w:line="276"/>
         <w:ind w:firstLine="709"/>
         <w:jc w:val="both"/>
@@ -4883,6 +4884,109 @@
     <w:p>
       <w:pPr>
         <w:pStyle w:val="ListParagraph"/>
+        <w:keepNext w:val="false"/>
+        <w:keepLines/>
+        <w:numPr>
+          <w:ilvl w:val="0"/>
+          <w:numId w:val="8"/>
+        </w:numPr>
+        <w:spacing w:after="120" w:line="276"/>
+        <w:jc w:val="both"/>
+      </w:pPr>
+      <w:r>
+        <w:rPr>
+          <w:rFonts w:ascii="Arial" w:cs="Arial" w:eastAsia="Arial" w:hAnsi="Arial"/>
+          <w:sz w:val="22"/>
+          <w:szCs w:val="22"/>
+        </w:rPr>
+        <w:t xml:space="preserve">Bahwa berdasarkan surat Kepala Kantor Pertanahan Kabupaten Langkat Nomor HP.02.04/712-12.05/VIII/2024 tanggal 12 Agustus 2024, eks Hak Guna Usaha Nomor 2/Sei Tampa, Kecamatan Selesai, Kabupaten Langkat atas nama PT Rata Makmur telah berakhir pada tanggal 31 Agustus 2013, dan terhadap bidang tersebut tercatat blokir dari Balai Harta Peninggalan Medan;</w:t>
+      </w:r>
+    </w:p>
+    <w:p>
+      <w:pPr>
+        <w:pStyle w:val="ListParagraph"/>
+        <w:keepNext w:val="false"/>
+        <w:keepLines/>
+        <w:numPr>
+          <w:ilvl w:val="0"/>
+          <w:numId w:val="8"/>
+        </w:numPr>
+        <w:spacing w:after="120" w:line="276"/>
+        <w:jc w:val="both"/>
+      </w:pPr>
+      <w:r>
+        <w:rPr>
+          <w:rFonts w:ascii="Arial" w:cs="Arial" w:eastAsia="Arial" w:hAnsi="Arial"/>
+          <w:sz w:val="22"/>
+          <w:szCs w:val="22"/>
+        </w:rPr>
+        <w:t xml:space="preserve">Bahwa Kurator berpendapat tanah tersebut telah menjadi tanah negara, sehingga Kurator tidak akan melelang tanahnya. Namun demikian, bangunan, benda, dan tanaman kelapa sawit di atas tanah tersebut merupakan milik PT Rata Makmur, dan hak-hak keperdataan atas benda tersebut merupakan harta pailit yang wajib dibereskan Kurator untuk kepentingan para kreditor;</w:t>
+      </w:r>
+    </w:p>
+    <w:p>
+      <w:pPr>
+        <w:pStyle w:val="ListParagraph"/>
+        <w:keepNext w:val="false"/>
+        <w:keepLines/>
+        <w:numPr>
+          <w:ilvl w:val="0"/>
+          <w:numId w:val="8"/>
+        </w:numPr>
+        <w:spacing w:after="120" w:line="276"/>
+        <w:jc w:val="both"/>
+      </w:pPr>
+      <w:r>
+        <w:rPr>
+          <w:rFonts w:ascii="Arial" w:cs="Arial" w:eastAsia="Arial" w:hAnsi="Arial"/>
+          <w:sz w:val="22"/>
+          <w:szCs w:val="22"/>
+        </w:rPr>
+        <w:t xml:space="preserve">Bahwa Pasal 18 Peraturan Pemerintah Nomor 40 Tahun 1996 mengatur kewajiban bekas pemegang hak atas bangunan, benda, dan tanaman, serta hak atas ganti rugi apabila bangunan, tanaman, dan benda tersebut masih diperlukan untuk melangsungkan atau memulihkan pengusahaan tanahnya. Pasal 4 ayat (4) peraturan pemerintah dimaksud membebankan ganti kerugian atas tanaman atau bangunan milik bekas pemegang hak kepada pemegang Hak Guna Usaha yang baru;</w:t>
+      </w:r>
+    </w:p>
+    <w:p>
+      <w:pPr>
+        <w:pStyle w:val="ListParagraph"/>
+        <w:keepNext w:val="false"/>
+        <w:keepLines/>
+        <w:numPr>
+          <w:ilvl w:val="0"/>
+          <w:numId w:val="8"/>
+        </w:numPr>
+        <w:spacing w:after="120" w:line="276"/>
+        <w:jc w:val="both"/>
+      </w:pPr>
+      <w:r>
+        <w:rPr>
+          <w:rFonts w:ascii="Arial" w:cs="Arial" w:eastAsia="Arial" w:hAnsi="Arial"/>
+          <w:sz w:val="22"/>
+          <w:szCs w:val="22"/>
+        </w:rPr>
+        <w:t xml:space="preserve">Bahwa terdapat perbedaan luas bidang, yaitu 388,7463 Ha menurut surat Kantor Pertanahan Kabupaten Langkat dan 338,7463 Ha menurut data yang ada pada Kurator, sedangkan bidang tersebut belum terpetakan pada aplikasi KKP.</w:t>
+      </w:r>
+    </w:p>
+    <w:p>
+      <w:pPr>
+        <w:keepNext w:val="false"/>
+        <w:keepLines/>
+        <w:spacing w:after="120" w:line="276"/>
+        <w:ind w:firstLine="709"/>
+        <w:jc w:val="both"/>
+      </w:pPr>
+      <w:r>
+        <w:rPr>
+          <w:rFonts w:ascii="Arial" w:cs="Arial" w:eastAsia="Arial" w:hAnsi="Arial"/>
+          <w:sz w:val="22"/>
+          <w:szCs w:val="22"/>
+        </w:rPr>
+        <w:t xml:space="preserve">Sehubungan dengan hal tersebut, dengan hormat kami mohon penegasan tertulis mengenai:</w:t>
+      </w:r>
+    </w:p>
+    <w:p>
+      <w:pPr>
+        <w:pStyle w:val="ListParagraph"/>
+        <w:keepNext w:val="false"/>
+        <w:keepLines/>
         <w:numPr>
           <w:ilvl w:val="0"/>
           <w:numId w:val="9"/>
@@ -4896,12 +5000,14 @@
           <w:sz w:val="22"/>
           <w:szCs w:val="22"/>
         </w:rPr>
-        <w:t xml:space="preserve">Bahwa berdasarkan surat Kepala Kantor Pertanahan Kabupaten Langkat Nomor HP.02.04/712-12.05/VIII/2024 tanggal 12 Agustus 2024, eks Hak Guna Usaha Nomor 2/Sei Tampa, Kecamatan Selesai, Kabupaten Langkat atas nama PT Rata Makmur telah berakhir pada tanggal 31 Agustus 2013, dan terhadap bidang tersebut tercatat blokir dari Balai Harta Peninggalan Medan;</w:t>
+        <w:t xml:space="preserve">status hukum tanah eks HGU Nomor 2/Sei Tampa pada saat ini, termasuk apakah terdapat rencana penataan kembali, pemberian Hak Pengelolaan, atau peruntukan lain atas tanah tersebut;</w:t>
       </w:r>
     </w:p>
     <w:p>
       <w:pPr>
         <w:pStyle w:val="ListParagraph"/>
+        <w:keepNext w:val="false"/>
+        <w:keepLines/>
         <w:numPr>
           <w:ilvl w:val="0"/>
           <w:numId w:val="9"/>
@@ -4915,12 +5021,14 @@
           <w:sz w:val="22"/>
           <w:szCs w:val="22"/>
         </w:rPr>
-        <w:t xml:space="preserve">Bahwa Kurator berpendapat tanah tersebut telah menjadi tanah negara, sehingga Kurator tidak akan melelang tanahnya. Namun demikian, bangunan, benda, dan tanaman kelapa sawit di atas tanah tersebut merupakan milik PT Rata Makmur, dan hak-hak keperdataan atas benda tersebut merupakan harta pailit yang wajib dibereskan Kurator untuk kepentingan para kreditor;</w:t>
+        <w:t xml:space="preserve">apakah bangunan, benda, dan tanaman di atas tanah tersebut dinilai masih diperlukan untuk melangsungkan pengusahaan tanahnya;</w:t>
       </w:r>
     </w:p>
     <w:p>
       <w:pPr>
         <w:pStyle w:val="ListParagraph"/>
+        <w:keepNext w:val="false"/>
+        <w:keepLines/>
         <w:numPr>
           <w:ilvl w:val="0"/>
           <w:numId w:val="9"/>
@@ -4934,12 +5042,14 @@
           <w:sz w:val="22"/>
           <w:szCs w:val="22"/>
         </w:rPr>
-        <w:t xml:space="preserve">Bahwa Pasal 18 Peraturan Pemerintah Nomor 40 Tahun 1996 mengatur kewajiban bekas pemegang hak atas bangunan, benda, dan tanaman, serta hak atas ganti rugi apabila bangunan, tanaman, dan benda tersebut masih diperlukan untuk melangsungkan atau memulihkan pengusahaan tanahnya. Pasal 4 ayat (4) peraturan pemerintah dimaksud membebankan ganti kerugian atas tanaman atau bangunan milik bekas pemegang hak kepada pemegang Hak Guna Usaha yang baru;</w:t>
+        <w:t xml:space="preserve">ada tidaknya permohonan hak baru atas tanah tersebut, serta kewajiban pemohon untuk memberikan ganti kerugian kepada bekas pemegang hak atas bangunan dan tanaman;</w:t>
       </w:r>
     </w:p>
     <w:p>
       <w:pPr>
         <w:pStyle w:val="ListParagraph"/>
+        <w:keepNext w:val="false"/>
+        <w:keepLines/>
         <w:numPr>
           <w:ilvl w:val="0"/>
           <w:numId w:val="9"/>
@@ -4953,29 +5063,17 @@
           <w:sz w:val="22"/>
           <w:szCs w:val="22"/>
         </w:rPr>
-        <w:t xml:space="preserve">Bahwa terdapat perbedaan luas bidang, yaitu 388,7463 Ha menurut surat Kantor Pertanahan Kabupaten Langkat dan 338,7463 Ha menurut data yang ada pada Kurator, sedangkan bidang tersebut belum terpetakan pada aplikasi KKP.</w:t>
-      </w:r>
-    </w:p>
-    <w:p>
-      <w:pPr>
-        <w:spacing w:after="120" w:before="0" w:line="276"/>
-        <w:jc w:val="left"/>
-      </w:pPr>
-      <w:r>
-        <w:rPr>
-          <w:rFonts w:ascii="Arial" w:cs="Arial" w:eastAsia="Arial" w:hAnsi="Arial"/>
-          <w:sz w:val="22"/>
-          <w:szCs w:val="22"/>
-        </w:rPr>
-        <w:t xml:space="preserve">Sehubungan dengan hal tersebut, dengan hormat kami mohon penegasan tertulis mengenai:</w:t>
+        <w:t xml:space="preserve">kedudukan prioritas bekas pemegang hak sebagaimana dimaksud Pasal 22 Peraturan Pemerintah Nomor 18 Tahun 2021, dan tata cara pelepasannya oleh Kurator apabila diperlukan; dan</w:t>
       </w:r>
     </w:p>
     <w:p>
       <w:pPr>
         <w:pStyle w:val="ListParagraph"/>
+        <w:keepNext w:val="false"/>
+        <w:keepLines/>
         <w:numPr>
           <w:ilvl w:val="0"/>
-          <w:numId w:val="10"/>
+          <w:numId w:val="9"/>
         </w:numPr>
         <w:spacing w:after="120" w:line="276"/>
         <w:jc w:val="both"/>
@@ -4986,87 +5084,13 @@
           <w:sz w:val="22"/>
           <w:szCs w:val="22"/>
         </w:rPr>
-        <w:t xml:space="preserve">status hukum tanah eks HGU Nomor 2/Sei Tampa pada saat ini, termasuk apakah terdapat rencana penataan kembali, pemberian Hak Pengelolaan, atau peruntukan lain atas tanah tersebut;</w:t>
-      </w:r>
-    </w:p>
-    <w:p>
-      <w:pPr>
-        <w:pStyle w:val="ListParagraph"/>
-        <w:numPr>
-          <w:ilvl w:val="0"/>
-          <w:numId w:val="10"/>
-        </w:numPr>
-        <w:spacing w:after="120" w:line="276"/>
-        <w:jc w:val="both"/>
-      </w:pPr>
-      <w:r>
-        <w:rPr>
-          <w:rFonts w:ascii="Arial" w:cs="Arial" w:eastAsia="Arial" w:hAnsi="Arial"/>
-          <w:sz w:val="22"/>
-          <w:szCs w:val="22"/>
-        </w:rPr>
-        <w:t xml:space="preserve">apakah bangunan, benda, dan tanaman di atas tanah tersebut dinilai masih diperlukan untuk melangsungkan pengusahaan tanahnya;</w:t>
-      </w:r>
-    </w:p>
-    <w:p>
-      <w:pPr>
-        <w:pStyle w:val="ListParagraph"/>
-        <w:numPr>
-          <w:ilvl w:val="0"/>
-          <w:numId w:val="10"/>
-        </w:numPr>
-        <w:spacing w:after="120" w:line="276"/>
-        <w:jc w:val="both"/>
-      </w:pPr>
-      <w:r>
-        <w:rPr>
-          <w:rFonts w:ascii="Arial" w:cs="Arial" w:eastAsia="Arial" w:hAnsi="Arial"/>
-          <w:sz w:val="22"/>
-          <w:szCs w:val="22"/>
-        </w:rPr>
-        <w:t xml:space="preserve">ada tidaknya permohonan hak baru atas tanah tersebut, serta kewajiban pemohon untuk memberikan ganti kerugian kepada bekas pemegang hak atas bangunan dan tanaman;</w:t>
-      </w:r>
-    </w:p>
-    <w:p>
-      <w:pPr>
-        <w:pStyle w:val="ListParagraph"/>
-        <w:numPr>
-          <w:ilvl w:val="0"/>
-          <w:numId w:val="10"/>
-        </w:numPr>
-        <w:spacing w:after="120" w:line="276"/>
-        <w:jc w:val="both"/>
-      </w:pPr>
-      <w:r>
-        <w:rPr>
-          <w:rFonts w:ascii="Arial" w:cs="Arial" w:eastAsia="Arial" w:hAnsi="Arial"/>
-          <w:sz w:val="22"/>
-          <w:szCs w:val="22"/>
-        </w:rPr>
-        <w:t xml:space="preserve">kedudukan prioritas bekas pemegang hak sebagaimana dimaksud Pasal 22 Peraturan Pemerintah Nomor 18 Tahun 2021, dan tata cara pelepasannya oleh Kurator apabila diperlukan; dan</w:t>
-      </w:r>
-    </w:p>
-    <w:p>
-      <w:pPr>
-        <w:pStyle w:val="ListParagraph"/>
-        <w:numPr>
-          <w:ilvl w:val="0"/>
-          <w:numId w:val="10"/>
-        </w:numPr>
-        <w:spacing w:after="120" w:line="276"/>
-        <w:jc w:val="both"/>
-      </w:pPr>
-      <w:r>
-        <w:rPr>
-          <w:rFonts w:ascii="Arial" w:cs="Arial" w:eastAsia="Arial" w:hAnsi="Arial"/>
-          <w:sz w:val="22"/>
-          <w:szCs w:val="22"/>
-        </w:rPr>
         <w:t xml:space="preserve">luas dan batas bidang yang benar, serta kesediaan Kantor Pertanahan Kabupaten Langkat untuk melakukan pengukuran bersama Kurator.</w:t>
       </w:r>
     </w:p>
     <w:p>
       <w:pPr>
+        <w:keepNext/>
+        <w:keepLines/>
         <w:spacing w:after="200" w:line="276"/>
         <w:ind w:firstLine="709"/>
         <w:jc w:val="both"/>
@@ -5097,6 +5121,9 @@
         <w:gridCol w:w="3061"/>
       </w:tblGrid>
       <w:tr>
+        <w:trPr>
+          <w:cantSplit/>
+        </w:trPr>
         <w:tc>
           <w:tcPr>
             <w:tcW w:type="dxa" w:w="5896"/>
@@ -5192,7 +5219,7 @@
         <w:pStyle w:val="ListParagraph"/>
         <w:numPr>
           <w:ilvl w:val="0"/>
-          <w:numId w:val="11"/>
+          <w:numId w:val="10"/>
         </w:numPr>
         <w:spacing w:line="276"/>
         <w:jc w:val="both"/>
@@ -5211,7 +5238,7 @@
         <w:pStyle w:val="ListParagraph"/>
         <w:numPr>
           <w:ilvl w:val="0"/>
-          <w:numId w:val="11"/>
+          <w:numId w:val="10"/>
         </w:numPr>
         <w:spacing w:line="276"/>
         <w:jc w:val="both"/>
@@ -5230,7 +5257,7 @@
         <w:pStyle w:val="ListParagraph"/>
         <w:numPr>
           <w:ilvl w:val="0"/>
-          <w:numId w:val="11"/>
+          <w:numId w:val="10"/>
         </w:numPr>
         <w:spacing w:line="276"/>
         <w:jc w:val="both"/>
@@ -5245,27 +5272,8 @@
       </w:r>
     </w:p>
     <w:p>
-      <w:r>
-        <w:br w:type="page"/>
-      </w:r>
-    </w:p>
-    <w:p>
-      <w:pPr>
-        <w:spacing w:after="60"/>
-        <w:jc w:val="right"/>
-      </w:pPr>
-      <w:r>
-        <w:rPr>
-          <w:rFonts w:ascii="Arial" w:cs="Arial" w:eastAsia="Arial" w:hAnsi="Arial"/>
-          <w:color w:val="808080"/>
-          <w:sz w:val="16"/>
-          <w:szCs w:val="16"/>
-        </w:rPr>
-        <w:t xml:space="preserve">Konsep Surat 4</w:t>
-      </w:r>
-    </w:p>
-    <w:p>
-      <w:pPr>
+      <w:pPr>
+        <w:pageBreakBefore/>
         <w:ind w:left="1418"/>
         <w:jc w:val="center"/>
       </w:pPr>
@@ -5434,7 +5442,7 @@
           <w:p>
             <w:pPr>
               <w:spacing w:after="40"/>
-              <w:jc w:val="both"/>
+              <w:jc w:val="left"/>
             </w:pPr>
             <w:r>
               <w:rPr>
@@ -5459,7 +5467,7 @@
           <w:p>
             <w:pPr>
               <w:spacing w:after="40"/>
-              <w:jc w:val="both"/>
+              <w:jc w:val="left"/>
             </w:pPr>
             <w:r>
               <w:rPr>
@@ -5484,7 +5492,7 @@
           <w:p>
             <w:pPr>
               <w:spacing w:after="40"/>
-              <w:jc w:val="both"/>
+              <w:jc w:val="left"/>
             </w:pPr>
             <w:r>
               <w:rPr>
@@ -5536,7 +5544,7 @@
           <w:p>
             <w:pPr>
               <w:spacing w:after="40"/>
-              <w:jc w:val="both"/>
+              <w:jc w:val="left"/>
             </w:pPr>
             <w:r>
               <w:rPr>
@@ -5561,7 +5569,7 @@
           <w:p>
             <w:pPr>
               <w:spacing w:after="40"/>
-              <w:jc w:val="both"/>
+              <w:jc w:val="left"/>
             </w:pPr>
             <w:r>
               <w:rPr>
@@ -5586,7 +5594,7 @@
           <w:p>
             <w:pPr>
               <w:spacing w:after="40"/>
-              <w:jc w:val="both"/>
+              <w:jc w:val="left"/>
             </w:pPr>
             <w:r>
               <w:rPr>
@@ -5630,7 +5638,7 @@
           <w:p>
             <w:pPr>
               <w:spacing w:after="40"/>
-              <w:jc w:val="both"/>
+              <w:jc w:val="left"/>
             </w:pPr>
             <w:r>
               <w:rPr>
@@ -5655,7 +5663,7 @@
           <w:p>
             <w:pPr>
               <w:spacing w:after="40"/>
-              <w:jc w:val="both"/>
+              <w:jc w:val="left"/>
             </w:pPr>
             <w:r>
               <w:rPr>
@@ -5680,7 +5688,7 @@
           <w:p>
             <w:pPr>
               <w:spacing w:after="40"/>
-              <w:jc w:val="both"/>
+              <w:jc w:val="left"/>
             </w:pPr>
             <w:r>
               <w:rPr>
@@ -5724,7 +5732,7 @@
           <w:p>
             <w:pPr>
               <w:spacing w:after="40"/>
-              <w:jc w:val="both"/>
+              <w:jc w:val="left"/>
             </w:pPr>
             <w:r>
               <w:rPr>
@@ -5749,7 +5757,7 @@
           <w:p>
             <w:pPr>
               <w:spacing w:after="40"/>
-              <w:jc w:val="both"/>
+              <w:jc w:val="left"/>
             </w:pPr>
             <w:r>
               <w:rPr>
@@ -5774,7 +5782,7 @@
           <w:p>
             <w:pPr>
               <w:spacing w:after="40"/>
-              <w:jc w:val="both"/>
+              <w:jc w:val="left"/>
             </w:pPr>
             <w:r>
               <w:rPr>
@@ -5859,6 +5867,8 @@
     </w:p>
     <w:p>
       <w:pPr>
+        <w:keepNext w:val="false"/>
+        <w:keepLines/>
         <w:spacing w:after="120" w:line="276"/>
         <w:ind w:firstLine="709"/>
         <w:jc w:val="both"/>
@@ -5875,9 +5885,11 @@
     <w:p>
       <w:pPr>
         <w:pStyle w:val="ListParagraph"/>
+        <w:keepNext w:val="false"/>
+        <w:keepLines/>
         <w:numPr>
           <w:ilvl w:val="0"/>
-          <w:numId w:val="12"/>
+          <w:numId w:val="11"/>
         </w:numPr>
         <w:spacing w:after="120" w:line="276"/>
         <w:jc w:val="both"/>
@@ -5894,9 +5906,11 @@
     <w:p>
       <w:pPr>
         <w:pStyle w:val="ListParagraph"/>
+        <w:keepNext w:val="false"/>
+        <w:keepLines/>
         <w:numPr>
           <w:ilvl w:val="0"/>
-          <w:numId w:val="12"/>
+          <w:numId w:val="11"/>
         </w:numPr>
         <w:spacing w:after="120" w:line="276"/>
         <w:jc w:val="both"/>
@@ -5913,9 +5927,11 @@
     <w:p>
       <w:pPr>
         <w:pStyle w:val="ListParagraph"/>
+        <w:keepNext w:val="false"/>
+        <w:keepLines/>
         <w:numPr>
           <w:ilvl w:val="0"/>
-          <w:numId w:val="12"/>
+          <w:numId w:val="11"/>
         </w:numPr>
         <w:spacing w:after="120" w:line="276"/>
         <w:jc w:val="both"/>
@@ -5931,6 +5947,8 @@
     </w:p>
     <w:p>
       <w:pPr>
+        <w:keepNext/>
+        <w:keepLines/>
         <w:spacing w:after="200" w:line="276"/>
         <w:ind w:firstLine="709"/>
         <w:jc w:val="both"/>
@@ -5961,6 +5979,9 @@
         <w:gridCol w:w="3061"/>
       </w:tblGrid>
       <w:tr>
+        <w:trPr>
+          <w:cantSplit/>
+        </w:trPr>
         <w:tc>
           <w:tcPr>
             <w:tcW w:type="dxa" w:w="5896"/>
@@ -6056,7 +6077,7 @@
         <w:pStyle w:val="ListParagraph"/>
         <w:numPr>
           <w:ilvl w:val="0"/>
-          <w:numId w:val="13"/>
+          <w:numId w:val="12"/>
         </w:numPr>
         <w:spacing w:line="276"/>
         <w:jc w:val="both"/>
@@ -6075,7 +6096,7 @@
         <w:pStyle w:val="ListParagraph"/>
         <w:numPr>
           <w:ilvl w:val="0"/>
-          <w:numId w:val="13"/>
+          <w:numId w:val="12"/>
         </w:numPr>
         <w:spacing w:line="276"/>
         <w:jc w:val="both"/>
@@ -6090,27 +6111,8 @@
       </w:r>
     </w:p>
     <w:p>
-      <w:r>
-        <w:br w:type="page"/>
-      </w:r>
-    </w:p>
-    <w:p>
-      <w:pPr>
-        <w:spacing w:after="60"/>
-        <w:jc w:val="right"/>
-      </w:pPr>
-      <w:r>
-        <w:rPr>
-          <w:rFonts w:ascii="Arial" w:cs="Arial" w:eastAsia="Arial" w:hAnsi="Arial"/>
-          <w:color w:val="808080"/>
-          <w:sz w:val="16"/>
-          <w:szCs w:val="16"/>
-        </w:rPr>
-        <w:t xml:space="preserve">Konsep Surat 5</w:t>
-      </w:r>
-    </w:p>
-    <w:p>
-      <w:pPr>
+      <w:pPr>
+        <w:pageBreakBefore/>
         <w:ind w:left="1418"/>
         <w:jc w:val="center"/>
       </w:pPr>
@@ -6279,7 +6281,7 @@
           <w:p>
             <w:pPr>
               <w:spacing w:after="40"/>
-              <w:jc w:val="both"/>
+              <w:jc w:val="left"/>
             </w:pPr>
             <w:r>
               <w:rPr>
@@ -6304,7 +6306,7 @@
           <w:p>
             <w:pPr>
               <w:spacing w:after="40"/>
-              <w:jc w:val="both"/>
+              <w:jc w:val="left"/>
             </w:pPr>
             <w:r>
               <w:rPr>
@@ -6329,7 +6331,7 @@
           <w:p>
             <w:pPr>
               <w:spacing w:after="40"/>
-              <w:jc w:val="both"/>
+              <w:jc w:val="left"/>
             </w:pPr>
             <w:r>
               <w:rPr>
@@ -6381,7 +6383,7 @@
           <w:p>
             <w:pPr>
               <w:spacing w:after="40"/>
-              <w:jc w:val="both"/>
+              <w:jc w:val="left"/>
             </w:pPr>
             <w:r>
               <w:rPr>
@@ -6406,7 +6408,7 @@
           <w:p>
             <w:pPr>
               <w:spacing w:after="40"/>
-              <w:jc w:val="both"/>
+              <w:jc w:val="left"/>
             </w:pPr>
             <w:r>
               <w:rPr>
@@ -6431,7 +6433,7 @@
           <w:p>
             <w:pPr>
               <w:spacing w:after="40"/>
-              <w:jc w:val="both"/>
+              <w:jc w:val="left"/>
             </w:pPr>
             <w:r>
               <w:rPr>
@@ -6475,7 +6477,7 @@
           <w:p>
             <w:pPr>
               <w:spacing w:after="40"/>
-              <w:jc w:val="both"/>
+              <w:jc w:val="left"/>
             </w:pPr>
             <w:r>
               <w:rPr>
@@ -6500,7 +6502,7 @@
           <w:p>
             <w:pPr>
               <w:spacing w:after="40"/>
-              <w:jc w:val="both"/>
+              <w:jc w:val="left"/>
             </w:pPr>
             <w:r>
               <w:rPr>
@@ -6525,7 +6527,7 @@
           <w:p>
             <w:pPr>
               <w:spacing w:after="40"/>
-              <w:jc w:val="both"/>
+              <w:jc w:val="left"/>
             </w:pPr>
             <w:r>
               <w:rPr>
@@ -6569,7 +6571,7 @@
           <w:p>
             <w:pPr>
               <w:spacing w:after="40"/>
-              <w:jc w:val="both"/>
+              <w:jc w:val="left"/>
             </w:pPr>
             <w:r>
               <w:rPr>
@@ -6594,7 +6596,7 @@
           <w:p>
             <w:pPr>
               <w:spacing w:after="40"/>
-              <w:jc w:val="both"/>
+              <w:jc w:val="left"/>
             </w:pPr>
             <w:r>
               <w:rPr>
@@ -6619,7 +6621,7 @@
           <w:p>
             <w:pPr>
               <w:spacing w:after="40"/>
-              <w:jc w:val="both"/>
+              <w:jc w:val="left"/>
             </w:pPr>
             <w:r>
               <w:rPr>
@@ -6690,6 +6692,8 @@
     </w:p>
     <w:p>
       <w:pPr>
+        <w:keepNext w:val="false"/>
+        <w:keepLines/>
         <w:spacing w:after="120" w:line="276"/>
         <w:ind w:firstLine="709"/>
         <w:jc w:val="both"/>
@@ -6706,9 +6710,11 @@
     <w:p>
       <w:pPr>
         <w:pStyle w:val="ListParagraph"/>
+        <w:keepNext w:val="false"/>
+        <w:keepLines/>
         <w:numPr>
           <w:ilvl w:val="0"/>
-          <w:numId w:val="14"/>
+          <w:numId w:val="13"/>
         </w:numPr>
         <w:spacing w:after="120" w:line="276"/>
         <w:jc w:val="both"/>
@@ -6725,9 +6731,11 @@
     <w:p>
       <w:pPr>
         <w:pStyle w:val="ListParagraph"/>
+        <w:keepNext w:val="false"/>
+        <w:keepLines/>
         <w:numPr>
           <w:ilvl w:val="0"/>
-          <w:numId w:val="14"/>
+          <w:numId w:val="13"/>
         </w:numPr>
         <w:spacing w:after="120" w:line="276"/>
         <w:jc w:val="both"/>
@@ -6744,9 +6752,11 @@
     <w:p>
       <w:pPr>
         <w:pStyle w:val="ListParagraph"/>
+        <w:keepNext w:val="false"/>
+        <w:keepLines/>
         <w:numPr>
           <w:ilvl w:val="0"/>
-          <w:numId w:val="14"/>
+          <w:numId w:val="13"/>
         </w:numPr>
         <w:spacing w:after="120" w:line="276"/>
         <w:jc w:val="both"/>
@@ -6763,9 +6773,11 @@
     <w:p>
       <w:pPr>
         <w:pStyle w:val="ListParagraph"/>
+        <w:keepNext w:val="false"/>
+        <w:keepLines/>
         <w:numPr>
           <w:ilvl w:val="0"/>
-          <w:numId w:val="14"/>
+          <w:numId w:val="13"/>
         </w:numPr>
         <w:spacing w:after="120" w:line="276"/>
         <w:jc w:val="both"/>
@@ -6782,9 +6794,11 @@
     <w:p>
       <w:pPr>
         <w:pStyle w:val="ListParagraph"/>
+        <w:keepNext w:val="false"/>
+        <w:keepLines/>
         <w:numPr>
           <w:ilvl w:val="0"/>
-          <w:numId w:val="14"/>
+          <w:numId w:val="13"/>
         </w:numPr>
         <w:spacing w:after="120" w:line="276"/>
         <w:jc w:val="both"/>
@@ -6800,6 +6814,8 @@
     </w:p>
     <w:p>
       <w:pPr>
+        <w:keepNext w:val="false"/>
+        <w:keepLines/>
         <w:spacing w:after="120" w:line="276"/>
         <w:ind w:firstLine="709"/>
         <w:jc w:val="both"/>
@@ -6815,6 +6831,8 @@
     </w:p>
     <w:p>
       <w:pPr>
+        <w:keepNext/>
+        <w:keepLines/>
         <w:spacing w:after="200" w:line="276"/>
         <w:ind w:firstLine="709"/>
         <w:jc w:val="both"/>
@@ -6845,6 +6863,9 @@
         <w:gridCol w:w="3061"/>
       </w:tblGrid>
       <w:tr>
+        <w:trPr>
+          <w:cantSplit/>
+        </w:trPr>
         <w:tc>
           <w:tcPr>
             <w:tcW w:type="dxa" w:w="5896"/>
@@ -6940,7 +6961,7 @@
         <w:pStyle w:val="ListParagraph"/>
         <w:numPr>
           <w:ilvl w:val="0"/>
-          <w:numId w:val="15"/>
+          <w:numId w:val="14"/>
         </w:numPr>
         <w:spacing w:line="276"/>
         <w:jc w:val="both"/>
@@ -6959,7 +6980,7 @@
         <w:pStyle w:val="ListParagraph"/>
         <w:numPr>
           <w:ilvl w:val="0"/>
-          <w:numId w:val="15"/>
+          <w:numId w:val="14"/>
         </w:numPr>
         <w:spacing w:line="276"/>
         <w:jc w:val="both"/>
@@ -6978,7 +6999,7 @@
         <w:pStyle w:val="ListParagraph"/>
         <w:numPr>
           <w:ilvl w:val="0"/>
-          <w:numId w:val="15"/>
+          <w:numId w:val="14"/>
         </w:numPr>
         <w:spacing w:line="276"/>
         <w:jc w:val="both"/>
@@ -6993,27 +7014,8 @@
       </w:r>
     </w:p>
     <w:p>
-      <w:r>
-        <w:br w:type="page"/>
-      </w:r>
-    </w:p>
-    <w:p>
-      <w:pPr>
-        <w:spacing w:after="60"/>
-        <w:jc w:val="right"/>
-      </w:pPr>
-      <w:r>
-        <w:rPr>
-          <w:rFonts w:ascii="Arial" w:cs="Arial" w:eastAsia="Arial" w:hAnsi="Arial"/>
-          <w:color w:val="808080"/>
-          <w:sz w:val="16"/>
-          <w:szCs w:val="16"/>
-        </w:rPr>
-        <w:t xml:space="preserve">Konsep Surat 6</w:t>
-      </w:r>
-    </w:p>
-    <w:p>
-      <w:pPr>
+      <w:pPr>
+        <w:pageBreakBefore/>
         <w:ind w:left="1418"/>
         <w:jc w:val="center"/>
       </w:pPr>
@@ -7182,7 +7184,7 @@
           <w:p>
             <w:pPr>
               <w:spacing w:after="40"/>
-              <w:jc w:val="both"/>
+              <w:jc w:val="left"/>
             </w:pPr>
             <w:r>
               <w:rPr>
@@ -7207,7 +7209,7 @@
           <w:p>
             <w:pPr>
               <w:spacing w:after="40"/>
-              <w:jc w:val="both"/>
+              <w:jc w:val="left"/>
             </w:pPr>
             <w:r>
               <w:rPr>
@@ -7232,7 +7234,7 @@
           <w:p>
             <w:pPr>
               <w:spacing w:after="40"/>
-              <w:jc w:val="both"/>
+              <w:jc w:val="left"/>
             </w:pPr>
             <w:r>
               <w:rPr>
@@ -7284,7 +7286,7 @@
           <w:p>
             <w:pPr>
               <w:spacing w:after="40"/>
-              <w:jc w:val="both"/>
+              <w:jc w:val="left"/>
             </w:pPr>
             <w:r>
               <w:rPr>
@@ -7309,7 +7311,7 @@
           <w:p>
             <w:pPr>
               <w:spacing w:after="40"/>
-              <w:jc w:val="both"/>
+              <w:jc w:val="left"/>
             </w:pPr>
             <w:r>
               <w:rPr>
@@ -7334,7 +7336,7 @@
           <w:p>
             <w:pPr>
               <w:spacing w:after="40"/>
-              <w:jc w:val="both"/>
+              <w:jc w:val="left"/>
             </w:pPr>
             <w:r>
               <w:rPr>
@@ -7378,7 +7380,7 @@
           <w:p>
             <w:pPr>
               <w:spacing w:after="40"/>
-              <w:jc w:val="both"/>
+              <w:jc w:val="left"/>
             </w:pPr>
             <w:r>
               <w:rPr>
@@ -7403,7 +7405,7 @@
           <w:p>
             <w:pPr>
               <w:spacing w:after="40"/>
-              <w:jc w:val="both"/>
+              <w:jc w:val="left"/>
             </w:pPr>
             <w:r>
               <w:rPr>
@@ -7428,7 +7430,7 @@
           <w:p>
             <w:pPr>
               <w:spacing w:after="40"/>
-              <w:jc w:val="both"/>
+              <w:jc w:val="left"/>
             </w:pPr>
             <w:r>
               <w:rPr>
@@ -7472,7 +7474,7 @@
           <w:p>
             <w:pPr>
               <w:spacing w:after="40"/>
-              <w:jc w:val="both"/>
+              <w:jc w:val="left"/>
             </w:pPr>
             <w:r>
               <w:rPr>
@@ -7497,7 +7499,7 @@
           <w:p>
             <w:pPr>
               <w:spacing w:after="40"/>
-              <w:jc w:val="both"/>
+              <w:jc w:val="left"/>
             </w:pPr>
             <w:r>
               <w:rPr>
@@ -7522,7 +7524,7 @@
           <w:p>
             <w:pPr>
               <w:spacing w:after="40"/>
-              <w:jc w:val="both"/>
+              <w:jc w:val="left"/>
             </w:pPr>
             <w:r>
               <w:rPr>
@@ -7607,6 +7609,8 @@
     </w:p>
     <w:p>
       <w:pPr>
+        <w:keepNext w:val="false"/>
+        <w:keepLines/>
         <w:spacing w:after="120" w:line="276"/>
         <w:ind w:firstLine="709"/>
         <w:jc w:val="both"/>
@@ -7623,9 +7627,11 @@
     <w:p>
       <w:pPr>
         <w:pStyle w:val="ListParagraph"/>
+        <w:keepNext w:val="false"/>
+        <w:keepLines/>
         <w:numPr>
           <w:ilvl w:val="0"/>
-          <w:numId w:val="16"/>
+          <w:numId w:val="15"/>
         </w:numPr>
         <w:spacing w:after="120" w:line="276"/>
         <w:jc w:val="both"/>
@@ -7642,9 +7648,11 @@
     <w:p>
       <w:pPr>
         <w:pStyle w:val="ListParagraph"/>
+        <w:keepNext w:val="false"/>
+        <w:keepLines/>
         <w:numPr>
           <w:ilvl w:val="0"/>
-          <w:numId w:val="16"/>
+          <w:numId w:val="15"/>
         </w:numPr>
         <w:spacing w:after="120" w:line="276"/>
         <w:jc w:val="both"/>
@@ -7661,9 +7669,11 @@
     <w:p>
       <w:pPr>
         <w:pStyle w:val="ListParagraph"/>
+        <w:keepNext w:val="false"/>
+        <w:keepLines/>
         <w:numPr>
           <w:ilvl w:val="0"/>
-          <w:numId w:val="16"/>
+          <w:numId w:val="15"/>
         </w:numPr>
         <w:spacing w:after="120" w:line="276"/>
         <w:jc w:val="both"/>
@@ -7679,6 +7689,8 @@
     </w:p>
     <w:p>
       <w:pPr>
+        <w:keepNext/>
+        <w:keepLines/>
         <w:spacing w:after="200" w:line="276"/>
         <w:ind w:firstLine="709"/>
         <w:jc w:val="both"/>
@@ -7709,6 +7721,9 @@
         <w:gridCol w:w="3061"/>
       </w:tblGrid>
       <w:tr>
+        <w:trPr>
+          <w:cantSplit/>
+        </w:trPr>
         <w:tc>
           <w:tcPr>
             <w:tcW w:type="dxa" w:w="5896"/>
@@ -7804,7 +7819,7 @@
         <w:pStyle w:val="ListParagraph"/>
         <w:numPr>
           <w:ilvl w:val="0"/>
-          <w:numId w:val="17"/>
+          <w:numId w:val="16"/>
         </w:numPr>
         <w:spacing w:line="276"/>
         <w:jc w:val="both"/>
@@ -7823,7 +7838,7 @@
         <w:pStyle w:val="ListParagraph"/>
         <w:numPr>
           <w:ilvl w:val="0"/>
-          <w:numId w:val="17"/>
+          <w:numId w:val="16"/>
         </w:numPr>
         <w:spacing w:line="276"/>
         <w:jc w:val="both"/>
@@ -7842,7 +7857,7 @@
         <w:pStyle w:val="ListParagraph"/>
         <w:numPr>
           <w:ilvl w:val="0"/>
-          <w:numId w:val="17"/>
+          <w:numId w:val="16"/>
         </w:numPr>
         <w:spacing w:line="276"/>
         <w:jc w:val="both"/>
@@ -7861,7 +7876,7 @@
         <w:pStyle w:val="ListParagraph"/>
         <w:numPr>
           <w:ilvl w:val="0"/>
-          <w:numId w:val="17"/>
+          <w:numId w:val="16"/>
         </w:numPr>
         <w:spacing w:line="276"/>
         <w:jc w:val="both"/>
@@ -7876,27 +7891,8 @@
       </w:r>
     </w:p>
     <w:p>
-      <w:r>
-        <w:br w:type="page"/>
-      </w:r>
-    </w:p>
-    <w:p>
-      <w:pPr>
-        <w:spacing w:after="60"/>
-        <w:jc w:val="right"/>
-      </w:pPr>
-      <w:r>
-        <w:rPr>
-          <w:rFonts w:ascii="Arial" w:cs="Arial" w:eastAsia="Arial" w:hAnsi="Arial"/>
-          <w:color w:val="808080"/>
-          <w:sz w:val="16"/>
-          <w:szCs w:val="16"/>
-        </w:rPr>
-        <w:t xml:space="preserve">Konsep Surat 7</w:t>
-      </w:r>
-    </w:p>
-    <w:p>
-      <w:pPr>
+      <w:pPr>
+        <w:pageBreakBefore/>
         <w:ind w:left="1418"/>
         <w:jc w:val="center"/>
       </w:pPr>
@@ -8065,7 +8061,7 @@
           <w:p>
             <w:pPr>
               <w:spacing w:after="40"/>
-              <w:jc w:val="both"/>
+              <w:jc w:val="left"/>
             </w:pPr>
             <w:r>
               <w:rPr>
@@ -8090,7 +8086,7 @@
           <w:p>
             <w:pPr>
               <w:spacing w:after="40"/>
-              <w:jc w:val="both"/>
+              <w:jc w:val="left"/>
             </w:pPr>
             <w:r>
               <w:rPr>
@@ -8115,7 +8111,7 @@
           <w:p>
             <w:pPr>
               <w:spacing w:after="40"/>
-              <w:jc w:val="both"/>
+              <w:jc w:val="left"/>
             </w:pPr>
             <w:r>
               <w:rPr>
@@ -8167,7 +8163,7 @@
           <w:p>
             <w:pPr>
               <w:spacing w:after="40"/>
-              <w:jc w:val="both"/>
+              <w:jc w:val="left"/>
             </w:pPr>
             <w:r>
               <w:rPr>
@@ -8192,7 +8188,7 @@
           <w:p>
             <w:pPr>
               <w:spacing w:after="40"/>
-              <w:jc w:val="both"/>
+              <w:jc w:val="left"/>
             </w:pPr>
             <w:r>
               <w:rPr>
@@ -8217,7 +8213,7 @@
           <w:p>
             <w:pPr>
               <w:spacing w:after="40"/>
-              <w:jc w:val="both"/>
+              <w:jc w:val="left"/>
             </w:pPr>
             <w:r>
               <w:rPr>
@@ -8261,7 +8257,7 @@
           <w:p>
             <w:pPr>
               <w:spacing w:after="40"/>
-              <w:jc w:val="both"/>
+              <w:jc w:val="left"/>
             </w:pPr>
             <w:r>
               <w:rPr>
@@ -8286,7 +8282,7 @@
           <w:p>
             <w:pPr>
               <w:spacing w:after="40"/>
-              <w:jc w:val="both"/>
+              <w:jc w:val="left"/>
             </w:pPr>
             <w:r>
               <w:rPr>
@@ -8311,7 +8307,7 @@
           <w:p>
             <w:pPr>
               <w:spacing w:after="40"/>
-              <w:jc w:val="both"/>
+              <w:jc w:val="left"/>
             </w:pPr>
             <w:r>
               <w:rPr>
@@ -8355,7 +8351,7 @@
           <w:p>
             <w:pPr>
               <w:spacing w:after="40"/>
-              <w:jc w:val="both"/>
+              <w:jc w:val="left"/>
             </w:pPr>
             <w:r>
               <w:rPr>
@@ -8380,7 +8376,7 @@
           <w:p>
             <w:pPr>
               <w:spacing w:after="40"/>
-              <w:jc w:val="both"/>
+              <w:jc w:val="left"/>
             </w:pPr>
             <w:r>
               <w:rPr>
@@ -8405,7 +8401,7 @@
           <w:p>
             <w:pPr>
               <w:spacing w:after="40"/>
-              <w:jc w:val="both"/>
+              <w:jc w:val="left"/>
             </w:pPr>
             <w:r>
               <w:rPr>
@@ -8476,6 +8472,8 @@
     </w:p>
     <w:p>
       <w:pPr>
+        <w:keepNext w:val="false"/>
+        <w:keepLines/>
         <w:spacing w:after="120" w:line="276"/>
         <w:ind w:firstLine="709"/>
         <w:jc w:val="both"/>
@@ -8492,9 +8490,11 @@
     <w:p>
       <w:pPr>
         <w:pStyle w:val="ListParagraph"/>
+        <w:keepNext w:val="false"/>
+        <w:keepLines/>
         <w:numPr>
           <w:ilvl w:val="0"/>
-          <w:numId w:val="18"/>
+          <w:numId w:val="17"/>
         </w:numPr>
         <w:spacing w:after="120" w:line="276"/>
         <w:jc w:val="both"/>
@@ -8511,9 +8511,11 @@
     <w:p>
       <w:pPr>
         <w:pStyle w:val="ListParagraph"/>
+        <w:keepNext w:val="false"/>
+        <w:keepLines/>
         <w:numPr>
           <w:ilvl w:val="0"/>
-          <w:numId w:val="18"/>
+          <w:numId w:val="17"/>
         </w:numPr>
         <w:spacing w:after="120" w:line="276"/>
         <w:jc w:val="both"/>
@@ -8530,9 +8532,11 @@
     <w:p>
       <w:pPr>
         <w:pStyle w:val="ListParagraph"/>
+        <w:keepNext w:val="false"/>
+        <w:keepLines/>
         <w:numPr>
           <w:ilvl w:val="0"/>
-          <w:numId w:val="18"/>
+          <w:numId w:val="17"/>
         </w:numPr>
         <w:spacing w:after="120" w:line="276"/>
         <w:jc w:val="both"/>
@@ -8549,9 +8553,11 @@
     <w:p>
       <w:pPr>
         <w:pStyle w:val="ListParagraph"/>
+        <w:keepNext w:val="false"/>
+        <w:keepLines/>
         <w:numPr>
           <w:ilvl w:val="0"/>
-          <w:numId w:val="18"/>
+          <w:numId w:val="17"/>
         </w:numPr>
         <w:spacing w:after="120" w:line="276"/>
         <w:jc w:val="both"/>
@@ -8567,6 +8573,8 @@
     </w:p>
     <w:p>
       <w:pPr>
+        <w:keepNext w:val="false"/>
+        <w:keepLines/>
         <w:spacing w:after="120" w:line="276"/>
         <w:ind w:firstLine="709"/>
         <w:jc w:val="both"/>
@@ -8582,6 +8590,8 @@
     </w:p>
     <w:p>
       <w:pPr>
+        <w:keepNext/>
+        <w:keepLines/>
         <w:spacing w:after="200" w:line="276"/>
         <w:ind w:firstLine="709"/>
         <w:jc w:val="both"/>
@@ -8612,6 +8622,9 @@
         <w:gridCol w:w="3061"/>
       </w:tblGrid>
       <w:tr>
+        <w:trPr>
+          <w:cantSplit/>
+        </w:trPr>
         <w:tc>
           <w:tcPr>
             <w:tcW w:type="dxa" w:w="5896"/>
@@ -8707,7 +8720,7 @@
         <w:pStyle w:val="ListParagraph"/>
         <w:numPr>
           <w:ilvl w:val="0"/>
-          <w:numId w:val="19"/>
+          <w:numId w:val="18"/>
         </w:numPr>
         <w:spacing w:line="276"/>
         <w:jc w:val="both"/>
@@ -8722,27 +8735,8 @@
       </w:r>
     </w:p>
     <w:p>
-      <w:r>
-        <w:br w:type="page"/>
-      </w:r>
-    </w:p>
-    <w:p>
-      <w:pPr>
-        <w:spacing w:after="60"/>
-        <w:jc w:val="right"/>
-      </w:pPr>
-      <w:r>
-        <w:rPr>
-          <w:rFonts w:ascii="Arial" w:cs="Arial" w:eastAsia="Arial" w:hAnsi="Arial"/>
-          <w:color w:val="808080"/>
-          <w:sz w:val="16"/>
-          <w:szCs w:val="16"/>
-        </w:rPr>
-        <w:t xml:space="preserve">Konsep Surat 8</w:t>
-      </w:r>
-    </w:p>
-    <w:p>
-      <w:pPr>
+      <w:pPr>
+        <w:pageBreakBefore/>
         <w:ind w:left="1418"/>
         <w:jc w:val="center"/>
       </w:pPr>
@@ -8911,7 +8905,7 @@
           <w:p>
             <w:pPr>
               <w:spacing w:after="40"/>
-              <w:jc w:val="both"/>
+              <w:jc w:val="left"/>
             </w:pPr>
             <w:r>
               <w:rPr>
@@ -8936,7 +8930,7 @@
           <w:p>
             <w:pPr>
               <w:spacing w:after="40"/>
-              <w:jc w:val="both"/>
+              <w:jc w:val="left"/>
             </w:pPr>
             <w:r>
               <w:rPr>
@@ -8961,7 +8955,7 @@
           <w:p>
             <w:pPr>
               <w:spacing w:after="40"/>
-              <w:jc w:val="both"/>
+              <w:jc w:val="left"/>
             </w:pPr>
             <w:r>
               <w:rPr>
@@ -9013,7 +9007,7 @@
           <w:p>
             <w:pPr>
               <w:spacing w:after="40"/>
-              <w:jc w:val="both"/>
+              <w:jc w:val="left"/>
             </w:pPr>
             <w:r>
               <w:rPr>
@@ -9038,7 +9032,7 @@
           <w:p>
             <w:pPr>
               <w:spacing w:after="40"/>
-              <w:jc w:val="both"/>
+              <w:jc w:val="left"/>
             </w:pPr>
             <w:r>
               <w:rPr>
@@ -9063,7 +9057,7 @@
           <w:p>
             <w:pPr>
               <w:spacing w:after="40"/>
-              <w:jc w:val="both"/>
+              <w:jc w:val="left"/>
             </w:pPr>
             <w:r>
               <w:rPr>
@@ -9107,7 +9101,7 @@
           <w:p>
             <w:pPr>
               <w:spacing w:after="40"/>
-              <w:jc w:val="both"/>
+              <w:jc w:val="left"/>
             </w:pPr>
             <w:r>
               <w:rPr>
@@ -9132,7 +9126,7 @@
           <w:p>
             <w:pPr>
               <w:spacing w:after="40"/>
-              <w:jc w:val="both"/>
+              <w:jc w:val="left"/>
             </w:pPr>
             <w:r>
               <w:rPr>
@@ -9157,7 +9151,7 @@
           <w:p>
             <w:pPr>
               <w:spacing w:after="40"/>
-              <w:jc w:val="both"/>
+              <w:jc w:val="left"/>
             </w:pPr>
             <w:r>
               <w:rPr>
@@ -9201,7 +9195,7 @@
           <w:p>
             <w:pPr>
               <w:spacing w:after="40"/>
-              <w:jc w:val="both"/>
+              <w:jc w:val="left"/>
             </w:pPr>
             <w:r>
               <w:rPr>
@@ -9226,7 +9220,7 @@
           <w:p>
             <w:pPr>
               <w:spacing w:after="40"/>
-              <w:jc w:val="both"/>
+              <w:jc w:val="left"/>
             </w:pPr>
             <w:r>
               <w:rPr>
@@ -9251,7 +9245,7 @@
           <w:p>
             <w:pPr>
               <w:spacing w:after="40"/>
-              <w:jc w:val="both"/>
+              <w:jc w:val="left"/>
             </w:pPr>
             <w:r>
               <w:rPr>
@@ -9364,6 +9358,8 @@
     </w:p>
     <w:p>
       <w:pPr>
+        <w:keepNext w:val="false"/>
+        <w:keepLines/>
         <w:spacing w:after="120" w:line="276"/>
         <w:ind w:firstLine="709"/>
         <w:jc w:val="both"/>
@@ -9380,6 +9376,109 @@
     <w:p>
       <w:pPr>
         <w:pStyle w:val="ListParagraph"/>
+        <w:keepNext w:val="false"/>
+        <w:keepLines/>
+        <w:numPr>
+          <w:ilvl w:val="0"/>
+          <w:numId w:val="19"/>
+        </w:numPr>
+        <w:spacing w:after="120" w:line="276"/>
+        <w:jc w:val="both"/>
+      </w:pPr>
+      <w:r>
+        <w:rPr>
+          <w:rFonts w:ascii="Arial" w:cs="Arial" w:eastAsia="Arial" w:hAnsi="Arial"/>
+          <w:sz w:val="22"/>
+          <w:szCs w:val="22"/>
+        </w:rPr>
+        <w:t xml:space="preserve">Bahwa sejak putusan pernyataan pailit diucapkan, Debitor demi hukum kehilangan haknya untuk menguasai dan mengurus kekayaannya yang termasuk dalam harta pailit (Pasal 24 ayat (1) Undang-Undang Nomor 37 Tahun 2004), dan kepailitan meliputi segala sesuatu yang diperoleh selama kepailitan (Pasal 21);</w:t>
+      </w:r>
+    </w:p>
+    <w:p>
+      <w:pPr>
+        <w:pStyle w:val="ListParagraph"/>
+        <w:keepNext w:val="false"/>
+        <w:keepLines/>
+        <w:numPr>
+          <w:ilvl w:val="0"/>
+          <w:numId w:val="19"/>
+        </w:numPr>
+        <w:spacing w:after="120" w:line="276"/>
+        <w:jc w:val="both"/>
+      </w:pPr>
+      <w:r>
+        <w:rPr>
+          <w:rFonts w:ascii="Arial" w:cs="Arial" w:eastAsia="Arial" w:hAnsi="Arial"/>
+          <w:sz w:val="22"/>
+          <w:szCs w:val="22"/>
+        </w:rPr>
+        <w:t xml:space="preserve">Bahwa hasil panen kelapa sawit maupun uang kontrak panen atas kebun eks HGU Nomor 2/Sei Tampa yang diterima sejak tanggal 10 April 2023 merupakan bagian dari harta pailit yang wajib diserahkan kepada Kurator;</w:t>
+      </w:r>
+    </w:p>
+    <w:p>
+      <w:pPr>
+        <w:pStyle w:val="ListParagraph"/>
+        <w:keepNext w:val="false"/>
+        <w:keepLines/>
+        <w:numPr>
+          <w:ilvl w:val="0"/>
+          <w:numId w:val="19"/>
+        </w:numPr>
+        <w:spacing w:after="120" w:line="276"/>
+        <w:jc w:val="both"/>
+      </w:pPr>
+      <w:r>
+        <w:rPr>
+          <w:rFonts w:ascii="Arial" w:cs="Arial" w:eastAsia="Arial" w:hAnsi="Arial"/>
+          <w:sz w:val="22"/>
+          <w:szCs w:val="22"/>
+        </w:rPr>
+        <w:t xml:space="preserve">Bahwa setiap perjanjian pengusahaan atau panen yang dibuat Debitor setelah tanggal 10 April 2023 tidak mengikat harta pailit;</w:t>
+      </w:r>
+    </w:p>
+    <w:p>
+      <w:pPr>
+        <w:pStyle w:val="ListParagraph"/>
+        <w:keepNext w:val="false"/>
+        <w:keepLines/>
+        <w:numPr>
+          <w:ilvl w:val="0"/>
+          <w:numId w:val="19"/>
+        </w:numPr>
+        <w:spacing w:after="120" w:line="276"/>
+        <w:jc w:val="both"/>
+      </w:pPr>
+      <w:r>
+        <w:rPr>
+          <w:rFonts w:ascii="Arial" w:cs="Arial" w:eastAsia="Arial" w:hAnsi="Arial"/>
+          <w:sz w:val="22"/>
+          <w:szCs w:val="22"/>
+        </w:rPr>
+        <w:t xml:space="preserve">Bahwa sampai dengan saat ini belum ada hasil kebun yang diserahkan kepada Kurator.</w:t>
+      </w:r>
+    </w:p>
+    <w:p>
+      <w:pPr>
+        <w:keepNext w:val="false"/>
+        <w:keepLines/>
+        <w:spacing w:after="120" w:line="276"/>
+        <w:ind w:firstLine="709"/>
+        <w:jc w:val="both"/>
+      </w:pPr>
+      <w:r>
+        <w:rPr>
+          <w:rFonts w:ascii="Arial" w:cs="Arial" w:eastAsia="Arial" w:hAnsi="Arial"/>
+          <w:sz w:val="22"/>
+          <w:szCs w:val="22"/>
+        </w:rPr>
+        <w:t xml:space="preserve">Sehubungan dengan hal tersebut, dengan ini Kurator memerintahkan Saudara untuk, dalam waktu 14 (empat belas) hari kalender sejak surat ini diterima:</w:t>
+      </w:r>
+    </w:p>
+    <w:p>
+      <w:pPr>
+        <w:pStyle w:val="ListParagraph"/>
+        <w:keepNext w:val="false"/>
+        <w:keepLines/>
         <w:numPr>
           <w:ilvl w:val="0"/>
           <w:numId w:val="20"/>
@@ -9393,12 +9492,14 @@
           <w:sz w:val="22"/>
           <w:szCs w:val="22"/>
         </w:rPr>
-        <w:t xml:space="preserve">Bahwa sejak putusan pernyataan pailit diucapkan, Debitor demi hukum kehilangan haknya untuk menguasai dan mengurus kekayaannya yang termasuk dalam harta pailit (Pasal 24 ayat (1) Undang-Undang Nomor 37 Tahun 2004), dan kepailitan meliputi segala sesuatu yang diperoleh selama kepailitan (Pasal 21);</w:t>
+        <w:t xml:space="preserve">menyerahkan kepada Kurator rincian seluruh hasil panen dan uang kontrak yang diterima sejak tanggal 10 April 2023, berikut salinan perjanjian dan bukti penerimaannya;</w:t>
       </w:r>
     </w:p>
     <w:p>
       <w:pPr>
         <w:pStyle w:val="ListParagraph"/>
+        <w:keepNext w:val="false"/>
+        <w:keepLines/>
         <w:numPr>
           <w:ilvl w:val="0"/>
           <w:numId w:val="20"/>
@@ -9412,12 +9513,14 @@
           <w:sz w:val="22"/>
           <w:szCs w:val="22"/>
         </w:rPr>
-        <w:t xml:space="preserve">Bahwa hasil panen kelapa sawit maupun uang kontrak panen atas kebun eks HGU Nomor 2/Sei Tampa yang diterima sejak tanggal 10 April 2023 merupakan bagian dari harta pailit yang wajib diserahkan kepada Kurator;</w:t>
+        <w:t xml:space="preserve">menyetorkan jumlah tersebut ke rekening harta pailit PT Rata Makmur (Dalam Pailit) Nomor …………………… pada Bank ……………………; dan</w:t>
       </w:r>
     </w:p>
     <w:p>
       <w:pPr>
         <w:pStyle w:val="ListParagraph"/>
+        <w:keepNext w:val="false"/>
+        <w:keepLines/>
         <w:numPr>
           <w:ilvl w:val="0"/>
           <w:numId w:val="20"/>
@@ -9431,101 +9534,13 @@
           <w:sz w:val="22"/>
           <w:szCs w:val="22"/>
         </w:rPr>
-        <w:t xml:space="preserve">Bahwa setiap perjanjian pengusahaan atau panen yang dibuat Debitor setelah tanggal 10 April 2023 tidak mengikat harta pailit;</w:t>
-      </w:r>
-    </w:p>
-    <w:p>
-      <w:pPr>
-        <w:pStyle w:val="ListParagraph"/>
-        <w:numPr>
-          <w:ilvl w:val="0"/>
-          <w:numId w:val="20"/>
-        </w:numPr>
-        <w:spacing w:after="120" w:line="276"/>
-        <w:jc w:val="both"/>
-      </w:pPr>
-      <w:r>
-        <w:rPr>
-          <w:rFonts w:ascii="Arial" w:cs="Arial" w:eastAsia="Arial" w:hAnsi="Arial"/>
-          <w:sz w:val="22"/>
-          <w:szCs w:val="22"/>
-        </w:rPr>
-        <w:t xml:space="preserve">Bahwa sampai dengan saat ini belum ada hasil kebun yang diserahkan kepada Kurator.</w:t>
-      </w:r>
-    </w:p>
-    <w:p>
-      <w:pPr>
-        <w:spacing w:after="120" w:before="0" w:line="276"/>
-        <w:jc w:val="left"/>
-      </w:pPr>
-      <w:r>
-        <w:rPr>
-          <w:rFonts w:ascii="Arial" w:cs="Arial" w:eastAsia="Arial" w:hAnsi="Arial"/>
-          <w:sz w:val="22"/>
-          <w:szCs w:val="22"/>
-        </w:rPr>
-        <w:t xml:space="preserve">Sehubungan dengan hal tersebut, dengan ini Kurator memerintahkan Saudara untuk, dalam waktu 14 (empat belas) hari kalender sejak surat ini diterima:</w:t>
-      </w:r>
-    </w:p>
-    <w:p>
-      <w:pPr>
-        <w:pStyle w:val="ListParagraph"/>
-        <w:numPr>
-          <w:ilvl w:val="0"/>
-          <w:numId w:val="21"/>
-        </w:numPr>
-        <w:spacing w:after="120" w:line="276"/>
-        <w:jc w:val="both"/>
-      </w:pPr>
-      <w:r>
-        <w:rPr>
-          <w:rFonts w:ascii="Arial" w:cs="Arial" w:eastAsia="Arial" w:hAnsi="Arial"/>
-          <w:sz w:val="22"/>
-          <w:szCs w:val="22"/>
-        </w:rPr>
-        <w:t xml:space="preserve">menyerahkan kepada Kurator rincian seluruh hasil panen dan uang kontrak yang diterima sejak tanggal 10 April 2023, berikut salinan perjanjian dan bukti penerimaannya;</w:t>
-      </w:r>
-    </w:p>
-    <w:p>
-      <w:pPr>
-        <w:pStyle w:val="ListParagraph"/>
-        <w:numPr>
-          <w:ilvl w:val="0"/>
-          <w:numId w:val="21"/>
-        </w:numPr>
-        <w:spacing w:after="120" w:line="276"/>
-        <w:jc w:val="both"/>
-      </w:pPr>
-      <w:r>
-        <w:rPr>
-          <w:rFonts w:ascii="Arial" w:cs="Arial" w:eastAsia="Arial" w:hAnsi="Arial"/>
-          <w:sz w:val="22"/>
-          <w:szCs w:val="22"/>
-        </w:rPr>
-        <w:t xml:space="preserve">menyetorkan jumlah tersebut ke rekening harta pailit PT Rata Makmur (Dalam Pailit) Nomor …………………… pada Bank ……………………; dan</w:t>
-      </w:r>
-    </w:p>
-    <w:p>
-      <w:pPr>
-        <w:pStyle w:val="ListParagraph"/>
-        <w:numPr>
-          <w:ilvl w:val="0"/>
-          <w:numId w:val="21"/>
-        </w:numPr>
-        <w:spacing w:after="120" w:line="276"/>
-        <w:jc w:val="both"/>
-      </w:pPr>
-      <w:r>
-        <w:rPr>
-          <w:rFonts w:ascii="Arial" w:cs="Arial" w:eastAsia="Arial" w:hAnsi="Arial"/>
-          <w:sz w:val="22"/>
-          <w:szCs w:val="22"/>
-        </w:rPr>
         <w:t xml:space="preserve">menyerahkan kunci serta dokumen bangunan milik PT Rata Makmur di lokasi kebun kepada Kurator.</w:t>
       </w:r>
     </w:p>
     <w:p>
       <w:pPr>
+        <w:keepNext/>
+        <w:keepLines/>
         <w:spacing w:after="120" w:line="276"/>
         <w:ind w:firstLine="709"/>
         <w:jc w:val="both"/>
@@ -9541,6 +9556,8 @@
     </w:p>
     <w:p>
       <w:pPr>
+        <w:keepNext/>
+        <w:keepLines/>
         <w:spacing w:after="200" w:line="276"/>
         <w:ind w:firstLine="709"/>
         <w:jc w:val="both"/>
@@ -9571,6 +9588,9 @@
         <w:gridCol w:w="3061"/>
       </w:tblGrid>
       <w:tr>
+        <w:trPr>
+          <w:cantSplit/>
+        </w:trPr>
         <w:tc>
           <w:tcPr>
             <w:tcW w:type="dxa" w:w="5896"/>
@@ -9666,7 +9686,7 @@
         <w:pStyle w:val="ListParagraph"/>
         <w:numPr>
           <w:ilvl w:val="0"/>
-          <w:numId w:val="22"/>
+          <w:numId w:val="21"/>
         </w:numPr>
         <w:spacing w:line="276"/>
         <w:jc w:val="both"/>
@@ -9685,7 +9705,7 @@
         <w:pStyle w:val="ListParagraph"/>
         <w:numPr>
           <w:ilvl w:val="0"/>
-          <w:numId w:val="22"/>
+          <w:numId w:val="21"/>
         </w:numPr>
         <w:spacing w:line="276"/>
         <w:jc w:val="both"/>
@@ -9700,27 +9720,8 @@
       </w:r>
     </w:p>
     <w:p>
-      <w:r>
-        <w:br w:type="page"/>
-      </w:r>
-    </w:p>
-    <w:p>
-      <w:pPr>
-        <w:spacing w:after="60"/>
-        <w:jc w:val="right"/>
-      </w:pPr>
-      <w:r>
-        <w:rPr>
-          <w:rFonts w:ascii="Arial" w:cs="Arial" w:eastAsia="Arial" w:hAnsi="Arial"/>
-          <w:color w:val="808080"/>
-          <w:sz w:val="16"/>
-          <w:szCs w:val="16"/>
-        </w:rPr>
-        <w:t xml:space="preserve">Konsep Surat 9 (Pengumuman)</w:t>
-      </w:r>
-    </w:p>
-    <w:p>
-      <w:pPr>
+      <w:pPr>
+        <w:pageBreakBefore/>
         <w:ind w:left="1418"/>
         <w:jc w:val="center"/>
       </w:pPr>
@@ -9921,6 +9922,8 @@
     </w:p>
     <w:p>
       <w:pPr>
+        <w:keepNext w:val="false"/>
+        <w:keepLines/>
         <w:spacing w:after="120" w:line="276"/>
         <w:ind w:firstLine="709"/>
         <w:jc w:val="both"/>
@@ -9937,9 +9940,11 @@
     <w:p>
       <w:pPr>
         <w:pStyle w:val="ListParagraph"/>
+        <w:keepNext w:val="false"/>
+        <w:keepLines/>
         <w:numPr>
           <w:ilvl w:val="0"/>
-          <w:numId w:val="23"/>
+          <w:numId w:val="22"/>
         </w:numPr>
         <w:spacing w:after="120" w:line="276"/>
         <w:jc w:val="both"/>
@@ -9956,9 +9961,11 @@
     <w:p>
       <w:pPr>
         <w:pStyle w:val="ListParagraph"/>
+        <w:keepNext w:val="false"/>
+        <w:keepLines/>
         <w:numPr>
           <w:ilvl w:val="0"/>
-          <w:numId w:val="23"/>
+          <w:numId w:val="22"/>
         </w:numPr>
         <w:spacing w:after="120" w:line="276"/>
         <w:jc w:val="both"/>
@@ -9993,9 +10000,11 @@
     <w:p>
       <w:pPr>
         <w:pStyle w:val="ListParagraph"/>
+        <w:keepNext w:val="false"/>
+        <w:keepLines/>
         <w:numPr>
           <w:ilvl w:val="0"/>
-          <w:numId w:val="23"/>
+          <w:numId w:val="22"/>
         </w:numPr>
         <w:spacing w:after="120" w:line="276"/>
         <w:jc w:val="both"/>
@@ -10012,9 +10021,11 @@
     <w:p>
       <w:pPr>
         <w:pStyle w:val="ListParagraph"/>
+        <w:keepNext w:val="false"/>
+        <w:keepLines/>
         <w:numPr>
           <w:ilvl w:val="0"/>
-          <w:numId w:val="23"/>
+          <w:numId w:val="22"/>
         </w:numPr>
         <w:spacing w:after="120" w:line="276"/>
         <w:jc w:val="both"/>
@@ -10031,9 +10042,11 @@
     <w:p>
       <w:pPr>
         <w:pStyle w:val="ListParagraph"/>
+        <w:keepNext w:val="false"/>
+        <w:keepLines/>
         <w:numPr>
           <w:ilvl w:val="0"/>
-          <w:numId w:val="23"/>
+          <w:numId w:val="22"/>
         </w:numPr>
         <w:spacing w:after="120" w:line="276"/>
         <w:jc w:val="both"/>
@@ -10050,9 +10063,11 @@
     <w:p>
       <w:pPr>
         <w:pStyle w:val="ListParagraph"/>
+        <w:keepNext w:val="false"/>
+        <w:keepLines/>
         <w:numPr>
           <w:ilvl w:val="0"/>
-          <w:numId w:val="23"/>
+          <w:numId w:val="22"/>
         </w:numPr>
         <w:spacing w:after="120" w:line="276"/>
         <w:jc w:val="both"/>
@@ -10069,9 +10084,11 @@
     <w:p>
       <w:pPr>
         <w:pStyle w:val="ListParagraph"/>
+        <w:keepNext w:val="false"/>
+        <w:keepLines/>
         <w:numPr>
           <w:ilvl w:val="0"/>
-          <w:numId w:val="23"/>
+          <w:numId w:val="22"/>
         </w:numPr>
         <w:spacing w:after="120" w:line="276"/>
         <w:jc w:val="both"/>
@@ -10089,21 +10106,6 @@
       <w:pPr>
         <w:spacing w:after="0"/>
       </w:pPr>
-    </w:p>
-    <w:p>
-      <w:pPr>
-        <w:spacing w:after="0" w:before="0" w:line="276"/>
-        <w:ind w:left="5896"/>
-        <w:jc w:val="left"/>
-      </w:pPr>
-      <w:r>
-        <w:rPr>
-          <w:rFonts w:ascii="Arial" w:cs="Arial" w:eastAsia="Arial" w:hAnsi="Arial"/>
-          <w:sz w:val="22"/>
-          <w:szCs w:val="22"/>
-        </w:rPr>
-        <w:t xml:space="preserve">Medan, ……………… 20…</w:t>
-      </w:r>
     </w:p>
     <w:tbl>
       <w:tblPr>
@@ -10122,6 +10124,9 @@
         <w:gridCol w:w="3061"/>
       </w:tblGrid>
       <w:tr>
+        <w:trPr>
+          <w:cantSplit/>
+        </w:trPr>
         <w:tc>
           <w:tcPr>
             <w:tcW w:type="dxa" w:w="5896"/>
@@ -10148,6 +10153,20 @@
               <w:right w:val="none" w:color="FFFFFF" w:sz="0"/>
             </w:tcBorders>
           </w:tcPr>
+          <w:p>
+            <w:pPr>
+              <w:spacing w:after="0" w:before="0" w:line="276"/>
+              <w:jc w:val="left"/>
+            </w:pPr>
+            <w:r>
+              <w:rPr>
+                <w:rFonts w:ascii="Arial" w:cs="Arial" w:eastAsia="Arial" w:hAnsi="Arial"/>
+                <w:sz w:val="22"/>
+                <w:szCs w:val="22"/>
+              </w:rPr>
+              <w:t xml:space="preserve">Medan, ……………… 20…</w:t>
+            </w:r>
+          </w:p>
           <w:p>
             <w:pPr>
               <w:spacing w:after="0" w:before="0" w:line="276"/>
@@ -10196,55 +10215,7 @@
     </w:tbl>
     <w:p>
       <w:pPr>
-        <w:spacing w:after="0"/>
-      </w:pPr>
-    </w:p>
-    <w:p>
-      <w:pPr>
-        <w:spacing w:after="0" w:before="0" w:line="276"/>
-        <w:jc w:val="left"/>
-      </w:pPr>
-      <w:r>
-        <w:rPr>
-          <w:rFonts w:ascii="Arial" w:cs="Arial" w:eastAsia="Arial" w:hAnsi="Arial"/>
-          <w:b/>
-          <w:bCs/>
-          <w:sz w:val="18"/>
-          <w:szCs w:val="18"/>
-        </w:rPr>
-        <w:t xml:space="preserve">Catatan untuk surat undangan kepada peminat.</w:t>
-      </w:r>
-      <w:r>
-        <w:rPr>
-          <w:rFonts w:ascii="Arial" w:cs="Arial" w:eastAsia="Arial" w:hAnsi="Arial"/>
-          <w:sz w:val="18"/>
-          <w:szCs w:val="18"/>
-        </w:rPr>
-        <w:t xml:space="preserve"> Pengumuman ini dikirim dengan surat pengantar kepada peminat yang telah diketahui, antara lain PT Raya Padang Langkat (surat minat tanggal 22 Agustus 2024), dengan hal "Undangan Mengikuti Penawaran Terbuka Hak Keperdataan Harta Pailit PT Rata Makmur (Dalam Pailit)". Isi surat pengantar cukup merujuk pengumuman ini dan melampirkannya.</w:t>
-      </w:r>
-    </w:p>
-    <w:p>
-      <w:r>
-        <w:br w:type="page"/>
-      </w:r>
-    </w:p>
-    <w:p>
-      <w:pPr>
-        <w:spacing w:after="60"/>
-        <w:jc w:val="right"/>
-      </w:pPr>
-      <w:r>
-        <w:rPr>
-          <w:rFonts w:ascii="Arial" w:cs="Arial" w:eastAsia="Arial" w:hAnsi="Arial"/>
-          <w:color w:val="808080"/>
-          <w:sz w:val="16"/>
-          <w:szCs w:val="16"/>
-        </w:rPr>
-        <w:t xml:space="preserve">Konsep Surat 10</w:t>
-      </w:r>
-    </w:p>
-    <w:p>
-      <w:pPr>
+        <w:pageBreakBefore/>
         <w:ind w:left="1418"/>
         <w:jc w:val="center"/>
       </w:pPr>
@@ -10413,7 +10384,7 @@
           <w:p>
             <w:pPr>
               <w:spacing w:after="40"/>
-              <w:jc w:val="both"/>
+              <w:jc w:val="left"/>
             </w:pPr>
             <w:r>
               <w:rPr>
@@ -10438,7 +10409,7 @@
           <w:p>
             <w:pPr>
               <w:spacing w:after="40"/>
-              <w:jc w:val="both"/>
+              <w:jc w:val="left"/>
             </w:pPr>
             <w:r>
               <w:rPr>
@@ -10463,7 +10434,7 @@
           <w:p>
             <w:pPr>
               <w:spacing w:after="40"/>
-              <w:jc w:val="both"/>
+              <w:jc w:val="left"/>
             </w:pPr>
             <w:r>
               <w:rPr>
@@ -10515,7 +10486,7 @@
           <w:p>
             <w:pPr>
               <w:spacing w:after="40"/>
-              <w:jc w:val="both"/>
+              <w:jc w:val="left"/>
             </w:pPr>
             <w:r>
               <w:rPr>
@@ -10540,7 +10511,7 @@
           <w:p>
             <w:pPr>
               <w:spacing w:after="40"/>
-              <w:jc w:val="both"/>
+              <w:jc w:val="left"/>
             </w:pPr>
             <w:r>
               <w:rPr>
@@ -10565,7 +10536,7 @@
           <w:p>
             <w:pPr>
               <w:spacing w:after="40"/>
-              <w:jc w:val="both"/>
+              <w:jc w:val="left"/>
             </w:pPr>
             <w:r>
               <w:rPr>
@@ -10609,7 +10580,7 @@
           <w:p>
             <w:pPr>
               <w:spacing w:after="40"/>
-              <w:jc w:val="both"/>
+              <w:jc w:val="left"/>
             </w:pPr>
             <w:r>
               <w:rPr>
@@ -10634,7 +10605,7 @@
           <w:p>
             <w:pPr>
               <w:spacing w:after="40"/>
-              <w:jc w:val="both"/>
+              <w:jc w:val="left"/>
             </w:pPr>
             <w:r>
               <w:rPr>
@@ -10659,7 +10630,7 @@
           <w:p>
             <w:pPr>
               <w:spacing w:after="40"/>
-              <w:jc w:val="both"/>
+              <w:jc w:val="left"/>
             </w:pPr>
             <w:r>
               <w:rPr>
@@ -10703,7 +10674,7 @@
           <w:p>
             <w:pPr>
               <w:spacing w:after="40"/>
-              <w:jc w:val="both"/>
+              <w:jc w:val="left"/>
             </w:pPr>
             <w:r>
               <w:rPr>
@@ -10728,7 +10699,7 @@
           <w:p>
             <w:pPr>
               <w:spacing w:after="40"/>
-              <w:jc w:val="both"/>
+              <w:jc w:val="left"/>
             </w:pPr>
             <w:r>
               <w:rPr>
@@ -10753,7 +10724,7 @@
           <w:p>
             <w:pPr>
               <w:spacing w:after="40"/>
-              <w:jc w:val="both"/>
+              <w:jc w:val="left"/>
             </w:pPr>
             <w:r>
               <w:rPr>
@@ -10852,6 +10823,8 @@
     </w:p>
     <w:p>
       <w:pPr>
+        <w:keepNext w:val="false"/>
+        <w:keepLines/>
         <w:spacing w:after="120" w:line="276"/>
         <w:ind w:firstLine="709"/>
         <w:jc w:val="both"/>
@@ -10868,6 +10841,189 @@
     <w:p>
       <w:pPr>
         <w:pStyle w:val="ListParagraph"/>
+        <w:keepNext w:val="false"/>
+        <w:keepLines/>
+        <w:numPr>
+          <w:ilvl w:val="0"/>
+          <w:numId w:val="23"/>
+        </w:numPr>
+        <w:spacing w:after="120" w:line="276"/>
+        <w:jc w:val="both"/>
+      </w:pPr>
+      <w:r>
+        <w:rPr>
+          <w:rFonts w:ascii="Arial" w:cs="Arial" w:eastAsia="Arial" w:hAnsi="Arial"/>
+          <w:sz w:val="22"/>
+          <w:szCs w:val="22"/>
+        </w:rPr>
+        <w:t xml:space="preserve">Bahwa penyegelan dan inventarisasi harta pailit telah dilaksanakan pada tanggal ……………, sebagaimana Berita Acara Penyegelan dan Berita Acara Inventarisasi terlampir;</w:t>
+      </w:r>
+    </w:p>
+    <w:p>
+      <w:pPr>
+        <w:pStyle w:val="ListParagraph"/>
+        <w:keepNext w:val="false"/>
+        <w:keepLines/>
+        <w:numPr>
+          <w:ilvl w:val="0"/>
+          <w:numId w:val="23"/>
+        </w:numPr>
+        <w:spacing w:after="120" w:line="276"/>
+        <w:jc w:val="both"/>
+      </w:pPr>
+      <w:r>
+        <w:rPr>
+          <w:rFonts w:ascii="Arial" w:cs="Arial" w:eastAsia="Arial" w:hAnsi="Arial"/>
+          <w:sz w:val="22"/>
+          <w:szCs w:val="22"/>
+        </w:rPr>
+        <w:t xml:space="preserve">Bahwa KJPP …………………… telah menyampaikan laporan penilaian tanggal ……………, dengan nilai wajar paket sebesar Rp…………………… dan nilai likuidasi sebesar Rp……………………;</w:t>
+      </w:r>
+    </w:p>
+    <w:p>
+      <w:pPr>
+        <w:pStyle w:val="ListParagraph"/>
+        <w:keepNext w:val="false"/>
+        <w:keepLines/>
+        <w:numPr>
+          <w:ilvl w:val="0"/>
+          <w:numId w:val="23"/>
+        </w:numPr>
+        <w:spacing w:after="120" w:line="276"/>
+        <w:jc w:val="both"/>
+      </w:pPr>
+      <w:r>
+        <w:rPr>
+          <w:rFonts w:ascii="Arial" w:cs="Arial" w:eastAsia="Arial" w:hAnsi="Arial"/>
+          <w:sz w:val="22"/>
+          <w:szCs w:val="22"/>
+        </w:rPr>
+        <w:t xml:space="preserve">Bahwa Kurator telah mengumumkan penawaran terbuka pada tanggal …………… dan menerima …… penawaran. Penawar terbaik adalah …………………… dengan harga Rp……………………, yang telah menyatakan tidak terafiliasi dengan Debitor, direksi, maupun pihak yang mengusahakan kebun;</w:t>
+      </w:r>
+    </w:p>
+    <w:p>
+      <w:pPr>
+        <w:pStyle w:val="ListParagraph"/>
+        <w:keepNext w:val="false"/>
+        <w:keepLines/>
+        <w:numPr>
+          <w:ilvl w:val="0"/>
+          <w:numId w:val="23"/>
+        </w:numPr>
+        <w:spacing w:after="120" w:line="276"/>
+        <w:jc w:val="both"/>
+      </w:pPr>
+      <w:r>
+        <w:rPr>
+          <w:rFonts w:ascii="Arial" w:cs="Arial" w:eastAsia="Arial" w:hAnsi="Arial"/>
+          <w:sz w:val="22"/>
+          <w:szCs w:val="22"/>
+        </w:rPr>
+        <w:t xml:space="preserve">Bahwa objek yang ditawarkan berupa hak atas ganti rugi, hak menagih hasil kebun, serta bangunan dan benda yang berdiri di atas tanah negara, tidak dapat dijual secara terpisah melalui lelang tanpa kehilangan nilainya, karena nilai hak-hak tersebut hanya dapat direalisasikan oleh pihak yang akan mengusahakan tanah tersebut;</w:t>
+      </w:r>
+    </w:p>
+    <w:p>
+      <w:pPr>
+        <w:pStyle w:val="ListParagraph"/>
+        <w:keepNext w:val="false"/>
+        <w:keepLines/>
+        <w:numPr>
+          <w:ilvl w:val="0"/>
+          <w:numId w:val="23"/>
+        </w:numPr>
+        <w:spacing w:after="120" w:line="276"/>
+        <w:jc w:val="both"/>
+      </w:pPr>
+      <w:r>
+        <w:rPr>
+          <w:rFonts w:ascii="Arial" w:cs="Arial" w:eastAsia="Arial" w:hAnsi="Arial"/>
+          <w:sz w:val="22"/>
+          <w:szCs w:val="22"/>
+        </w:rPr>
+        <w:t xml:space="preserve">Bahwa Pasal 185 ayat (3) Undang-Undang Nomor 37 Tahun 2004 menentukan sebagai berikut:</w:t>
+      </w:r>
+    </w:p>
+    <w:p>
+      <w:pPr>
+        <w:spacing w:after="160"/>
+        <w:ind w:left="1077" w:right="849"/>
+        <w:jc w:val="both"/>
+      </w:pPr>
+      <w:r>
+        <w:rPr>
+          <w:rFonts w:ascii="Arial" w:cs="Arial" w:eastAsia="Arial" w:hAnsi="Arial"/>
+          <w:i w:val="false"/>
+          <w:iCs w:val="false"/>
+          <w:sz w:val="22"/>
+          <w:szCs w:val="22"/>
+        </w:rPr>
+        <w:t xml:space="preserve">"Semua benda yang tidak segera atau sama sekali tidak dapat dibereskan maka Kurator yang memutuskan tindakan yang harus dilakukan terhadap benda tersebut dengan izin Hakim Pengawas."</w:t>
+      </w:r>
+    </w:p>
+    <w:p>
+      <w:pPr>
+        <w:pStyle w:val="ListParagraph"/>
+        <w:keepNext w:val="false"/>
+        <w:keepLines/>
+        <w:numPr>
+          <w:ilvl w:val="0"/>
+          <w:numId w:val="23"/>
+        </w:numPr>
+        <w:spacing w:after="120" w:line="276"/>
+        <w:jc w:val="both"/>
+      </w:pPr>
+      <w:r>
+        <w:rPr>
+          <w:rFonts w:ascii="Arial" w:cs="Arial" w:eastAsia="Arial" w:hAnsi="Arial"/>
+          <w:sz w:val="22"/>
+          <w:szCs w:val="22"/>
+        </w:rPr>
+        <w:t xml:space="preserve">Bahwa pengalihan hak atas ganti rugi dan hak menagih hasil kebun akan dilakukan dengan akta cessie sebagaimana dimaksud Pasal 613 Kitab Undang-Undang Hukum Perdata, sedangkan bangunan dan benda dialihkan dengan akta jual beli, seluruhnya dibuat di hadapan notaris dalam kondisi apa adanya (as is), dengan pembayaran lunas ke rekening harta pailit sebelum atau pada saat penandatanganan akta;</w:t>
+      </w:r>
+    </w:p>
+    <w:p>
+      <w:pPr>
+        <w:pStyle w:val="ListParagraph"/>
+        <w:keepNext w:val="false"/>
+        <w:keepLines/>
+        <w:numPr>
+          <w:ilvl w:val="0"/>
+          <w:numId w:val="23"/>
+        </w:numPr>
+        <w:spacing w:after="120" w:line="276"/>
+        <w:jc w:val="both"/>
+      </w:pPr>
+      <w:r>
+        <w:rPr>
+          <w:rFonts w:ascii="Arial" w:cs="Arial" w:eastAsia="Arial" w:hAnsi="Arial"/>
+          <w:sz w:val="22"/>
+          <w:szCs w:val="22"/>
+        </w:rPr>
+        <w:t xml:space="preserve">Bahwa agar pembeli tidak terhalang dalam memohon hak atas tanah, Kurator perlu menyatakan pelepasan kedudukan prioritas bekas pemegang hak sebagaimana dimaksud Pasal 22 Peraturan Pemerintah Nomor 18 Tahun 2021. Kedudukan tersebut bukan merupakan benda yang dapat dijual, namun pelepasannya merupakan bagian dari nilai paket.</w:t>
+      </w:r>
+    </w:p>
+    <w:p>
+      <w:pPr>
+        <w:keepNext w:val="false"/>
+        <w:keepLines/>
+        <w:spacing w:after="120" w:line="276"/>
+        <w:ind w:firstLine="709"/>
+        <w:jc w:val="both"/>
+      </w:pPr>
+      <w:r>
+        <w:rPr>
+          <w:rFonts w:ascii="Arial" w:cs="Arial" w:eastAsia="Arial" w:hAnsi="Arial"/>
+          <w:sz w:val="22"/>
+          <w:szCs w:val="22"/>
+        </w:rPr>
+        <w:t xml:space="preserve">Berdasarkan uraian tersebut, dengan hormat kami mohon Hakim Pengawas berkenan menerbitkan penetapan yang:</w:t>
+      </w:r>
+    </w:p>
+    <w:p>
+      <w:pPr>
+        <w:pStyle w:val="ListParagraph"/>
+        <w:keepNext w:val="false"/>
+        <w:keepLines/>
         <w:numPr>
           <w:ilvl w:val="0"/>
           <w:numId w:val="24"/>
@@ -10881,12 +11037,14 @@
           <w:sz w:val="22"/>
           <w:szCs w:val="22"/>
         </w:rPr>
-        <w:t xml:space="preserve">Bahwa penyegelan dan inventarisasi harta pailit telah dilaksanakan pada tanggal ……………, sebagaimana Berita Acara Penyegelan dan Berita Acara Inventarisasi terlampir;</w:t>
+        <w:t xml:space="preserve">memberikan izin kepada Kurator untuk menjual bangunan dan benda serta mengalihkan dengan cessie hak atas ganti rugi dan hak menagih hasil kebun milik PT Rata Makmur (Dalam Pailit) secara di bawah tangan kepada …………………… dengan harga paling sedikit Rp……………………;</w:t>
       </w:r>
     </w:p>
     <w:p>
       <w:pPr>
         <w:pStyle w:val="ListParagraph"/>
+        <w:keepNext w:val="false"/>
+        <w:keepLines/>
         <w:numPr>
           <w:ilvl w:val="0"/>
           <w:numId w:val="24"/>
@@ -10900,12 +11058,14 @@
           <w:sz w:val="22"/>
           <w:szCs w:val="22"/>
         </w:rPr>
-        <w:t xml:space="preserve">Bahwa KJPP …………………… telah menyampaikan laporan penilaian tanggal ……………, dengan nilai wajar paket sebesar Rp…………………… dan nilai likuidasi sebesar Rp……………………;</w:t>
+        <w:t xml:space="preserve">memberikan izin kepada Kurator untuk menandatangani surat pernyataan pelepasan kedudukan prioritas bekas pemegang hak atas eks HGU Nomor 2/Sei Tampa; dan</w:t>
       </w:r>
     </w:p>
     <w:p>
       <w:pPr>
         <w:pStyle w:val="ListParagraph"/>
+        <w:keepNext/>
+        <w:keepLines/>
         <w:numPr>
           <w:ilvl w:val="0"/>
           <w:numId w:val="24"/>
@@ -10919,175 +11079,13 @@
           <w:sz w:val="22"/>
           <w:szCs w:val="22"/>
         </w:rPr>
-        <w:t xml:space="preserve">Bahwa Kurator telah mengumumkan penawaran terbuka pada tanggal …………… dan menerima …… penawaran. Penawar terbaik adalah …………………… dengan harga Rp……………………, yang telah menyatakan tidak terafiliasi dengan Debitor, direksi, maupun pihak yang mengusahakan kebun;</w:t>
-      </w:r>
-    </w:p>
-    <w:p>
-      <w:pPr>
-        <w:pStyle w:val="ListParagraph"/>
-        <w:numPr>
-          <w:ilvl w:val="0"/>
-          <w:numId w:val="24"/>
-        </w:numPr>
-        <w:spacing w:after="120" w:line="276"/>
-        <w:jc w:val="both"/>
-      </w:pPr>
-      <w:r>
-        <w:rPr>
-          <w:rFonts w:ascii="Arial" w:cs="Arial" w:eastAsia="Arial" w:hAnsi="Arial"/>
-          <w:sz w:val="22"/>
-          <w:szCs w:val="22"/>
-        </w:rPr>
-        <w:t xml:space="preserve">Bahwa objek yang ditawarkan berupa hak atas ganti rugi, hak menagih hasil kebun, serta bangunan dan benda yang berdiri di atas tanah negara, tidak dapat dijual secara terpisah melalui lelang tanpa kehilangan nilainya, karena nilai hak-hak tersebut hanya dapat direalisasikan oleh pihak yang akan mengusahakan tanah tersebut;</w:t>
-      </w:r>
-    </w:p>
-    <w:p>
-      <w:pPr>
-        <w:pStyle w:val="ListParagraph"/>
-        <w:numPr>
-          <w:ilvl w:val="0"/>
-          <w:numId w:val="24"/>
-        </w:numPr>
-        <w:spacing w:after="120" w:line="276"/>
-        <w:jc w:val="both"/>
-      </w:pPr>
-      <w:r>
-        <w:rPr>
-          <w:rFonts w:ascii="Arial" w:cs="Arial" w:eastAsia="Arial" w:hAnsi="Arial"/>
-          <w:sz w:val="22"/>
-          <w:szCs w:val="22"/>
-        </w:rPr>
-        <w:t xml:space="preserve">Bahwa Pasal 185 ayat (3) Undang-Undang Nomor 37 Tahun 2004 menentukan sebagai berikut:</w:t>
-      </w:r>
-    </w:p>
-    <w:p>
-      <w:pPr>
-        <w:spacing w:after="160"/>
-        <w:ind w:left="1077" w:right="849"/>
-        <w:jc w:val="both"/>
-      </w:pPr>
-      <w:r>
-        <w:rPr>
-          <w:rFonts w:ascii="Arial" w:cs="Arial" w:eastAsia="Arial" w:hAnsi="Arial"/>
-          <w:i w:val="false"/>
-          <w:iCs w:val="false"/>
-          <w:sz w:val="22"/>
-          <w:szCs w:val="22"/>
-        </w:rPr>
-        <w:t xml:space="preserve">"Semua benda yang tidak segera atau sama sekali tidak dapat dibereskan maka Kurator yang memutuskan tindakan yang harus dilakukan terhadap benda tersebut dengan izin Hakim Pengawas."</w:t>
-      </w:r>
-    </w:p>
-    <w:p>
-      <w:pPr>
-        <w:pStyle w:val="ListParagraph"/>
-        <w:numPr>
-          <w:ilvl w:val="0"/>
-          <w:numId w:val="25"/>
-        </w:numPr>
-        <w:spacing w:after="120" w:line="276"/>
-        <w:jc w:val="both"/>
-      </w:pPr>
-      <w:r>
-        <w:rPr>
-          <w:rFonts w:ascii="Arial" w:cs="Arial" w:eastAsia="Arial" w:hAnsi="Arial"/>
-          <w:sz w:val="22"/>
-          <w:szCs w:val="22"/>
-        </w:rPr>
-        <w:t xml:space="preserve">Bahwa pengalihan hak atas ganti rugi dan hak menagih hasil kebun akan dilakukan dengan akta cessie sebagaimana dimaksud Pasal 613 Kitab Undang-Undang Hukum Perdata, sedangkan bangunan dan benda dialihkan dengan akta jual beli, seluruhnya dibuat di hadapan notaris dalam kondisi apa adanya (as is), dengan pembayaran lunas ke rekening harta pailit sebelum atau pada saat penandatanganan akta;</w:t>
-      </w:r>
-    </w:p>
-    <w:p>
-      <w:pPr>
-        <w:pStyle w:val="ListParagraph"/>
-        <w:numPr>
-          <w:ilvl w:val="0"/>
-          <w:numId w:val="25"/>
-        </w:numPr>
-        <w:spacing w:after="120" w:line="276"/>
-        <w:jc w:val="both"/>
-      </w:pPr>
-      <w:r>
-        <w:rPr>
-          <w:rFonts w:ascii="Arial" w:cs="Arial" w:eastAsia="Arial" w:hAnsi="Arial"/>
-          <w:sz w:val="22"/>
-          <w:szCs w:val="22"/>
-        </w:rPr>
-        <w:t xml:space="preserve">Bahwa agar pembeli tidak terhalang dalam memohon hak atas tanah, Kurator perlu menyatakan pelepasan kedudukan prioritas bekas pemegang hak sebagaimana dimaksud Pasal 22 Peraturan Pemerintah Nomor 18 Tahun 2021. Kedudukan tersebut bukan merupakan benda yang dapat dijual, namun pelepasannya merupakan bagian dari nilai paket.</w:t>
-      </w:r>
-    </w:p>
-    <w:p>
-      <w:pPr>
-        <w:spacing w:after="120" w:before="0" w:line="276"/>
-        <w:jc w:val="left"/>
-      </w:pPr>
-      <w:r>
-        <w:rPr>
-          <w:rFonts w:ascii="Arial" w:cs="Arial" w:eastAsia="Arial" w:hAnsi="Arial"/>
-          <w:sz w:val="22"/>
-          <w:szCs w:val="22"/>
-        </w:rPr>
-        <w:t xml:space="preserve">Berdasarkan uraian tersebut, dengan hormat kami mohon Hakim Pengawas berkenan menerbitkan penetapan yang:</w:t>
-      </w:r>
-    </w:p>
-    <w:p>
-      <w:pPr>
-        <w:pStyle w:val="ListParagraph"/>
-        <w:numPr>
-          <w:ilvl w:val="0"/>
-          <w:numId w:val="26"/>
-        </w:numPr>
-        <w:spacing w:after="120" w:line="276"/>
-        <w:jc w:val="both"/>
-      </w:pPr>
-      <w:r>
-        <w:rPr>
-          <w:rFonts w:ascii="Arial" w:cs="Arial" w:eastAsia="Arial" w:hAnsi="Arial"/>
-          <w:sz w:val="22"/>
-          <w:szCs w:val="22"/>
-        </w:rPr>
-        <w:t xml:space="preserve">memberikan izin kepada Kurator untuk menjual bangunan dan benda serta mengalihkan dengan cessie hak atas ganti rugi dan hak menagih hasil kebun milik PT Rata Makmur (Dalam Pailit) secara di bawah tangan kepada …………………… dengan harga paling sedikit Rp……………………;</w:t>
-      </w:r>
-    </w:p>
-    <w:p>
-      <w:pPr>
-        <w:pStyle w:val="ListParagraph"/>
-        <w:numPr>
-          <w:ilvl w:val="0"/>
-          <w:numId w:val="26"/>
-        </w:numPr>
-        <w:spacing w:after="120" w:line="276"/>
-        <w:jc w:val="both"/>
-      </w:pPr>
-      <w:r>
-        <w:rPr>
-          <w:rFonts w:ascii="Arial" w:cs="Arial" w:eastAsia="Arial" w:hAnsi="Arial"/>
-          <w:sz w:val="22"/>
-          <w:szCs w:val="22"/>
-        </w:rPr>
-        <w:t xml:space="preserve">memberikan izin kepada Kurator untuk menandatangani surat pernyataan pelepasan kedudukan prioritas bekas pemegang hak atas eks HGU Nomor 2/Sei Tampa; dan</w:t>
-      </w:r>
-    </w:p>
-    <w:p>
-      <w:pPr>
-        <w:pStyle w:val="ListParagraph"/>
-        <w:numPr>
-          <w:ilvl w:val="0"/>
-          <w:numId w:val="26"/>
-        </w:numPr>
-        <w:spacing w:after="120" w:line="276"/>
-        <w:jc w:val="both"/>
-      </w:pPr>
-      <w:r>
-        <w:rPr>
-          <w:rFonts w:ascii="Arial" w:cs="Arial" w:eastAsia="Arial" w:hAnsi="Arial"/>
-          <w:sz w:val="22"/>
-          <w:szCs w:val="22"/>
-        </w:rPr>
         <w:t xml:space="preserve">memerintahkan agar hasil penjualan disetor ke rekening harta pailit dan dibagikan sesuai daftar pembagian yang akan disusun Kurator.</w:t>
       </w:r>
     </w:p>
     <w:p>
       <w:pPr>
+        <w:keepNext/>
+        <w:keepLines/>
         <w:spacing w:after="200" w:line="276"/>
         <w:ind w:firstLine="709"/>
         <w:jc w:val="both"/>
@@ -11118,6 +11116,9 @@
         <w:gridCol w:w="3061"/>
       </w:tblGrid>
       <w:tr>
+        <w:trPr>
+          <w:cantSplit/>
+        </w:trPr>
         <w:tc>
           <w:tcPr>
             <w:tcW w:type="dxa" w:w="5896"/>
@@ -11213,7 +11214,7 @@
         <w:pStyle w:val="ListParagraph"/>
         <w:numPr>
           <w:ilvl w:val="0"/>
-          <w:numId w:val="27"/>
+          <w:numId w:val="25"/>
         </w:numPr>
         <w:spacing w:line="276"/>
         <w:jc w:val="both"/>
@@ -11232,7 +11233,7 @@
         <w:pStyle w:val="ListParagraph"/>
         <w:numPr>
           <w:ilvl w:val="0"/>
-          <w:numId w:val="27"/>
+          <w:numId w:val="25"/>
         </w:numPr>
         <w:spacing w:line="276"/>
         <w:jc w:val="both"/>
@@ -11251,7 +11252,7 @@
         <w:pStyle w:val="ListParagraph"/>
         <w:numPr>
           <w:ilvl w:val="0"/>
-          <w:numId w:val="27"/>
+          <w:numId w:val="25"/>
         </w:numPr>
         <w:spacing w:line="276"/>
         <w:jc w:val="both"/>
@@ -11270,7 +11271,7 @@
         <w:pStyle w:val="ListParagraph"/>
         <w:numPr>
           <w:ilvl w:val="0"/>
-          <w:numId w:val="27"/>
+          <w:numId w:val="25"/>
         </w:numPr>
         <w:spacing w:line="276"/>
         <w:jc w:val="both"/>
@@ -11285,27 +11286,8 @@
       </w:r>
     </w:p>
     <w:p>
-      <w:r>
-        <w:br w:type="page"/>
-      </w:r>
-    </w:p>
-    <w:p>
-      <w:pPr>
-        <w:spacing w:after="60"/>
-        <w:jc w:val="right"/>
-      </w:pPr>
-      <w:r>
-        <w:rPr>
-          <w:rFonts w:ascii="Arial" w:cs="Arial" w:eastAsia="Arial" w:hAnsi="Arial"/>
-          <w:color w:val="808080"/>
-          <w:sz w:val="16"/>
-          <w:szCs w:val="16"/>
-        </w:rPr>
-        <w:t xml:space="preserve">Konsep Surat 11 (Surat Pernyataan)</w:t>
-      </w:r>
-    </w:p>
-    <w:p>
-      <w:pPr>
+      <w:pPr>
+        <w:pageBreakBefore/>
         <w:ind w:left="1418"/>
         <w:jc w:val="center"/>
       </w:pPr>
@@ -11789,9 +11771,11 @@
     <w:p>
       <w:pPr>
         <w:pStyle w:val="ListParagraph"/>
+        <w:keepNext w:val="false"/>
+        <w:keepLines/>
         <w:numPr>
           <w:ilvl w:val="0"/>
-          <w:numId w:val="28"/>
+          <w:numId w:val="26"/>
         </w:numPr>
         <w:spacing w:after="120" w:line="276"/>
         <w:jc w:val="both"/>
@@ -11808,9 +11792,11 @@
     <w:p>
       <w:pPr>
         <w:pStyle w:val="ListParagraph"/>
+        <w:keepNext w:val="false"/>
+        <w:keepLines/>
         <w:numPr>
           <w:ilvl w:val="0"/>
-          <w:numId w:val="28"/>
+          <w:numId w:val="26"/>
         </w:numPr>
         <w:spacing w:after="120" w:line="276"/>
         <w:jc w:val="both"/>
@@ -11827,9 +11813,11 @@
     <w:p>
       <w:pPr>
         <w:pStyle w:val="ListParagraph"/>
+        <w:keepNext w:val="false"/>
+        <w:keepLines/>
         <w:numPr>
           <w:ilvl w:val="0"/>
-          <w:numId w:val="28"/>
+          <w:numId w:val="26"/>
         </w:numPr>
         <w:spacing w:after="120" w:line="276"/>
         <w:jc w:val="both"/>
@@ -11846,9 +11834,11 @@
     <w:p>
       <w:pPr>
         <w:pStyle w:val="ListParagraph"/>
+        <w:keepNext w:val="false"/>
+        <w:keepLines/>
         <w:numPr>
           <w:ilvl w:val="0"/>
-          <w:numId w:val="28"/>
+          <w:numId w:val="26"/>
         </w:numPr>
         <w:spacing w:after="120" w:line="276"/>
         <w:jc w:val="both"/>
@@ -11864,6 +11854,8 @@
     </w:p>
     <w:p>
       <w:pPr>
+        <w:keepNext w:val="false"/>
+        <w:keepLines/>
         <w:spacing w:after="200" w:line="276"/>
         <w:ind w:firstLine="709"/>
         <w:jc w:val="both"/>
@@ -11875,21 +11867,6 @@
           <w:szCs w:val="22"/>
         </w:rPr>
         <w:t xml:space="preserve">Demikian surat pernyataan ini dibuat dengan sebenarnya untuk dipergunakan sebagaimana mestinya.</w:t>
-      </w:r>
-    </w:p>
-    <w:p>
-      <w:pPr>
-        <w:spacing w:after="0" w:before="0" w:line="276"/>
-        <w:ind w:left="5896"/>
-        <w:jc w:val="left"/>
-      </w:pPr>
-      <w:r>
-        <w:rPr>
-          <w:rFonts w:ascii="Arial" w:cs="Arial" w:eastAsia="Arial" w:hAnsi="Arial"/>
-          <w:sz w:val="22"/>
-          <w:szCs w:val="22"/>
-        </w:rPr>
-        <w:t xml:space="preserve">Medan, ……………… 20…</w:t>
       </w:r>
     </w:p>
     <w:tbl>
@@ -11909,6 +11886,9 @@
         <w:gridCol w:w="3061"/>
       </w:tblGrid>
       <w:tr>
+        <w:trPr>
+          <w:cantSplit/>
+        </w:trPr>
         <w:tc>
           <w:tcPr>
             <w:tcW w:type="dxa" w:w="5896"/>
@@ -11935,6 +11915,20 @@
               <w:right w:val="none" w:color="FFFFFF" w:sz="0"/>
             </w:tcBorders>
           </w:tcPr>
+          <w:p>
+            <w:pPr>
+              <w:spacing w:after="0" w:before="0" w:line="276"/>
+              <w:jc w:val="left"/>
+            </w:pPr>
+            <w:r>
+              <w:rPr>
+                <w:rFonts w:ascii="Arial" w:cs="Arial" w:eastAsia="Arial" w:hAnsi="Arial"/>
+                <w:sz w:val="22"/>
+                <w:szCs w:val="22"/>
+              </w:rPr>
+              <w:t xml:space="preserve">Medan, ……………… 20…</w:t>
+            </w:r>
+          </w:p>
           <w:p>
             <w:pPr>
               <w:spacing w:after="0" w:before="0" w:line="276"/>
@@ -12004,7 +11998,7 @@
         <w:pStyle w:val="ListParagraph"/>
         <w:numPr>
           <w:ilvl w:val="0"/>
-          <w:numId w:val="29"/>
+          <w:numId w:val="27"/>
         </w:numPr>
         <w:spacing w:line="276"/>
         <w:jc w:val="both"/>
@@ -12023,7 +12017,7 @@
         <w:pStyle w:val="ListParagraph"/>
         <w:numPr>
           <w:ilvl w:val="0"/>
-          <w:numId w:val="29"/>
+          <w:numId w:val="27"/>
         </w:numPr>
         <w:spacing w:line="276"/>
         <w:jc w:val="both"/>
@@ -12042,7 +12036,7 @@
         <w:pStyle w:val="ListParagraph"/>
         <w:numPr>
           <w:ilvl w:val="0"/>
-          <w:numId w:val="29"/>
+          <w:numId w:val="27"/>
         </w:numPr>
         <w:spacing w:line="276"/>
         <w:jc w:val="both"/>
@@ -12061,7 +12055,7 @@
         <w:pStyle w:val="ListParagraph"/>
         <w:numPr>
           <w:ilvl w:val="0"/>
-          <w:numId w:val="29"/>
+          <w:numId w:val="27"/>
         </w:numPr>
         <w:spacing w:line="276"/>
         <w:jc w:val="both"/>
@@ -12076,27 +12070,8 @@
       </w:r>
     </w:p>
     <w:p>
-      <w:r>
-        <w:br w:type="page"/>
-      </w:r>
-    </w:p>
-    <w:p>
-      <w:pPr>
-        <w:spacing w:after="60"/>
-        <w:jc w:val="right"/>
-      </w:pPr>
-      <w:r>
-        <w:rPr>
-          <w:rFonts w:ascii="Arial" w:cs="Arial" w:eastAsia="Arial" w:hAnsi="Arial"/>
-          <w:color w:val="808080"/>
-          <w:sz w:val="16"/>
-          <w:szCs w:val="16"/>
-        </w:rPr>
-        <w:t xml:space="preserve">Konsep Surat 12</w:t>
-      </w:r>
-    </w:p>
-    <w:p>
-      <w:pPr>
+      <w:pPr>
+        <w:pageBreakBefore/>
         <w:ind w:left="1418"/>
         <w:jc w:val="center"/>
       </w:pPr>
@@ -12265,7 +12240,7 @@
           <w:p>
             <w:pPr>
               <w:spacing w:after="40"/>
-              <w:jc w:val="both"/>
+              <w:jc w:val="left"/>
             </w:pPr>
             <w:r>
               <w:rPr>
@@ -12290,7 +12265,7 @@
           <w:p>
             <w:pPr>
               <w:spacing w:after="40"/>
-              <w:jc w:val="both"/>
+              <w:jc w:val="left"/>
             </w:pPr>
             <w:r>
               <w:rPr>
@@ -12315,7 +12290,7 @@
           <w:p>
             <w:pPr>
               <w:spacing w:after="40"/>
-              <w:jc w:val="both"/>
+              <w:jc w:val="left"/>
             </w:pPr>
             <w:r>
               <w:rPr>
@@ -12367,7 +12342,7 @@
           <w:p>
             <w:pPr>
               <w:spacing w:after="40"/>
-              <w:jc w:val="both"/>
+              <w:jc w:val="left"/>
             </w:pPr>
             <w:r>
               <w:rPr>
@@ -12392,7 +12367,7 @@
           <w:p>
             <w:pPr>
               <w:spacing w:after="40"/>
-              <w:jc w:val="both"/>
+              <w:jc w:val="left"/>
             </w:pPr>
             <w:r>
               <w:rPr>
@@ -12417,7 +12392,7 @@
           <w:p>
             <w:pPr>
               <w:spacing w:after="40"/>
-              <w:jc w:val="both"/>
+              <w:jc w:val="left"/>
             </w:pPr>
             <w:r>
               <w:rPr>
@@ -12461,7 +12436,7 @@
           <w:p>
             <w:pPr>
               <w:spacing w:after="40"/>
-              <w:jc w:val="both"/>
+              <w:jc w:val="left"/>
             </w:pPr>
             <w:r>
               <w:rPr>
@@ -12486,7 +12461,7 @@
           <w:p>
             <w:pPr>
               <w:spacing w:after="40"/>
-              <w:jc w:val="both"/>
+              <w:jc w:val="left"/>
             </w:pPr>
             <w:r>
               <w:rPr>
@@ -12511,7 +12486,7 @@
           <w:p>
             <w:pPr>
               <w:spacing w:after="40"/>
-              <w:jc w:val="both"/>
+              <w:jc w:val="left"/>
             </w:pPr>
             <w:r>
               <w:rPr>
@@ -12555,7 +12530,7 @@
           <w:p>
             <w:pPr>
               <w:spacing w:after="40"/>
-              <w:jc w:val="both"/>
+              <w:jc w:val="left"/>
             </w:pPr>
             <w:r>
               <w:rPr>
@@ -12580,7 +12555,7 @@
           <w:p>
             <w:pPr>
               <w:spacing w:after="40"/>
-              <w:jc w:val="both"/>
+              <w:jc w:val="left"/>
             </w:pPr>
             <w:r>
               <w:rPr>
@@ -12605,7 +12580,7 @@
           <w:p>
             <w:pPr>
               <w:spacing w:after="40"/>
-              <w:jc w:val="both"/>
+              <w:jc w:val="left"/>
             </w:pPr>
             <w:r>
               <w:rPr>
@@ -12718,6 +12693,8 @@
     </w:p>
     <w:p>
       <w:pPr>
+        <w:keepNext w:val="false"/>
+        <w:keepLines/>
         <w:spacing w:after="120" w:line="276"/>
         <w:ind w:firstLine="709"/>
         <w:jc w:val="both"/>
@@ -12734,9 +12711,11 @@
     <w:p>
       <w:pPr>
         <w:pStyle w:val="ListParagraph"/>
+        <w:keepNext w:val="false"/>
+        <w:keepLines/>
         <w:numPr>
           <w:ilvl w:val="0"/>
-          <w:numId w:val="30"/>
+          <w:numId w:val="28"/>
         </w:numPr>
         <w:spacing w:after="120" w:line="276"/>
         <w:jc w:val="both"/>
@@ -12753,9 +12732,11 @@
     <w:p>
       <w:pPr>
         <w:pStyle w:val="ListParagraph"/>
+        <w:keepNext w:val="false"/>
+        <w:keepLines/>
         <w:numPr>
           <w:ilvl w:val="0"/>
-          <w:numId w:val="30"/>
+          <w:numId w:val="28"/>
         </w:numPr>
         <w:spacing w:after="120" w:line="276"/>
         <w:jc w:val="both"/>
@@ -12786,9 +12767,11 @@
     <w:p>
       <w:pPr>
         <w:pStyle w:val="ListParagraph"/>
+        <w:keepNext w:val="false"/>
+        <w:keepLines/>
         <w:numPr>
           <w:ilvl w:val="0"/>
-          <w:numId w:val="31"/>
+          <w:numId w:val="29"/>
         </w:numPr>
         <w:spacing w:after="120" w:line="276"/>
         <w:jc w:val="both"/>
@@ -12805,9 +12788,11 @@
     <w:p>
       <w:pPr>
         <w:pStyle w:val="ListParagraph"/>
+        <w:keepNext w:val="false"/>
+        <w:keepLines/>
         <w:numPr>
           <w:ilvl w:val="0"/>
-          <w:numId w:val="31"/>
+          <w:numId w:val="29"/>
         </w:numPr>
         <w:spacing w:after="120" w:line="276"/>
         <w:jc w:val="both"/>
@@ -12823,6 +12808,8 @@
     </w:p>
     <w:p>
       <w:pPr>
+        <w:keepNext w:val="false"/>
+        <w:keepLines/>
         <w:spacing w:after="120" w:line="276"/>
         <w:ind w:firstLine="709"/>
         <w:jc w:val="both"/>
@@ -12838,6 +12825,8 @@
     </w:p>
     <w:p>
       <w:pPr>
+        <w:keepNext/>
+        <w:keepLines/>
         <w:spacing w:after="200" w:line="276"/>
         <w:ind w:firstLine="709"/>
         <w:jc w:val="both"/>
@@ -12868,6 +12857,9 @@
         <w:gridCol w:w="3061"/>
       </w:tblGrid>
       <w:tr>
+        <w:trPr>
+          <w:cantSplit/>
+        </w:trPr>
         <w:tc>
           <w:tcPr>
             <w:tcW w:type="dxa" w:w="5896"/>
@@ -12963,7 +12955,7 @@
         <w:pStyle w:val="ListParagraph"/>
         <w:numPr>
           <w:ilvl w:val="0"/>
-          <w:numId w:val="32"/>
+          <w:numId w:val="30"/>
         </w:numPr>
         <w:spacing w:line="276"/>
         <w:jc w:val="both"/>
@@ -12982,7 +12974,7 @@
         <w:pStyle w:val="ListParagraph"/>
         <w:numPr>
           <w:ilvl w:val="0"/>
-          <w:numId w:val="32"/>
+          <w:numId w:val="30"/>
         </w:numPr>
         <w:spacing w:line="276"/>
         <w:jc w:val="both"/>
@@ -12997,27 +12989,8 @@
       </w:r>
     </w:p>
     <w:p>
-      <w:r>
-        <w:br w:type="page"/>
-      </w:r>
-    </w:p>
-    <w:p>
-      <w:pPr>
-        <w:spacing w:after="60"/>
-        <w:jc w:val="right"/>
-      </w:pPr>
-      <w:r>
-        <w:rPr>
-          <w:rFonts w:ascii="Arial" w:cs="Arial" w:eastAsia="Arial" w:hAnsi="Arial"/>
-          <w:color w:val="808080"/>
-          <w:sz w:val="16"/>
-          <w:szCs w:val="16"/>
-        </w:rPr>
-        <w:t xml:space="preserve">Konsep Surat 13</w:t>
-      </w:r>
-    </w:p>
-    <w:p>
-      <w:pPr>
+      <w:pPr>
+        <w:pageBreakBefore/>
         <w:ind w:left="1418"/>
         <w:jc w:val="center"/>
       </w:pPr>
@@ -13186,7 +13159,7 @@
           <w:p>
             <w:pPr>
               <w:spacing w:after="40"/>
-              <w:jc w:val="both"/>
+              <w:jc w:val="left"/>
             </w:pPr>
             <w:r>
               <w:rPr>
@@ -13211,7 +13184,7 @@
           <w:p>
             <w:pPr>
               <w:spacing w:after="40"/>
-              <w:jc w:val="both"/>
+              <w:jc w:val="left"/>
             </w:pPr>
             <w:r>
               <w:rPr>
@@ -13236,7 +13209,7 @@
           <w:p>
             <w:pPr>
               <w:spacing w:after="40"/>
-              <w:jc w:val="both"/>
+              <w:jc w:val="left"/>
             </w:pPr>
             <w:r>
               <w:rPr>
@@ -13288,7 +13261,7 @@
           <w:p>
             <w:pPr>
               <w:spacing w:after="40"/>
-              <w:jc w:val="both"/>
+              <w:jc w:val="left"/>
             </w:pPr>
             <w:r>
               <w:rPr>
@@ -13313,7 +13286,7 @@
           <w:p>
             <w:pPr>
               <w:spacing w:after="40"/>
-              <w:jc w:val="both"/>
+              <w:jc w:val="left"/>
             </w:pPr>
             <w:r>
               <w:rPr>
@@ -13338,7 +13311,7 @@
           <w:p>
             <w:pPr>
               <w:spacing w:after="40"/>
-              <w:jc w:val="both"/>
+              <w:jc w:val="left"/>
             </w:pPr>
             <w:r>
               <w:rPr>
@@ -13382,7 +13355,7 @@
           <w:p>
             <w:pPr>
               <w:spacing w:after="40"/>
-              <w:jc w:val="both"/>
+              <w:jc w:val="left"/>
             </w:pPr>
             <w:r>
               <w:rPr>
@@ -13407,7 +13380,7 @@
           <w:p>
             <w:pPr>
               <w:spacing w:after="40"/>
-              <w:jc w:val="both"/>
+              <w:jc w:val="left"/>
             </w:pPr>
             <w:r>
               <w:rPr>
@@ -13432,7 +13405,7 @@
           <w:p>
             <w:pPr>
               <w:spacing w:after="40"/>
-              <w:jc w:val="both"/>
+              <w:jc w:val="left"/>
             </w:pPr>
             <w:r>
               <w:rPr>
@@ -13476,7 +13449,7 @@
           <w:p>
             <w:pPr>
               <w:spacing w:after="40"/>
-              <w:jc w:val="both"/>
+              <w:jc w:val="left"/>
             </w:pPr>
             <w:r>
               <w:rPr>
@@ -13501,7 +13474,7 @@
           <w:p>
             <w:pPr>
               <w:spacing w:after="40"/>
-              <w:jc w:val="both"/>
+              <w:jc w:val="left"/>
             </w:pPr>
             <w:r>
               <w:rPr>
@@ -13526,7 +13499,7 @@
           <w:p>
             <w:pPr>
               <w:spacing w:after="40"/>
-              <w:jc w:val="both"/>
+              <w:jc w:val="left"/>
             </w:pPr>
             <w:r>
               <w:rPr>
@@ -13625,6 +13598,8 @@
     </w:p>
     <w:p>
       <w:pPr>
+        <w:keepNext w:val="false"/>
+        <w:keepLines/>
         <w:spacing w:after="120" w:line="276"/>
         <w:ind w:firstLine="709"/>
         <w:jc w:val="both"/>
@@ -13641,9 +13616,11 @@
     <w:p>
       <w:pPr>
         <w:pStyle w:val="ListParagraph"/>
+        <w:keepNext w:val="false"/>
+        <w:keepLines/>
         <w:numPr>
           <w:ilvl w:val="0"/>
-          <w:numId w:val="33"/>
+          <w:numId w:val="31"/>
         </w:numPr>
         <w:spacing w:after="120" w:line="276"/>
         <w:jc w:val="both"/>
@@ -13660,9 +13637,11 @@
     <w:p>
       <w:pPr>
         <w:pStyle w:val="ListParagraph"/>
+        <w:keepNext w:val="false"/>
+        <w:keepLines/>
         <w:numPr>
           <w:ilvl w:val="0"/>
-          <w:numId w:val="33"/>
+          <w:numId w:val="31"/>
         </w:numPr>
         <w:spacing w:after="120" w:line="276"/>
         <w:jc w:val="both"/>
@@ -13679,9 +13658,11 @@
     <w:p>
       <w:pPr>
         <w:pStyle w:val="ListParagraph"/>
+        <w:keepNext w:val="false"/>
+        <w:keepLines/>
         <w:numPr>
           <w:ilvl w:val="0"/>
-          <w:numId w:val="33"/>
+          <w:numId w:val="31"/>
         </w:numPr>
         <w:spacing w:after="120" w:line="276"/>
         <w:jc w:val="both"/>
@@ -13698,9 +13679,11 @@
     <w:p>
       <w:pPr>
         <w:pStyle w:val="ListParagraph"/>
+        <w:keepNext w:val="false"/>
+        <w:keepLines/>
         <w:numPr>
           <w:ilvl w:val="0"/>
-          <w:numId w:val="33"/>
+          <w:numId w:val="31"/>
         </w:numPr>
         <w:spacing w:after="120" w:line="276"/>
         <w:jc w:val="both"/>
@@ -13717,9 +13700,11 @@
     <w:p>
       <w:pPr>
         <w:pStyle w:val="ListParagraph"/>
+        <w:keepNext w:val="false"/>
+        <w:keepLines/>
         <w:numPr>
           <w:ilvl w:val="0"/>
-          <w:numId w:val="33"/>
+          <w:numId w:val="31"/>
         </w:numPr>
         <w:spacing w:after="120" w:line="276"/>
         <w:jc w:val="both"/>
@@ -13735,6 +13720,8 @@
     </w:p>
     <w:p>
       <w:pPr>
+        <w:keepNext/>
+        <w:keepLines/>
         <w:spacing w:after="200" w:line="276"/>
         <w:ind w:firstLine="709"/>
         <w:jc w:val="both"/>
@@ -13765,6 +13752,9 @@
         <w:gridCol w:w="3061"/>
       </w:tblGrid>
       <w:tr>
+        <w:trPr>
+          <w:cantSplit/>
+        </w:trPr>
         <w:tc>
           <w:tcPr>
             <w:tcW w:type="dxa" w:w="5896"/>
@@ -13860,7 +13850,7 @@
         <w:pStyle w:val="ListParagraph"/>
         <w:numPr>
           <w:ilvl w:val="0"/>
-          <w:numId w:val="34"/>
+          <w:numId w:val="32"/>
         </w:numPr>
         <w:spacing w:line="276"/>
         <w:jc w:val="both"/>
@@ -13879,7 +13869,7 @@
         <w:pStyle w:val="ListParagraph"/>
         <w:numPr>
           <w:ilvl w:val="0"/>
-          <w:numId w:val="34"/>
+          <w:numId w:val="32"/>
         </w:numPr>
         <w:spacing w:line="276"/>
         <w:jc w:val="both"/>
@@ -13898,7 +13888,7 @@
         <w:pStyle w:val="ListParagraph"/>
         <w:numPr>
           <w:ilvl w:val="0"/>
-          <w:numId w:val="34"/>
+          <w:numId w:val="32"/>
         </w:numPr>
         <w:spacing w:line="276"/>
         <w:jc w:val="both"/>
@@ -13913,28 +13903,9 @@
       </w:r>
     </w:p>
     <w:p>
-      <w:r>
-        <w:br w:type="page"/>
-      </w:r>
-    </w:p>
-    <w:p>
-      <w:pPr>
-        <w:spacing w:after="60"/>
-        <w:jc w:val="right"/>
-      </w:pPr>
-      <w:r>
-        <w:rPr>
-          <w:rFonts w:ascii="Arial" w:cs="Arial" w:eastAsia="Arial" w:hAnsi="Arial"/>
-          <w:color w:val="808080"/>
-          <w:sz w:val="16"/>
-          <w:szCs w:val="16"/>
-        </w:rPr>
-        <w:t xml:space="preserve">Lampiran untuk Notaris</w:t>
-      </w:r>
-    </w:p>
-    <w:p>
-      <w:pPr>
-        <w:spacing w:after="0" w:before="0" w:line="276"/>
+      <w:pPr>
+        <w:pageBreakBefore/>
+        <w:spacing w:line="276"/>
         <w:jc w:val="center"/>
       </w:pPr>
       <w:r>
@@ -13966,6 +13937,8 @@
     </w:p>
     <w:p>
       <w:pPr>
+        <w:keepNext w:val="false"/>
+        <w:keepLines/>
         <w:spacing w:after="120" w:line="276"/>
         <w:ind w:firstLine="709"/>
         <w:jc w:val="both"/>
@@ -15594,6 +15567,11 @@
       <w:pPr>
         <w:ind w:left="453" w:hanging="340"/>
       </w:pPr>
+      <w:rPr>
+        <w:rFonts w:ascii="Arial" w:cs="Arial" w:eastAsia="Arial" w:hAnsi="Arial"/>
+        <w:sz w:val="22"/>
+        <w:szCs w:val="22"/>
+      </w:rPr>
     </w:lvl>
     <w:lvl w:ilvl="1" w:tentative="1">
       <w:start w:val="1"/>
@@ -15603,6 +15581,11 @@
       <w:pPr>
         <w:ind w:left="850" w:hanging="340"/>
       </w:pPr>
+      <w:rPr>
+        <w:rFonts w:ascii="Arial" w:cs="Arial" w:eastAsia="Arial" w:hAnsi="Arial"/>
+        <w:sz w:val="22"/>
+        <w:szCs w:val="22"/>
+      </w:rPr>
     </w:lvl>
   </w:abstractNum>
   <w:abstractNum w:abstractNumId="3" w15:restartNumberingAfterBreak="0">
@@ -15658,13 +15641,13 @@
     </w:lvlOverride>
   </w:num>
   <w:num w:numId="7">
-    <w:abstractNumId w:val="2"/>
+    <w:abstractNumId w:val="3"/>
     <w:lvlOverride w:ilvl="0">
       <w:startOverride w:val="1"/>
     </w:lvlOverride>
   </w:num>
   <w:num w:numId="8">
-    <w:abstractNumId w:val="3"/>
+    <w:abstractNumId w:val="2"/>
     <w:lvlOverride w:ilvl="0">
       <w:startOverride w:val="1"/>
     </w:lvlOverride>
@@ -15676,61 +15659,61 @@
     </w:lvlOverride>
   </w:num>
   <w:num w:numId="10">
+    <w:abstractNumId w:val="3"/>
+    <w:lvlOverride w:ilvl="0">
+      <w:startOverride w:val="1"/>
+    </w:lvlOverride>
+  </w:num>
+  <w:num w:numId="11">
     <w:abstractNumId w:val="2"/>
     <w:lvlOverride w:ilvl="0">
       <w:startOverride w:val="1"/>
     </w:lvlOverride>
   </w:num>
-  <w:num w:numId="11">
+  <w:num w:numId="12">
     <w:abstractNumId w:val="3"/>
     <w:lvlOverride w:ilvl="0">
       <w:startOverride w:val="1"/>
     </w:lvlOverride>
   </w:num>
-  <w:num w:numId="12">
+  <w:num w:numId="13">
     <w:abstractNumId w:val="2"/>
     <w:lvlOverride w:ilvl="0">
       <w:startOverride w:val="1"/>
     </w:lvlOverride>
   </w:num>
-  <w:num w:numId="13">
+  <w:num w:numId="14">
     <w:abstractNumId w:val="3"/>
     <w:lvlOverride w:ilvl="0">
       <w:startOverride w:val="1"/>
     </w:lvlOverride>
   </w:num>
-  <w:num w:numId="14">
+  <w:num w:numId="15">
     <w:abstractNumId w:val="2"/>
     <w:lvlOverride w:ilvl="0">
       <w:startOverride w:val="1"/>
     </w:lvlOverride>
   </w:num>
-  <w:num w:numId="15">
+  <w:num w:numId="16">
     <w:abstractNumId w:val="3"/>
     <w:lvlOverride w:ilvl="0">
       <w:startOverride w:val="1"/>
     </w:lvlOverride>
   </w:num>
-  <w:num w:numId="16">
+  <w:num w:numId="17">
     <w:abstractNumId w:val="2"/>
     <w:lvlOverride w:ilvl="0">
       <w:startOverride w:val="1"/>
     </w:lvlOverride>
   </w:num>
-  <w:num w:numId="17">
+  <w:num w:numId="18">
     <w:abstractNumId w:val="3"/>
     <w:lvlOverride w:ilvl="0">
       <w:startOverride w:val="1"/>
     </w:lvlOverride>
   </w:num>
-  <w:num w:numId="18">
+  <w:num w:numId="19">
     <w:abstractNumId w:val="2"/>
-    <w:lvlOverride w:ilvl="0">
-      <w:startOverride w:val="1"/>
-    </w:lvlOverride>
-  </w:num>
-  <w:num w:numId="19">
-    <w:abstractNumId w:val="3"/>
     <w:lvlOverride w:ilvl="0">
       <w:startOverride w:val="1"/>
     </w:lvlOverride>
@@ -15742,13 +15725,13 @@
     </w:lvlOverride>
   </w:num>
   <w:num w:numId="21">
-    <w:abstractNumId w:val="2"/>
+    <w:abstractNumId w:val="3"/>
     <w:lvlOverride w:ilvl="0">
       <w:startOverride w:val="1"/>
     </w:lvlOverride>
   </w:num>
   <w:num w:numId="22">
-    <w:abstractNumId w:val="3"/>
+    <w:abstractNumId w:val="2"/>
     <w:lvlOverride w:ilvl="0">
       <w:startOverride w:val="1"/>
     </w:lvlOverride>
@@ -15766,7 +15749,7 @@
     </w:lvlOverride>
   </w:num>
   <w:num w:numId="25">
-    <w:abstractNumId w:val="2"/>
+    <w:abstractNumId w:val="3"/>
     <w:lvlOverride w:ilvl="0">
       <w:startOverride w:val="1"/>
     </w:lvlOverride>
@@ -15790,13 +15773,13 @@
     </w:lvlOverride>
   </w:num>
   <w:num w:numId="29">
-    <w:abstractNumId w:val="3"/>
+    <w:abstractNumId w:val="2"/>
     <w:lvlOverride w:ilvl="0">
       <w:startOverride w:val="1"/>
     </w:lvlOverride>
   </w:num>
   <w:num w:numId="30">
-    <w:abstractNumId w:val="2"/>
+    <w:abstractNumId w:val="3"/>
     <w:lvlOverride w:ilvl="0">
       <w:startOverride w:val="1"/>
     </w:lvlOverride>
@@ -15808,18 +15791,6 @@
     </w:lvlOverride>
   </w:num>
   <w:num w:numId="32">
-    <w:abstractNumId w:val="3"/>
-    <w:lvlOverride w:ilvl="0">
-      <w:startOverride w:val="1"/>
-    </w:lvlOverride>
-  </w:num>
-  <w:num w:numId="33">
-    <w:abstractNumId w:val="2"/>
-    <w:lvlOverride w:ilvl="0">
-      <w:startOverride w:val="1"/>
-    </w:lvlOverride>
-  </w:num>
-  <w:num w:numId="34">
     <w:abstractNumId w:val="3"/>
     <w:lvlOverride w:ilvl="0">
       <w:startOverride w:val="1"/>

</xml_diff>

<commit_message>
Perbaiki garis kop selebar margin dan tambah estimasi biaya serta perolehan cessie
Co-Authored-By: Claude Opus 5.5 <noreply@anthropic.com>
Claude-Session: https://claude.ai/code/session_01AFC3nUeexLNNCgqYQcbfK5
</commit_message>
<xml_diff>
--- a/telaah-pt-rata-makmur/Himpunan_Konsep_Surat_Cessie_PT_Rata_Makmur.docx
+++ b/telaah-pt-rata-makmur/Himpunan_Konsep_Surat_Cessie_PT_Rata_Makmur.docx
@@ -124,10 +124,6 @@
     </w:p>
     <w:p>
       <w:pPr>
-        <w:pBdr>
-          <w:bottom w:val="single" w:color="A0A0A0" w:sz="12" w:space="6"/>
-        </w:pBdr>
-        <w:spacing w:after="160"/>
         <w:ind w:left="1418"/>
         <w:jc w:val="center"/>
       </w:pPr>
@@ -139,6 +135,14 @@
         </w:rPr>
         <w:t xml:space="preserve">Laman: www.bhpmedan.kemenkum.go.id, Pos-el: bhp.medan@kemenkum.go.id</w:t>
       </w:r>
+    </w:p>
+    <w:p>
+      <w:pPr>
+        <w:pBdr>
+          <w:bottom w:val="single" w:color="A0A0A0" w:sz="12" w:space="1"/>
+        </w:pBdr>
+        <w:spacing w:after="160" w:before="40" w:line="120" w:lineRule="exact"/>
+      </w:pPr>
     </w:p>
     <w:p>
       <w:pPr>
@@ -2372,10 +2376,6 @@
     </w:p>
     <w:p>
       <w:pPr>
-        <w:pBdr>
-          <w:bottom w:val="single" w:color="A0A0A0" w:sz="12" w:space="6"/>
-        </w:pBdr>
-        <w:spacing w:after="160"/>
         <w:ind w:left="1418"/>
         <w:jc w:val="center"/>
       </w:pPr>
@@ -2387,6 +2387,14 @@
         </w:rPr>
         <w:t xml:space="preserve">Laman: www.bhpmedan.kemenkum.go.id, Pos-el: bhp.medan@kemenkum.go.id</w:t>
       </w:r>
+    </w:p>
+    <w:p>
+      <w:pPr>
+        <w:pBdr>
+          <w:bottom w:val="single" w:color="A0A0A0" w:sz="12" w:space="1"/>
+        </w:pBdr>
+        <w:spacing w:after="160" w:before="40" w:line="120" w:lineRule="exact"/>
+      </w:pPr>
     </w:p>
     <w:tbl>
       <w:tblPr>
@@ -3408,10 +3416,6 @@
     </w:p>
     <w:p>
       <w:pPr>
-        <w:pBdr>
-          <w:bottom w:val="single" w:color="A0A0A0" w:sz="12" w:space="6"/>
-        </w:pBdr>
-        <w:spacing w:after="160"/>
         <w:ind w:left="1418"/>
         <w:jc w:val="center"/>
       </w:pPr>
@@ -3423,6 +3427,14 @@
         </w:rPr>
         <w:t xml:space="preserve">Laman: www.bhpmedan.kemenkum.go.id, Pos-el: bhp.medan@kemenkum.go.id</w:t>
       </w:r>
+    </w:p>
+    <w:p>
+      <w:pPr>
+        <w:pBdr>
+          <w:bottom w:val="single" w:color="A0A0A0" w:sz="12" w:space="1"/>
+        </w:pBdr>
+        <w:spacing w:after="160" w:before="40" w:line="120" w:lineRule="exact"/>
+      </w:pPr>
     </w:p>
     <w:tbl>
       <w:tblPr>
@@ -4379,10 +4391,6 @@
     </w:p>
     <w:p>
       <w:pPr>
-        <w:pBdr>
-          <w:bottom w:val="single" w:color="A0A0A0" w:sz="12" w:space="6"/>
-        </w:pBdr>
-        <w:spacing w:after="160"/>
         <w:ind w:left="1418"/>
         <w:jc w:val="center"/>
       </w:pPr>
@@ -4394,6 +4402,14 @@
         </w:rPr>
         <w:t xml:space="preserve">Laman: www.bhpmedan.kemenkum.go.id, Pos-el: bhp.medan@kemenkum.go.id</w:t>
       </w:r>
+    </w:p>
+    <w:p>
+      <w:pPr>
+        <w:pBdr>
+          <w:bottom w:val="single" w:color="A0A0A0" w:sz="12" w:space="1"/>
+        </w:pBdr>
+        <w:spacing w:after="160" w:before="40" w:line="120" w:lineRule="exact"/>
+      </w:pPr>
     </w:p>
     <w:tbl>
       <w:tblPr>
@@ -5394,10 +5410,6 @@
     </w:p>
     <w:p>
       <w:pPr>
-        <w:pBdr>
-          <w:bottom w:val="single" w:color="A0A0A0" w:sz="12" w:space="6"/>
-        </w:pBdr>
-        <w:spacing w:after="160"/>
         <w:ind w:left="1418"/>
         <w:jc w:val="center"/>
       </w:pPr>
@@ -5409,6 +5421,14 @@
         </w:rPr>
         <w:t xml:space="preserve">Laman: www.bhpmedan.kemenkum.go.id, Pos-el: bhp.medan@kemenkum.go.id</w:t>
       </w:r>
+    </w:p>
+    <w:p>
+      <w:pPr>
+        <w:pBdr>
+          <w:bottom w:val="single" w:color="A0A0A0" w:sz="12" w:space="1"/>
+        </w:pBdr>
+        <w:spacing w:after="160" w:before="40" w:line="120" w:lineRule="exact"/>
+      </w:pPr>
     </w:p>
     <w:tbl>
       <w:tblPr>
@@ -6233,10 +6253,6 @@
     </w:p>
     <w:p>
       <w:pPr>
-        <w:pBdr>
-          <w:bottom w:val="single" w:color="A0A0A0" w:sz="12" w:space="6"/>
-        </w:pBdr>
-        <w:spacing w:after="160"/>
         <w:ind w:left="1418"/>
         <w:jc w:val="center"/>
       </w:pPr>
@@ -6248,6 +6264,14 @@
         </w:rPr>
         <w:t xml:space="preserve">Laman: www.bhpmedan.kemenkum.go.id, Pos-el: bhp.medan@kemenkum.go.id</w:t>
       </w:r>
+    </w:p>
+    <w:p>
+      <w:pPr>
+        <w:pBdr>
+          <w:bottom w:val="single" w:color="A0A0A0" w:sz="12" w:space="1"/>
+        </w:pBdr>
+        <w:spacing w:after="160" w:before="40" w:line="120" w:lineRule="exact"/>
+      </w:pPr>
     </w:p>
     <w:tbl>
       <w:tblPr>
@@ -7136,10 +7160,6 @@
     </w:p>
     <w:p>
       <w:pPr>
-        <w:pBdr>
-          <w:bottom w:val="single" w:color="A0A0A0" w:sz="12" w:space="6"/>
-        </w:pBdr>
-        <w:spacing w:after="160"/>
         <w:ind w:left="1418"/>
         <w:jc w:val="center"/>
       </w:pPr>
@@ -7151,6 +7171,14 @@
         </w:rPr>
         <w:t xml:space="preserve">Laman: www.bhpmedan.kemenkum.go.id, Pos-el: bhp.medan@kemenkum.go.id</w:t>
       </w:r>
+    </w:p>
+    <w:p>
+      <w:pPr>
+        <w:pBdr>
+          <w:bottom w:val="single" w:color="A0A0A0" w:sz="12" w:space="1"/>
+        </w:pBdr>
+        <w:spacing w:after="160" w:before="40" w:line="120" w:lineRule="exact"/>
+      </w:pPr>
     </w:p>
     <w:tbl>
       <w:tblPr>
@@ -8013,10 +8041,6 @@
     </w:p>
     <w:p>
       <w:pPr>
-        <w:pBdr>
-          <w:bottom w:val="single" w:color="A0A0A0" w:sz="12" w:space="6"/>
-        </w:pBdr>
-        <w:spacing w:after="160"/>
         <w:ind w:left="1418"/>
         <w:jc w:val="center"/>
       </w:pPr>
@@ -8028,6 +8052,14 @@
         </w:rPr>
         <w:t xml:space="preserve">Laman: www.bhpmedan.kemenkum.go.id, Pos-el: bhp.medan@kemenkum.go.id</w:t>
       </w:r>
+    </w:p>
+    <w:p>
+      <w:pPr>
+        <w:pBdr>
+          <w:bottom w:val="single" w:color="A0A0A0" w:sz="12" w:space="1"/>
+        </w:pBdr>
+        <w:spacing w:after="160" w:before="40" w:line="120" w:lineRule="exact"/>
+      </w:pPr>
     </w:p>
     <w:tbl>
       <w:tblPr>
@@ -8857,10 +8889,6 @@
     </w:p>
     <w:p>
       <w:pPr>
-        <w:pBdr>
-          <w:bottom w:val="single" w:color="A0A0A0" w:sz="12" w:space="6"/>
-        </w:pBdr>
-        <w:spacing w:after="160"/>
         <w:ind w:left="1418"/>
         <w:jc w:val="center"/>
       </w:pPr>
@@ -8872,6 +8900,14 @@
         </w:rPr>
         <w:t xml:space="preserve">Laman: www.bhpmedan.kemenkum.go.id, Pos-el: bhp.medan@kemenkum.go.id</w:t>
       </w:r>
+    </w:p>
+    <w:p>
+      <w:pPr>
+        <w:pBdr>
+          <w:bottom w:val="single" w:color="A0A0A0" w:sz="12" w:space="1"/>
+        </w:pBdr>
+        <w:spacing w:after="160" w:before="40" w:line="120" w:lineRule="exact"/>
+      </w:pPr>
     </w:p>
     <w:tbl>
       <w:tblPr>
@@ -9842,10 +9878,6 @@
     </w:p>
     <w:p>
       <w:pPr>
-        <w:pBdr>
-          <w:bottom w:val="single" w:color="A0A0A0" w:sz="12" w:space="6"/>
-        </w:pBdr>
-        <w:spacing w:after="160"/>
         <w:ind w:left="1418"/>
         <w:jc w:val="center"/>
       </w:pPr>
@@ -9857,6 +9889,14 @@
         </w:rPr>
         <w:t xml:space="preserve">Laman: www.bhpmedan.kemenkum.go.id, Pos-el: bhp.medan@kemenkum.go.id</w:t>
       </w:r>
+    </w:p>
+    <w:p>
+      <w:pPr>
+        <w:pBdr>
+          <w:bottom w:val="single" w:color="A0A0A0" w:sz="12" w:space="1"/>
+        </w:pBdr>
+        <w:spacing w:after="160" w:before="40" w:line="120" w:lineRule="exact"/>
+      </w:pPr>
     </w:p>
     <w:p>
       <w:pPr>
@@ -10336,10 +10376,6 @@
     </w:p>
     <w:p>
       <w:pPr>
-        <w:pBdr>
-          <w:bottom w:val="single" w:color="A0A0A0" w:sz="12" w:space="6"/>
-        </w:pBdr>
-        <w:spacing w:after="160"/>
         <w:ind w:left="1418"/>
         <w:jc w:val="center"/>
       </w:pPr>
@@ -10351,6 +10387,14 @@
         </w:rPr>
         <w:t xml:space="preserve">Laman: www.bhpmedan.kemenkum.go.id, Pos-el: bhp.medan@kemenkum.go.id</w:t>
       </w:r>
+    </w:p>
+    <w:p>
+      <w:pPr>
+        <w:pBdr>
+          <w:bottom w:val="single" w:color="A0A0A0" w:sz="12" w:space="1"/>
+        </w:pBdr>
+        <w:spacing w:after="160" w:before="40" w:line="120" w:lineRule="exact"/>
+      </w:pPr>
     </w:p>
     <w:tbl>
       <w:tblPr>
@@ -11408,10 +11452,6 @@
     </w:p>
     <w:p>
       <w:pPr>
-        <w:pBdr>
-          <w:bottom w:val="single" w:color="A0A0A0" w:sz="12" w:space="6"/>
-        </w:pBdr>
-        <w:spacing w:after="160"/>
         <w:ind w:left="1418"/>
         <w:jc w:val="center"/>
       </w:pPr>
@@ -11423,6 +11463,14 @@
         </w:rPr>
         <w:t xml:space="preserve">Laman: www.bhpmedan.kemenkum.go.id, Pos-el: bhp.medan@kemenkum.go.id</w:t>
       </w:r>
+    </w:p>
+    <w:p>
+      <w:pPr>
+        <w:pBdr>
+          <w:bottom w:val="single" w:color="A0A0A0" w:sz="12" w:space="1"/>
+        </w:pBdr>
+        <w:spacing w:after="160" w:before="40" w:line="120" w:lineRule="exact"/>
+      </w:pPr>
     </w:p>
     <w:p>
       <w:pPr>
@@ -12192,10 +12240,6 @@
     </w:p>
     <w:p>
       <w:pPr>
-        <w:pBdr>
-          <w:bottom w:val="single" w:color="A0A0A0" w:sz="12" w:space="6"/>
-        </w:pBdr>
-        <w:spacing w:after="160"/>
         <w:ind w:left="1418"/>
         <w:jc w:val="center"/>
       </w:pPr>
@@ -12207,6 +12251,14 @@
         </w:rPr>
         <w:t xml:space="preserve">Laman: www.bhpmedan.kemenkum.go.id, Pos-el: bhp.medan@kemenkum.go.id</w:t>
       </w:r>
+    </w:p>
+    <w:p>
+      <w:pPr>
+        <w:pBdr>
+          <w:bottom w:val="single" w:color="A0A0A0" w:sz="12" w:space="1"/>
+        </w:pBdr>
+        <w:spacing w:after="160" w:before="40" w:line="120" w:lineRule="exact"/>
+      </w:pPr>
     </w:p>
     <w:tbl>
       <w:tblPr>
@@ -13111,10 +13163,6 @@
     </w:p>
     <w:p>
       <w:pPr>
-        <w:pBdr>
-          <w:bottom w:val="single" w:color="A0A0A0" w:sz="12" w:space="6"/>
-        </w:pBdr>
-        <w:spacing w:after="160"/>
         <w:ind w:left="1418"/>
         <w:jc w:val="center"/>
       </w:pPr>
@@ -13126,6 +13174,14 @@
         </w:rPr>
         <w:t xml:space="preserve">Laman: www.bhpmedan.kemenkum.go.id, Pos-el: bhp.medan@kemenkum.go.id</w:t>
       </w:r>
+    </w:p>
+    <w:p>
+      <w:pPr>
+        <w:pBdr>
+          <w:bottom w:val="single" w:color="A0A0A0" w:sz="12" w:space="1"/>
+        </w:pBdr>
+        <w:spacing w:after="160" w:before="40" w:line="120" w:lineRule="exact"/>
+      </w:pPr>
     </w:p>
     <w:tbl>
       <w:tblPr>

</xml_diff>

<commit_message>
Rapikan Surat 12 agar tembusan tidak terpisah halaman
Co-Authored-By: Claude Opus 5.5 <noreply@anthropic.com>
Claude-Session: https://claude.ai/code/session_01AFC3nUeexLNNCgqYQcbfK5
</commit_message>
<xml_diff>
--- a/telaah-pt-rata-makmur/Himpunan_Konsep_Surat_Cessie_PT_Rata_Makmur.docx
+++ b/telaah-pt-rata-makmur/Himpunan_Konsep_Surat_Cessie_PT_Rata_Makmur.docx
@@ -3225,6 +3225,7 @@
     </w:p>
     <w:p>
       <w:pPr>
+        <w:keepNext/>
         <w:spacing w:after="40" w:line="276"/>
       </w:pPr>
       <w:r>
@@ -3239,6 +3240,7 @@
     <w:p>
       <w:pPr>
         <w:pStyle w:val="ListParagraph"/>
+        <w:keepNext/>
         <w:numPr>
           <w:ilvl w:val="0"/>
           <w:numId w:val="4"/>
@@ -3258,6 +3260,7 @@
     <w:p>
       <w:pPr>
         <w:pStyle w:val="ListParagraph"/>
+        <w:keepNext/>
         <w:numPr>
           <w:ilvl w:val="0"/>
           <w:numId w:val="4"/>
@@ -3277,6 +3280,7 @@
     <w:p>
       <w:pPr>
         <w:pStyle w:val="ListParagraph"/>
+        <w:keepNext w:val="false"/>
         <w:numPr>
           <w:ilvl w:val="0"/>
           <w:numId w:val="4"/>
@@ -4219,6 +4223,7 @@
     </w:p>
     <w:p>
       <w:pPr>
+        <w:keepNext/>
         <w:spacing w:after="40" w:line="276"/>
       </w:pPr>
       <w:r>
@@ -4233,6 +4238,7 @@
     <w:p>
       <w:pPr>
         <w:pStyle w:val="ListParagraph"/>
+        <w:keepNext/>
         <w:numPr>
           <w:ilvl w:val="0"/>
           <w:numId w:val="7"/>
@@ -4252,6 +4258,7 @@
     <w:p>
       <w:pPr>
         <w:pStyle w:val="ListParagraph"/>
+        <w:keepNext w:val="false"/>
         <w:numPr>
           <w:ilvl w:val="0"/>
           <w:numId w:val="7"/>
@@ -5219,6 +5226,7 @@
     </w:p>
     <w:p>
       <w:pPr>
+        <w:keepNext/>
         <w:spacing w:after="40" w:line="276"/>
       </w:pPr>
       <w:r>
@@ -5233,6 +5241,7 @@
     <w:p>
       <w:pPr>
         <w:pStyle w:val="ListParagraph"/>
+        <w:keepNext/>
         <w:numPr>
           <w:ilvl w:val="0"/>
           <w:numId w:val="10"/>
@@ -5252,6 +5261,7 @@
     <w:p>
       <w:pPr>
         <w:pStyle w:val="ListParagraph"/>
+        <w:keepNext/>
         <w:numPr>
           <w:ilvl w:val="0"/>
           <w:numId w:val="10"/>
@@ -5271,6 +5281,7 @@
     <w:p>
       <w:pPr>
         <w:pStyle w:val="ListParagraph"/>
+        <w:keepNext w:val="false"/>
         <w:numPr>
           <w:ilvl w:val="0"/>
           <w:numId w:val="10"/>
@@ -6081,6 +6092,7 @@
     </w:p>
     <w:p>
       <w:pPr>
+        <w:keepNext/>
         <w:spacing w:after="40" w:line="276"/>
       </w:pPr>
       <w:r>
@@ -6095,6 +6107,7 @@
     <w:p>
       <w:pPr>
         <w:pStyle w:val="ListParagraph"/>
+        <w:keepNext/>
         <w:numPr>
           <w:ilvl w:val="0"/>
           <w:numId w:val="12"/>
@@ -6114,6 +6127,7 @@
     <w:p>
       <w:pPr>
         <w:pStyle w:val="ListParagraph"/>
+        <w:keepNext w:val="false"/>
         <w:numPr>
           <w:ilvl w:val="0"/>
           <w:numId w:val="12"/>
@@ -6969,6 +6983,7 @@
     </w:p>
     <w:p>
       <w:pPr>
+        <w:keepNext/>
         <w:spacing w:after="40" w:line="276"/>
       </w:pPr>
       <w:r>
@@ -6983,6 +6998,7 @@
     <w:p>
       <w:pPr>
         <w:pStyle w:val="ListParagraph"/>
+        <w:keepNext/>
         <w:numPr>
           <w:ilvl w:val="0"/>
           <w:numId w:val="14"/>
@@ -7002,6 +7018,7 @@
     <w:p>
       <w:pPr>
         <w:pStyle w:val="ListParagraph"/>
+        <w:keepNext/>
         <w:numPr>
           <w:ilvl w:val="0"/>
           <w:numId w:val="14"/>
@@ -7021,6 +7038,7 @@
     <w:p>
       <w:pPr>
         <w:pStyle w:val="ListParagraph"/>
+        <w:keepNext w:val="false"/>
         <w:numPr>
           <w:ilvl w:val="0"/>
           <w:numId w:val="14"/>
@@ -7831,6 +7849,7 @@
     </w:p>
     <w:p>
       <w:pPr>
+        <w:keepNext/>
         <w:spacing w:after="40" w:line="276"/>
       </w:pPr>
       <w:r>
@@ -7845,6 +7864,7 @@
     <w:p>
       <w:pPr>
         <w:pStyle w:val="ListParagraph"/>
+        <w:keepNext/>
         <w:numPr>
           <w:ilvl w:val="0"/>
           <w:numId w:val="16"/>
@@ -7864,6 +7884,7 @@
     <w:p>
       <w:pPr>
         <w:pStyle w:val="ListParagraph"/>
+        <w:keepNext/>
         <w:numPr>
           <w:ilvl w:val="0"/>
           <w:numId w:val="16"/>
@@ -7883,6 +7904,7 @@
     <w:p>
       <w:pPr>
         <w:pStyle w:val="ListParagraph"/>
+        <w:keepNext/>
         <w:numPr>
           <w:ilvl w:val="0"/>
           <w:numId w:val="16"/>
@@ -7902,6 +7924,7 @@
     <w:p>
       <w:pPr>
         <w:pStyle w:val="ListParagraph"/>
+        <w:keepNext w:val="false"/>
         <w:numPr>
           <w:ilvl w:val="0"/>
           <w:numId w:val="16"/>
@@ -8736,6 +8759,7 @@
     </w:p>
     <w:p>
       <w:pPr>
+        <w:keepNext/>
         <w:spacing w:after="40" w:line="276"/>
       </w:pPr>
       <w:r>
@@ -8750,6 +8774,7 @@
     <w:p>
       <w:pPr>
         <w:pStyle w:val="ListParagraph"/>
+        <w:keepNext w:val="false"/>
         <w:numPr>
           <w:ilvl w:val="0"/>
           <w:numId w:val="18"/>
@@ -9706,6 +9731,7 @@
     </w:p>
     <w:p>
       <w:pPr>
+        <w:keepNext/>
         <w:spacing w:after="40" w:line="276"/>
       </w:pPr>
       <w:r>
@@ -9720,6 +9746,7 @@
     <w:p>
       <w:pPr>
         <w:pStyle w:val="ListParagraph"/>
+        <w:keepNext/>
         <w:numPr>
           <w:ilvl w:val="0"/>
           <w:numId w:val="21"/>
@@ -9739,6 +9766,7 @@
     <w:p>
       <w:pPr>
         <w:pStyle w:val="ListParagraph"/>
+        <w:keepNext w:val="false"/>
         <w:numPr>
           <w:ilvl w:val="0"/>
           <w:numId w:val="21"/>
@@ -11242,6 +11270,7 @@
     </w:p>
     <w:p>
       <w:pPr>
+        <w:keepNext/>
         <w:spacing w:after="40" w:line="276"/>
       </w:pPr>
       <w:r>
@@ -11256,6 +11285,7 @@
     <w:p>
       <w:pPr>
         <w:pStyle w:val="ListParagraph"/>
+        <w:keepNext/>
         <w:numPr>
           <w:ilvl w:val="0"/>
           <w:numId w:val="25"/>
@@ -11275,6 +11305,7 @@
     <w:p>
       <w:pPr>
         <w:pStyle w:val="ListParagraph"/>
+        <w:keepNext/>
         <w:numPr>
           <w:ilvl w:val="0"/>
           <w:numId w:val="25"/>
@@ -11294,6 +11325,7 @@
     <w:p>
       <w:pPr>
         <w:pStyle w:val="ListParagraph"/>
+        <w:keepNext/>
         <w:numPr>
           <w:ilvl w:val="0"/>
           <w:numId w:val="25"/>
@@ -11313,6 +11345,7 @@
     <w:p>
       <w:pPr>
         <w:pStyle w:val="ListParagraph"/>
+        <w:keepNext w:val="false"/>
         <w:numPr>
           <w:ilvl w:val="0"/>
           <w:numId w:val="25"/>
@@ -12030,6 +12063,7 @@
     </w:p>
     <w:p>
       <w:pPr>
+        <w:keepNext/>
         <w:spacing w:after="40" w:line="276"/>
       </w:pPr>
       <w:r>
@@ -12044,6 +12078,7 @@
     <w:p>
       <w:pPr>
         <w:pStyle w:val="ListParagraph"/>
+        <w:keepNext/>
         <w:numPr>
           <w:ilvl w:val="0"/>
           <w:numId w:val="27"/>
@@ -12063,6 +12098,7 @@
     <w:p>
       <w:pPr>
         <w:pStyle w:val="ListParagraph"/>
+        <w:keepNext/>
         <w:numPr>
           <w:ilvl w:val="0"/>
           <w:numId w:val="27"/>
@@ -12082,6 +12118,7 @@
     <w:p>
       <w:pPr>
         <w:pStyle w:val="ListParagraph"/>
+        <w:keepNext/>
         <w:numPr>
           <w:ilvl w:val="0"/>
           <w:numId w:val="27"/>
@@ -12101,6 +12138,7 @@
     <w:p>
       <w:pPr>
         <w:pStyle w:val="ListParagraph"/>
+        <w:keepNext w:val="false"/>
         <w:numPr>
           <w:ilvl w:val="0"/>
           <w:numId w:val="27"/>
@@ -12872,7 +12910,7 @@
           <w:sz w:val="22"/>
           <w:szCs w:val="22"/>
         </w:rPr>
-        <w:t xml:space="preserve">Pemberitahuan ini disampaikan sesuai Pasal 613 Kitab Undang-Undang Hukum Perdata, yang menentukan bahwa penyerahan piutang atas nama berlaku terhadap pihak yang berutang setelah penyerahan itu diberitahukan kepadanya. Terhitung sejak surat ini diterima, pembayaran atas hak-hak tersebut hanya sah apabila dilakukan kepada penerima pengalihan sebagaimana tersebut di atas. Bangunan dan benda milik PT Rata Makmur di lokasi tersebut juga telah dijual kepada pihak yang sama berdasarkan akta tersendiri. Pemberitahuan ini juga disampaikan secara resmi melalui Juru Sita Pengadilan Niaga pada Pengadilan Negeri Medan.</w:t>
+        <w:t xml:space="preserve">Pemberitahuan ini disampaikan sesuai Pasal 613 Kitab Undang-Undang Hukum Perdata, yang menentukan bahwa penyerahan piutang atas nama berlaku terhadap pihak yang berutang setelah penyerahan itu diberitahukan kepadanya. Terhitung sejak surat ini diterima, pembayaran atas hak-hak tersebut hanya sah apabila dilakukan kepada penerima pengalihan sebagaimana tersebut di atas. Pemberitahuan ini juga disampaikan secara resmi melalui Juru Sita Pengadilan Niaga pada Pengadilan Negeri Medan.</w:t>
       </w:r>
     </w:p>
     <w:p>
@@ -12991,6 +13029,7 @@
     </w:p>
     <w:p>
       <w:pPr>
+        <w:keepNext/>
         <w:spacing w:after="40" w:line="276"/>
       </w:pPr>
       <w:r>
@@ -13005,6 +13044,7 @@
     <w:p>
       <w:pPr>
         <w:pStyle w:val="ListParagraph"/>
+        <w:keepNext/>
         <w:numPr>
           <w:ilvl w:val="0"/>
           <w:numId w:val="30"/>
@@ -13024,6 +13064,7 @@
     <w:p>
       <w:pPr>
         <w:pStyle w:val="ListParagraph"/>
+        <w:keepNext w:val="false"/>
         <w:numPr>
           <w:ilvl w:val="0"/>
           <w:numId w:val="30"/>
@@ -13890,6 +13931,7 @@
     </w:p>
     <w:p>
       <w:pPr>
+        <w:keepNext/>
         <w:spacing w:after="40" w:line="276"/>
       </w:pPr>
       <w:r>
@@ -13904,6 +13946,7 @@
     <w:p>
       <w:pPr>
         <w:pStyle w:val="ListParagraph"/>
+        <w:keepNext/>
         <w:numPr>
           <w:ilvl w:val="0"/>
           <w:numId w:val="32"/>
@@ -13923,6 +13966,7 @@
     <w:p>
       <w:pPr>
         <w:pStyle w:val="ListParagraph"/>
+        <w:keepNext/>
         <w:numPr>
           <w:ilvl w:val="0"/>
           <w:numId w:val="32"/>
@@ -13942,6 +13986,7 @@
     <w:p>
       <w:pPr>
         <w:pStyle w:val="ListParagraph"/>
+        <w:keepNext w:val="false"/>
         <w:numPr>
           <w:ilvl w:val="0"/>
           <w:numId w:val="32"/>

</xml_diff>

<commit_message>
Sesuaikan tagihan eks karyawan telah lunas, hapus tanda pisah, Hal rata kanan-kiri
Co-Authored-By: Claude Opus 5.5 <noreply@anthropic.com>
Claude-Session: https://claude.ai/code/session_01AFC3nUeexLNNCgqYQcbfK5
</commit_message>
<xml_diff>
--- a/telaah-pt-rata-makmur/Himpunan_Konsep_Surat_Cessie_PT_Rata_Makmur.docx
+++ b/telaah-pt-rata-makmur/Himpunan_Konsep_Surat_Cessie_PT_Rata_Makmur.docx
@@ -2478,7 +2478,7 @@
           <w:p>
             <w:pPr>
               <w:spacing w:after="40"/>
-              <w:jc w:val="left"/>
+              <w:jc w:val="both"/>
             </w:pPr>
             <w:r>
               <w:rPr>
@@ -2580,7 +2580,7 @@
           <w:p>
             <w:pPr>
               <w:spacing w:after="40"/>
-              <w:jc w:val="left"/>
+              <w:jc w:val="both"/>
             </w:pPr>
             <w:r>
               <w:rPr>
@@ -2674,7 +2674,7 @@
           <w:p>
             <w:pPr>
               <w:spacing w:after="40"/>
-              <w:jc w:val="left"/>
+              <w:jc w:val="both"/>
             </w:pPr>
             <w:r>
               <w:rPr>
@@ -2768,7 +2768,7 @@
           <w:p>
             <w:pPr>
               <w:spacing w:after="40"/>
-              <w:jc w:val="left"/>
+              <w:jc w:val="both"/>
             </w:pPr>
             <w:r>
               <w:rPr>
@@ -3522,7 +3522,7 @@
           <w:p>
             <w:pPr>
               <w:spacing w:after="40"/>
-              <w:jc w:val="left"/>
+              <w:jc w:val="both"/>
             </w:pPr>
             <w:r>
               <w:rPr>
@@ -3624,7 +3624,7 @@
           <w:p>
             <w:pPr>
               <w:spacing w:after="40"/>
-              <w:jc w:val="left"/>
+              <w:jc w:val="both"/>
             </w:pPr>
             <w:r>
               <w:rPr>
@@ -3718,7 +3718,7 @@
           <w:p>
             <w:pPr>
               <w:spacing w:after="40"/>
-              <w:jc w:val="left"/>
+              <w:jc w:val="both"/>
             </w:pPr>
             <w:r>
               <w:rPr>
@@ -3812,7 +3812,7 @@
           <w:p>
             <w:pPr>
               <w:spacing w:after="40"/>
-              <w:jc w:val="left"/>
+              <w:jc w:val="both"/>
             </w:pPr>
             <w:r>
               <w:rPr>
@@ -4500,7 +4500,7 @@
           <w:p>
             <w:pPr>
               <w:spacing w:after="40"/>
-              <w:jc w:val="left"/>
+              <w:jc w:val="both"/>
             </w:pPr>
             <w:r>
               <w:rPr>
@@ -4602,7 +4602,7 @@
           <w:p>
             <w:pPr>
               <w:spacing w:after="40"/>
-              <w:jc w:val="left"/>
+              <w:jc w:val="both"/>
             </w:pPr>
             <w:r>
               <w:rPr>
@@ -4696,7 +4696,7 @@
           <w:p>
             <w:pPr>
               <w:spacing w:after="40"/>
-              <w:jc w:val="left"/>
+              <w:jc w:val="both"/>
             </w:pPr>
             <w:r>
               <w:rPr>
@@ -4790,7 +4790,7 @@
           <w:p>
             <w:pPr>
               <w:spacing w:after="40"/>
-              <w:jc w:val="left"/>
+              <w:jc w:val="both"/>
             </w:pPr>
             <w:r>
               <w:rPr>
@@ -5523,7 +5523,7 @@
           <w:p>
             <w:pPr>
               <w:spacing w:after="40"/>
-              <w:jc w:val="left"/>
+              <w:jc w:val="both"/>
             </w:pPr>
             <w:r>
               <w:rPr>
@@ -5625,7 +5625,7 @@
           <w:p>
             <w:pPr>
               <w:spacing w:after="40"/>
-              <w:jc w:val="left"/>
+              <w:jc w:val="both"/>
             </w:pPr>
             <w:r>
               <w:rPr>
@@ -5719,7 +5719,7 @@
           <w:p>
             <w:pPr>
               <w:spacing w:after="40"/>
-              <w:jc w:val="left"/>
+              <w:jc w:val="both"/>
             </w:pPr>
             <w:r>
               <w:rPr>
@@ -5813,7 +5813,7 @@
           <w:p>
             <w:pPr>
               <w:spacing w:after="40"/>
-              <w:jc w:val="left"/>
+              <w:jc w:val="both"/>
             </w:pPr>
             <w:r>
               <w:rPr>
@@ -6369,7 +6369,7 @@
           <w:p>
             <w:pPr>
               <w:spacing w:after="40"/>
-              <w:jc w:val="left"/>
+              <w:jc w:val="both"/>
             </w:pPr>
             <w:r>
               <w:rPr>
@@ -6471,7 +6471,7 @@
           <w:p>
             <w:pPr>
               <w:spacing w:after="40"/>
-              <w:jc w:val="left"/>
+              <w:jc w:val="both"/>
             </w:pPr>
             <w:r>
               <w:rPr>
@@ -6565,7 +6565,7 @@
           <w:p>
             <w:pPr>
               <w:spacing w:after="40"/>
-              <w:jc w:val="left"/>
+              <w:jc w:val="both"/>
             </w:pPr>
             <w:r>
               <w:rPr>
@@ -6659,7 +6659,7 @@
           <w:p>
             <w:pPr>
               <w:spacing w:after="40"/>
-              <w:jc w:val="left"/>
+              <w:jc w:val="both"/>
             </w:pPr>
             <w:r>
               <w:rPr>
@@ -7280,7 +7280,7 @@
           <w:p>
             <w:pPr>
               <w:spacing w:after="40"/>
-              <w:jc w:val="left"/>
+              <w:jc w:val="both"/>
             </w:pPr>
             <w:r>
               <w:rPr>
@@ -7382,7 +7382,7 @@
           <w:p>
             <w:pPr>
               <w:spacing w:after="40"/>
-              <w:jc w:val="left"/>
+              <w:jc w:val="both"/>
             </w:pPr>
             <w:r>
               <w:rPr>
@@ -7476,7 +7476,7 @@
           <w:p>
             <w:pPr>
               <w:spacing w:after="40"/>
-              <w:jc w:val="left"/>
+              <w:jc w:val="both"/>
             </w:pPr>
             <w:r>
               <w:rPr>
@@ -7570,7 +7570,7 @@
           <w:p>
             <w:pPr>
               <w:spacing w:after="40"/>
-              <w:jc w:val="left"/>
+              <w:jc w:val="both"/>
             </w:pPr>
             <w:r>
               <w:rPr>
@@ -8166,7 +8166,7 @@
           <w:p>
             <w:pPr>
               <w:spacing w:after="40"/>
-              <w:jc w:val="left"/>
+              <w:jc w:val="both"/>
             </w:pPr>
             <w:r>
               <w:rPr>
@@ -8268,7 +8268,7 @@
           <w:p>
             <w:pPr>
               <w:spacing w:after="40"/>
-              <w:jc w:val="left"/>
+              <w:jc w:val="both"/>
             </w:pPr>
             <w:r>
               <w:rPr>
@@ -8362,7 +8362,7 @@
           <w:p>
             <w:pPr>
               <w:spacing w:after="40"/>
-              <w:jc w:val="left"/>
+              <w:jc w:val="both"/>
             </w:pPr>
             <w:r>
               <w:rPr>
@@ -8456,7 +8456,7 @@
           <w:p>
             <w:pPr>
               <w:spacing w:after="40"/>
-              <w:jc w:val="left"/>
+              <w:jc w:val="both"/>
             </w:pPr>
             <w:r>
               <w:rPr>
@@ -9016,7 +9016,7 @@
           <w:p>
             <w:pPr>
               <w:spacing w:after="40"/>
-              <w:jc w:val="left"/>
+              <w:jc w:val="both"/>
             </w:pPr>
             <w:r>
               <w:rPr>
@@ -9118,7 +9118,7 @@
           <w:p>
             <w:pPr>
               <w:spacing w:after="40"/>
-              <w:jc w:val="left"/>
+              <w:jc w:val="both"/>
             </w:pPr>
             <w:r>
               <w:rPr>
@@ -9212,7 +9212,7 @@
           <w:p>
             <w:pPr>
               <w:spacing w:after="40"/>
-              <w:jc w:val="left"/>
+              <w:jc w:val="both"/>
             </w:pPr>
             <w:r>
               <w:rPr>
@@ -9306,7 +9306,7 @@
           <w:p>
             <w:pPr>
               <w:spacing w:after="40"/>
-              <w:jc w:val="left"/>
+              <w:jc w:val="both"/>
             </w:pPr>
             <w:r>
               <w:rPr>
@@ -10506,7 +10506,7 @@
           <w:p>
             <w:pPr>
               <w:spacing w:after="40"/>
-              <w:jc w:val="left"/>
+              <w:jc w:val="both"/>
             </w:pPr>
             <w:r>
               <w:rPr>
@@ -10608,7 +10608,7 @@
           <w:p>
             <w:pPr>
               <w:spacing w:after="40"/>
-              <w:jc w:val="left"/>
+              <w:jc w:val="both"/>
             </w:pPr>
             <w:r>
               <w:rPr>
@@ -10702,7 +10702,7 @@
           <w:p>
             <w:pPr>
               <w:spacing w:after="40"/>
-              <w:jc w:val="left"/>
+              <w:jc w:val="both"/>
             </w:pPr>
             <w:r>
               <w:rPr>
@@ -10796,7 +10796,7 @@
           <w:p>
             <w:pPr>
               <w:spacing w:after="40"/>
-              <w:jc w:val="left"/>
+              <w:jc w:val="both"/>
             </w:pPr>
             <w:r>
               <w:rPr>
@@ -12380,7 +12380,7 @@
           <w:p>
             <w:pPr>
               <w:spacing w:after="40"/>
-              <w:jc w:val="left"/>
+              <w:jc w:val="both"/>
             </w:pPr>
             <w:r>
               <w:rPr>
@@ -12482,7 +12482,7 @@
           <w:p>
             <w:pPr>
               <w:spacing w:after="40"/>
-              <w:jc w:val="left"/>
+              <w:jc w:val="both"/>
             </w:pPr>
             <w:r>
               <w:rPr>
@@ -12576,7 +12576,7 @@
           <w:p>
             <w:pPr>
               <w:spacing w:after="40"/>
-              <w:jc w:val="left"/>
+              <w:jc w:val="both"/>
             </w:pPr>
             <w:r>
               <w:rPr>
@@ -12670,7 +12670,7 @@
           <w:p>
             <w:pPr>
               <w:spacing w:after="40"/>
-              <w:jc w:val="left"/>
+              <w:jc w:val="both"/>
             </w:pPr>
             <w:r>
               <w:rPr>
@@ -13306,7 +13306,7 @@
           <w:p>
             <w:pPr>
               <w:spacing w:after="40"/>
-              <w:jc w:val="left"/>
+              <w:jc w:val="both"/>
             </w:pPr>
             <w:r>
               <w:rPr>
@@ -13408,7 +13408,7 @@
           <w:p>
             <w:pPr>
               <w:spacing w:after="40"/>
-              <w:jc w:val="left"/>
+              <w:jc w:val="both"/>
             </w:pPr>
             <w:r>
               <w:rPr>
@@ -13502,7 +13502,7 @@
           <w:p>
             <w:pPr>
               <w:spacing w:after="40"/>
-              <w:jc w:val="left"/>
+              <w:jc w:val="both"/>
             </w:pPr>
             <w:r>
               <w:rPr>
@@ -13596,7 +13596,7 @@
           <w:p>
             <w:pPr>
               <w:spacing w:after="40"/>
-              <w:jc w:val="left"/>
+              <w:jc w:val="both"/>
             </w:pPr>
             <w:r>
               <w:rPr>
@@ -13812,7 +13812,7 @@
           <w:sz w:val="22"/>
           <w:szCs w:val="22"/>
         </w:rPr>
-        <w:t xml:space="preserve">Selanjutnya Kurator akan menyusun daftar pembagian sebagaimana dimaksud Pasal 189 Undang-Undang Nomor 37 Tahun 2004 untuk dimintakan persetujuan Hakim Pengawas, termasuk arahan mengenai urutan pembayaran antara tagihan eks karyawan dan tagihan pajak.</w:t>
+        <w:t xml:space="preserve">Selanjutnya Kurator akan menyusun daftar pembagian sebagaimana dimaksud Pasal 189 Undang-Undang Nomor 37 Tahun 2004 untuk dimintakan persetujuan Hakim Pengawas, guna pembayaran tagihan KPP Pratama Binjai sebagai satu-satunya tagihan yang belum dibayar.</w:t>
       </w:r>
     </w:p>
     <w:p>

</xml_diff>